<commit_message>
Update thesis intro and methods with reviewer feedback
Add AIRRflow reference, remove computer dataset names, explain
exclusion capability, reference 3 methods schematic figures,
expand endpoint descriptions (dynamic clone size modes, configurable
thresholds, full CDR3 capabilities), mention R alongside Python.

Co-Authored-By: Claude Opus 4.6 <noreply@anthropic.com>
Claude-Session: https://claude.ai/code/session_01D55fsgxxDUfDTuPfRhF34U
</commit_message>
<xml_diff>
--- a/thesis/thesis.docx
+++ b/thesis/thesis.docx
@@ -424,7 +424,7 @@
       </w:r>
     </w:p>
     <w:bookmarkEnd w:id="21"/>
-    <w:bookmarkStart w:id="24" w:name="list-of-figures"/>
+    <w:bookmarkStart w:id="25" w:name="list-of-figures"/>
     <w:p>
       <w:pPr>
         <w:pStyle w:val="Heading1"/>
@@ -433,12 +433,76 @@
         <w:t xml:space="preserve">List of Figures</w:t>
       </w:r>
     </w:p>
-    <w:bookmarkStart w:id="22" w:name="part-1-is-api-tool-capabilities"/>
+    <w:bookmarkStart w:id="22" w:name="methods-figures"/>
     <w:p>
       <w:pPr>
         <w:pStyle w:val="Heading2"/>
       </w:pPr>
       <w:r>
+        <w:t xml:space="preserve">Methods Figures</w:t>
+      </w:r>
+    </w:p>
+    <w:p>
+      <w:pPr>
+        <w:pStyle w:val="FirstParagraph"/>
+      </w:pPr>
+      <w:r>
+        <w:rPr>
+          <w:bCs/>
+          <w:b/>
+        </w:rPr>
+        <w:t xml:space="preserve">Methods Figure 1.</w:t>
+      </w:r>
+      <w:r>
+        <w:t xml:space="preserve"> </w:t>
+      </w:r>
+      <w:r>
+        <w:t xml:space="preserve">IS-API pipeline: from raw DNA sequences to cross-study analysis.</w:t>
+      </w:r>
+    </w:p>
+    <w:p>
+      <w:pPr>
+        <w:pStyle w:val="BodyText"/>
+      </w:pPr>
+      <w:r>
+        <w:rPr>
+          <w:bCs/>
+          <w:b/>
+        </w:rPr>
+        <w:t xml:space="preserve">Methods Figure 2.</w:t>
+      </w:r>
+      <w:r>
+        <w:t xml:space="preserve"> </w:t>
+      </w:r>
+      <w:r>
+        <w:t xml:space="preserve">IS-API system architecture: client queries fan out to multiple ImmuneDB instances.</w:t>
+      </w:r>
+    </w:p>
+    <w:p>
+      <w:pPr>
+        <w:pStyle w:val="BodyText"/>
+      </w:pPr>
+      <w:r>
+        <w:rPr>
+          <w:bCs/>
+          <w:b/>
+        </w:rPr>
+        <w:t xml:space="preserve">Methods Figure 3.</w:t>
+      </w:r>
+      <w:r>
+        <w:t xml:space="preserve"> </w:t>
+      </w:r>
+      <w:r>
+        <w:t xml:space="preserve">Three-tier analysis approach: metadata, biological-statistical measurements, and specific biological questions.</w:t>
+      </w:r>
+    </w:p>
+    <w:bookmarkEnd w:id="22"/>
+    <w:bookmarkStart w:id="23" w:name="part-1-is-api-tool-capabilities"/>
+    <w:p>
+      <w:pPr>
+        <w:pStyle w:val="Heading2"/>
+      </w:pPr>
+      <w:r>
         <w:t xml:space="preserve">Part 1: IS-API Tool Capabilities</w:t>
       </w:r>
     </w:p>
@@ -730,8 +794,8 @@
         <w:t xml:space="preserve">Within-individual tissue comparison (paired line plots).</w:t>
       </w:r>
     </w:p>
-    <w:bookmarkEnd w:id="22"/>
-    <w:bookmarkStart w:id="23" w:name="part-2-covid-19-clonal-analysis"/>
+    <w:bookmarkEnd w:id="23"/>
+    <w:bookmarkStart w:id="24" w:name="part-2-covid-19-clonal-analysis"/>
     <w:p>
       <w:pPr>
         <w:pStyle w:val="Heading2"/>
@@ -902,9 +966,9 @@
         <w:t xml:space="preserve">Clonal metrics by gender and disease stage.</w:t>
       </w:r>
     </w:p>
-    <w:bookmarkEnd w:id="23"/>
     <w:bookmarkEnd w:id="24"/>
-    <w:bookmarkStart w:id="29" w:name="introduction"/>
+    <w:bookmarkEnd w:id="25"/>
+    <w:bookmarkStart w:id="30" w:name="introduction"/>
     <w:p>
       <w:pPr>
         <w:pStyle w:val="Heading1"/>
@@ -913,7 +977,7 @@
         <w:t xml:space="preserve">Introduction</w:t>
       </w:r>
     </w:p>
-    <w:bookmarkStart w:id="25" w:name="b-cell-repertoire-and-diversity"/>
+    <w:bookmarkStart w:id="26" w:name="b-cell-repertoire-and-diversity"/>
     <w:p>
       <w:pPr>
         <w:pStyle w:val="Heading2"/>
@@ -1063,8 +1127,8 @@
         <w:t xml:space="preserve">.</w:t>
       </w:r>
     </w:p>
-    <w:bookmarkEnd w:id="25"/>
-    <w:bookmarkStart w:id="26" w:name="Xa08f12d649e3367d5781fc6cfe4745b30e4838b"/>
+    <w:bookmarkEnd w:id="26"/>
+    <w:bookmarkStart w:id="27" w:name="Xa08f12d649e3367d5781fc6cfe4745b30e4838b"/>
     <w:p>
       <w:pPr>
         <w:pStyle w:val="Heading2"/>
@@ -1213,7 +1277,19 @@
         <w:t xml:space="preserve"> </w:t>
       </w:r>
       <w:r>
-        <w:t xml:space="preserve">enables immunoglobulin variable domain sequence analysis. While these tools enable researchers to perform various queries and analyses on individual datasets, they do not natively support queries across multiple databases that characterize repertoire diversity across many studies simultaneously.</w:t>
+        <w:t xml:space="preserve">enables immunoglobulin variable domain sequence analysis. More recently, nf-core/airrflow</w:t>
+      </w:r>
+      <w:r>
+        <w:t xml:space="preserve"> </w:t>
+      </w:r>
+      <w:r>
+        <w:t xml:space="preserve">[@airrflow]</w:t>
+      </w:r>
+      <w:r>
+        <w:t xml:space="preserve"> </w:t>
+      </w:r>
+      <w:r>
+        <w:t xml:space="preserve">has introduced a standardized Nextflow pipeline for AIRR-seq data processing, providing reproducible workflows from raw reads to annotated repertoires. While these tools enable researchers to perform various queries and analyses on individual datasets, they do not natively support queries across multiple databases that characterize repertoire diversity across many studies simultaneously.</w:t>
       </w:r>
     </w:p>
     <w:p>
@@ -1233,8 +1309,8 @@
         <w:t xml:space="preserve">, a relational database and pipeline to store and analyze B and T cell receptor high-throughput sequencing data. ImmuneDB integrates annotation, clonal assignment, mutation analysis, and basic statistical measures into a unified database structure. However, like other single-database tools, it does not enable researchers to make queries that characterize repertoire diversity across many studies or to investigate multiple metadata dimensions simultaneously.</w:t>
       </w:r>
     </w:p>
-    <w:bookmarkEnd w:id="26"/>
-    <w:bookmarkStart w:id="27" w:name="is-api-cross-study-repertoire-analysis"/>
+    <w:bookmarkEnd w:id="27"/>
+    <w:bookmarkStart w:id="28" w:name="is-api-cross-study-repertoire-analysis"/>
     <w:p>
       <w:pPr>
         <w:pStyle w:val="Heading2"/>
@@ -1268,8 +1344,8 @@
         <w:t xml:space="preserve">IS-API version 0.3.0 introduces several key improvements over earlier versions. Most importantly, it employs Common Table Expression (CTE)-based SQL queries (referred to as sampleMetaCTE) that ensure correct per-individual, per-tissue aggregation of statistics. This addresses a fundamental challenge in cross-study analysis: different studies may have different numbers of samples per individual and different tissue types, and naive aggregation can produce misleading results. The CTE approach first identifies the relevant samples for each individual matching the requested metadata filters, then aggregates clone-level statistics across those samples, ensuring that each individual contributes one data point regardless of their number of samples.</w:t>
       </w:r>
     </w:p>
-    <w:bookmarkEnd w:id="27"/>
-    <w:bookmarkStart w:id="28" w:name="X425a73264119a3d89692f38a40bd91573397c46"/>
+    <w:bookmarkEnd w:id="28"/>
+    <w:bookmarkStart w:id="29" w:name="X425a73264119a3d89692f38a40bd91573397c46"/>
     <w:p>
       <w:pPr>
         <w:pStyle w:val="Heading2"/>
@@ -1320,9 +1396,9 @@
         <w:t xml:space="preserve">. However, these studies typically analyze individual cohorts in isolation. By applying IS-API to multiple studies simultaneously, we can assess whether patterns observed in one cohort replicate across others, providing more robust conclusions about the relationship between BCR repertoire characteristics and disease outcomes.</w:t>
       </w:r>
     </w:p>
-    <w:bookmarkEnd w:id="28"/>
     <w:bookmarkEnd w:id="29"/>
-    <w:bookmarkStart w:id="30" w:name="hypothesis-and-aims"/>
+    <w:bookmarkEnd w:id="30"/>
+    <w:bookmarkStart w:id="31" w:name="hypothesis-and-aims"/>
     <w:p>
       <w:pPr>
         <w:pStyle w:val="Heading1"/>
@@ -1486,8 +1562,8 @@
         <w:t xml:space="preserve">Confounders: assessment of age and gender as potential confounding variables.</w:t>
       </w:r>
     </w:p>
-    <w:bookmarkEnd w:id="30"/>
-    <w:bookmarkStart w:id="39" w:name="materials-and-methods"/>
+    <w:bookmarkEnd w:id="31"/>
+    <w:bookmarkStart w:id="40" w:name="materials-and-methods"/>
     <w:p>
       <w:pPr>
         <w:pStyle w:val="Heading1"/>
@@ -1496,7 +1572,7 @@
         <w:t xml:space="preserve">Materials and Methods</w:t>
       </w:r>
     </w:p>
-    <w:bookmarkStart w:id="31" w:name="Xc5f81cf2ad782ded6d4ca40ca7147c262017470"/>
+    <w:bookmarkStart w:id="32" w:name="Xc5f81cf2ad782ded6d4ca40ca7147c262017470"/>
     <w:p>
       <w:pPr>
         <w:pStyle w:val="Heading2"/>
@@ -1568,19 +1644,673 @@
           <w:bCs/>
           <w:b/>
         </w:rPr>
-        <w:t xml:space="preserve">CD1</w:t>
-      </w:r>
-      <w:r>
-        <w:t xml:space="preserve"> </w:t>
-      </w:r>
-      <w:r>
-        <w:t xml:space="preserve">(Covid19_db3): 51 individuals with severe, mild, and moderate COVID-19 from multiple hospital cohorts</w:t>
-      </w:r>
-      <w:r>
-        <w:t xml:space="preserve"> </w:t>
-      </w:r>
-      <w:r>
-        <w:t xml:space="preserve">[@KuriCervantes2020; @Montague2020]</w:t>
+        <w:t xml:space="preserve">COVID Hospital Cohort 1</w:t>
+      </w:r>
+      <w:r>
+        <w:t xml:space="preserve">: 51 individuals with severe, mild, and moderate COVID-19 from multiple hospital cohorts [29, 30].</w:t>
+      </w:r>
+    </w:p>
+    <w:p>
+      <w:pPr>
+        <w:numPr>
+          <w:ilvl w:val="0"/>
+          <w:numId w:val="1003"/>
+        </w:numPr>
+        <w:pStyle w:val="Compact"/>
+      </w:pPr>
+      <w:r>
+        <w:rPr>
+          <w:bCs/>
+          <w:b/>
+        </w:rPr>
+        <w:t xml:space="preserve">COVID Hospital Cohort 2</w:t>
+      </w:r>
+      <w:r>
+        <w:t xml:space="preserve">: 19 individuals including severe, non-severe, recovered, and healthy individuals [31].</w:t>
+      </w:r>
+    </w:p>
+    <w:p>
+      <w:pPr>
+        <w:numPr>
+          <w:ilvl w:val="0"/>
+          <w:numId w:val="1003"/>
+        </w:numPr>
+        <w:pStyle w:val="Compact"/>
+      </w:pPr>
+      <w:r>
+        <w:rPr>
+          <w:bCs/>
+          <w:b/>
+        </w:rPr>
+        <w:t xml:space="preserve">COVID Convergent Signatures Study</w:t>
+      </w:r>
+      <w:r>
+        <w:t xml:space="preserve">: 13 individuals with severe COVID-19 and healthy controls [32].</w:t>
+      </w:r>
+    </w:p>
+    <w:p>
+      <w:pPr>
+        <w:numPr>
+          <w:ilvl w:val="0"/>
+          <w:numId w:val="1003"/>
+        </w:numPr>
+        <w:pStyle w:val="Compact"/>
+      </w:pPr>
+      <w:r>
+        <w:rPr>
+          <w:bCs/>
+          <w:b/>
+        </w:rPr>
+        <w:t xml:space="preserve">mRNA Vaccine Study 1</w:t>
+      </w:r>
+      <w:r>
+        <w:t xml:space="preserve">: 12 individuals from a COVID-19 mRNA vaccine study, including COVID-recovered vaccinees and COVID-naive vaccinees [33].</w:t>
+      </w:r>
+    </w:p>
+    <w:p>
+      <w:pPr>
+        <w:numPr>
+          <w:ilvl w:val="0"/>
+          <w:numId w:val="1003"/>
+        </w:numPr>
+        <w:pStyle w:val="Compact"/>
+      </w:pPr>
+      <w:r>
+        <w:rPr>
+          <w:bCs/>
+          <w:b/>
+        </w:rPr>
+        <w:t xml:space="preserve">mRNA Vaccine Study 2</w:t>
+      </w:r>
+      <w:r>
+        <w:t xml:space="preserve">: 5 individuals from a second vaccine cohort with recovered individuals.</w:t>
+      </w:r>
+    </w:p>
+    <w:p>
+      <w:pPr>
+        <w:numPr>
+          <w:ilvl w:val="0"/>
+          <w:numId w:val="1003"/>
+        </w:numPr>
+        <w:pStyle w:val="Compact"/>
+      </w:pPr>
+      <w:r>
+        <w:rPr>
+          <w:bCs/>
+          <w:b/>
+        </w:rPr>
+        <w:t xml:space="preserve">Healthy Donor Atlas</w:t>
+      </w:r>
+      <w:r>
+        <w:t xml:space="preserve">: 6 healthy control individuals (deceased organ donors) with no history of COVID-19 or vaccination [34].</w:t>
+      </w:r>
+    </w:p>
+    <w:p>
+      <w:pPr>
+        <w:pStyle w:val="FirstParagraph"/>
+      </w:pPr>
+      <w:r>
+        <w:t xml:space="preserve">A seventh study (pediatric gut transplant [47]) was available in the IS-API but excluded from this analysis as it is not relevant to COVID-19 or adult healthy controls.</w:t>
+      </w:r>
+    </w:p>
+    <w:bookmarkEnd w:id="32"/>
+    <w:bookmarkStart w:id="33" w:name="individual-selection-and-exclusions"/>
+    <w:p>
+      <w:pPr>
+        <w:pStyle w:val="Heading2"/>
+      </w:pPr>
+      <w:r>
+        <w:t xml:space="preserve">Individual Selection and Exclusions</w:t>
+      </w:r>
+    </w:p>
+    <w:p>
+      <w:pPr>
+        <w:pStyle w:val="FirstParagraph"/>
+      </w:pPr>
+      <w:r>
+        <w:t xml:space="preserve">An important feature of IS-API is its ability to selectively include or exclude specific individuals, studies, or metadata categories from the analysis. This enables researchers to exclude unpublished datasets, control samples (such as fibroblast or water controls used in sequencing quality assessment), and individuals with incomplete metadata — all through the query interface without modifying the underlying databases.</w:t>
+      </w:r>
+    </w:p>
+    <w:p>
+      <w:pPr>
+        <w:pStyle w:val="BodyText"/>
+      </w:pPr>
+      <w:r>
+        <w:t xml:space="preserve">From the six studies, we identified 94 unique individuals with blood-derived samples. Five individuals were excluded due to data quality issues or ambiguous metadata: three from the Healthy Donor Atlas (individuals with incomplete sequencing data) and two from the second vaccine study (fibroblast and water sequencing controls). Three additional healthy individuals from the COVID Convergent Signatures Study lacked sex and age metadata; these were included in all analyses except the age and gender confounder analysis. After exclusions, 94 individuals contributed 106 blood-derived repertoires to the analysis (some individuals had multiple blood time points).</w:t>
+      </w:r>
+    </w:p>
+    <w:p>
+      <w:pPr>
+        <w:pStyle w:val="BodyText"/>
+      </w:pPr>
+      <w:r>
+        <w:t xml:space="preserve">Blood-derived tissues were defined as: blood, Peripheral blood, PBL, and PBMC. Non-blood tissues (bone marrow, lymph node, lung, gut) were excluded from the cross-study comparison to ensure tissue homogeneity.</w:t>
+      </w:r>
+    </w:p>
+    <w:bookmarkEnd w:id="33"/>
+    <w:bookmarkStart w:id="34" w:name="disease-stage-harmonization"/>
+    <w:p>
+      <w:pPr>
+        <w:pStyle w:val="Heading2"/>
+      </w:pPr>
+      <w:r>
+        <w:t xml:space="preserve">Disease Stage Harmonization</w:t>
+      </w:r>
+    </w:p>
+    <w:p>
+      <w:pPr>
+        <w:pStyle w:val="FirstParagraph"/>
+      </w:pPr>
+      <w:r>
+        <w:t xml:space="preserve">Different studies used different terminology for disease stages. We harmonized these into six categories (</w:t>
+      </w:r>
+      <w:r>
+        <w:rPr>
+          <w:bCs/>
+          <w:b/>
+        </w:rPr>
+        <w:t xml:space="preserve">Table 4</w:t>
+      </w:r>
+      <w:r>
+        <w:t xml:space="preserve">):</w:t>
+      </w:r>
+    </w:p>
+    <w:p>
+      <w:pPr>
+        <w:numPr>
+          <w:ilvl w:val="0"/>
+          <w:numId w:val="1004"/>
+        </w:numPr>
+        <w:pStyle w:val="Compact"/>
+      </w:pPr>
+      <w:r>
+        <w:rPr>
+          <w:bCs/>
+          <w:b/>
+        </w:rPr>
+        <w:t xml:space="preserve">Severe</w:t>
+      </w:r>
+      <w:r>
+        <w:t xml:space="preserve">:</w:t>
+      </w:r>
+      <w:r>
+        <w:t xml:space="preserve"> </w:t>
+      </w:r>
+      <w:r>
+        <w:t xml:space="preserve">“</w:t>
+      </w:r>
+      <w:r>
+        <w:t xml:space="preserve">severe</w:t>
+      </w:r>
+      <w:r>
+        <w:t xml:space="preserve">”</w:t>
+      </w:r>
+      <w:r>
+        <w:t xml:space="preserve">,</w:t>
+      </w:r>
+      <w:r>
+        <w:t xml:space="preserve"> </w:t>
+      </w:r>
+      <w:r>
+        <w:t xml:space="preserve">“</w:t>
+      </w:r>
+      <w:r>
+        <w:t xml:space="preserve">Early phase hypoxaemia</w:t>
+      </w:r>
+      <w:r>
+        <w:t xml:space="preserve">”</w:t>
+      </w:r>
+    </w:p>
+    <w:p>
+      <w:pPr>
+        <w:numPr>
+          <w:ilvl w:val="0"/>
+          <w:numId w:val="1004"/>
+        </w:numPr>
+        <w:pStyle w:val="Compact"/>
+      </w:pPr>
+      <w:r>
+        <w:rPr>
+          <w:bCs/>
+          <w:b/>
+        </w:rPr>
+        <w:t xml:space="preserve">Moderate</w:t>
+      </w:r>
+      <w:r>
+        <w:t xml:space="preserve">:</w:t>
+      </w:r>
+      <w:r>
+        <w:t xml:space="preserve"> </w:t>
+      </w:r>
+      <w:r>
+        <w:t xml:space="preserve">“</w:t>
+      </w:r>
+      <w:r>
+        <w:t xml:space="preserve">Early phase-Stable</w:t>
+      </w:r>
+      <w:r>
+        <w:t xml:space="preserve">”</w:t>
+      </w:r>
+      <w:r>
+        <w:t xml:space="preserve">,</w:t>
+      </w:r>
+      <w:r>
+        <w:t xml:space="preserve"> </w:t>
+      </w:r>
+      <w:r>
+        <w:t xml:space="preserve">“</w:t>
+      </w:r>
+      <w:r>
+        <w:t xml:space="preserve">Early phase-Improving</w:t>
+      </w:r>
+      <w:r>
+        <w:t xml:space="preserve">”</w:t>
+      </w:r>
+    </w:p>
+    <w:p>
+      <w:pPr>
+        <w:numPr>
+          <w:ilvl w:val="0"/>
+          <w:numId w:val="1004"/>
+        </w:numPr>
+        <w:pStyle w:val="Compact"/>
+      </w:pPr>
+      <w:r>
+        <w:rPr>
+          <w:bCs/>
+          <w:b/>
+        </w:rPr>
+        <w:t xml:space="preserve">Mild</w:t>
+      </w:r>
+      <w:r>
+        <w:t xml:space="preserve">:</w:t>
+      </w:r>
+      <w:r>
+        <w:t xml:space="preserve"> </w:t>
+      </w:r>
+      <w:r>
+        <w:t xml:space="preserve">“</w:t>
+      </w:r>
+      <w:r>
+        <w:t xml:space="preserve">mild</w:t>
+      </w:r>
+      <w:r>
+        <w:t xml:space="preserve">”</w:t>
+      </w:r>
+      <w:r>
+        <w:t xml:space="preserve">,</w:t>
+      </w:r>
+      <w:r>
+        <w:t xml:space="preserve"> </w:t>
+      </w:r>
+      <w:r>
+        <w:t xml:space="preserve">“</w:t>
+      </w:r>
+      <w:r>
+        <w:t xml:space="preserve">non-severe</w:t>
+      </w:r>
+      <w:r>
+        <w:t xml:space="preserve">”</w:t>
+      </w:r>
+    </w:p>
+    <w:p>
+      <w:pPr>
+        <w:numPr>
+          <w:ilvl w:val="0"/>
+          <w:numId w:val="1004"/>
+        </w:numPr>
+        <w:pStyle w:val="Compact"/>
+      </w:pPr>
+      <w:r>
+        <w:rPr>
+          <w:bCs/>
+          <w:b/>
+        </w:rPr>
+        <w:t xml:space="preserve">Recovered</w:t>
+      </w:r>
+      <w:r>
+        <w:t xml:space="preserve">:</w:t>
+      </w:r>
+      <w:r>
+        <w:t xml:space="preserve"> </w:t>
+      </w:r>
+      <w:r>
+        <w:t xml:space="preserve">“</w:t>
+      </w:r>
+      <w:r>
+        <w:t xml:space="preserve">Recovering without ICU-Improving</w:t>
+      </w:r>
+      <w:r>
+        <w:t xml:space="preserve">”</w:t>
+      </w:r>
+      <w:r>
+        <w:t xml:space="preserve">,</w:t>
+      </w:r>
+      <w:r>
+        <w:t xml:space="preserve"> </w:t>
+      </w:r>
+      <w:r>
+        <w:t xml:space="preserve">“</w:t>
+      </w:r>
+      <w:r>
+        <w:t xml:space="preserve">Recovering post-ICU -Improving</w:t>
+      </w:r>
+      <w:r>
+        <w:t xml:space="preserve">”</w:t>
+      </w:r>
+      <w:r>
+        <w:t xml:space="preserve">,</w:t>
+      </w:r>
+      <w:r>
+        <w:t xml:space="preserve"> </w:t>
+      </w:r>
+      <w:r>
+        <w:t xml:space="preserve">“</w:t>
+      </w:r>
+      <w:r>
+        <w:t xml:space="preserve">Recovering post-ICU</w:t>
+      </w:r>
+      <w:r>
+        <w:t xml:space="preserve">”</w:t>
+      </w:r>
+      <w:r>
+        <w:t xml:space="preserve">,</w:t>
+      </w:r>
+      <w:r>
+        <w:t xml:space="preserve"> </w:t>
+      </w:r>
+      <w:r>
+        <w:t xml:space="preserve">“</w:t>
+      </w:r>
+      <w:r>
+        <w:t xml:space="preserve">Recovered</w:t>
+      </w:r>
+      <w:r>
+        <w:t xml:space="preserve">”</w:t>
+      </w:r>
+      <w:r>
+        <w:t xml:space="preserve">,</w:t>
+      </w:r>
+      <w:r>
+        <w:t xml:space="preserve"> </w:t>
+      </w:r>
+      <w:r>
+        <w:t xml:space="preserve">“</w:t>
+      </w:r>
+      <w:r>
+        <w:t xml:space="preserve">COVID recovered</w:t>
+      </w:r>
+      <w:r>
+        <w:t xml:space="preserve">”</w:t>
+      </w:r>
+    </w:p>
+    <w:p>
+      <w:pPr>
+        <w:numPr>
+          <w:ilvl w:val="0"/>
+          <w:numId w:val="1004"/>
+        </w:numPr>
+        <w:pStyle w:val="Compact"/>
+      </w:pPr>
+      <w:r>
+        <w:rPr>
+          <w:bCs/>
+          <w:b/>
+        </w:rPr>
+        <w:t xml:space="preserve">COVID Naive</w:t>
+      </w:r>
+      <w:r>
+        <w:t xml:space="preserve">:</w:t>
+      </w:r>
+      <w:r>
+        <w:t xml:space="preserve"> </w:t>
+      </w:r>
+      <w:r>
+        <w:t xml:space="preserve">“</w:t>
+      </w:r>
+      <w:r>
+        <w:t xml:space="preserve">COVID Naive</w:t>
+      </w:r>
+      <w:r>
+        <w:t xml:space="preserve">”</w:t>
+      </w:r>
+      <w:r>
+        <w:t xml:space="preserve"> </w:t>
+      </w:r>
+      <w:r>
+        <w:t xml:space="preserve">— vaccinated individuals with no history of COVID-19 infection</w:t>
+      </w:r>
+    </w:p>
+    <w:p>
+      <w:pPr>
+        <w:numPr>
+          <w:ilvl w:val="0"/>
+          <w:numId w:val="1004"/>
+        </w:numPr>
+        <w:pStyle w:val="Compact"/>
+      </w:pPr>
+      <w:r>
+        <w:rPr>
+          <w:bCs/>
+          <w:b/>
+        </w:rPr>
+        <w:t xml:space="preserve">Healthy</w:t>
+      </w:r>
+      <w:r>
+        <w:t xml:space="preserve">:</w:t>
+      </w:r>
+      <w:r>
+        <w:t xml:space="preserve"> </w:t>
+      </w:r>
+      <w:r>
+        <w:t xml:space="preserve">“</w:t>
+      </w:r>
+      <w:r>
+        <w:t xml:space="preserve">healthy</w:t>
+      </w:r>
+      <w:r>
+        <w:t xml:space="preserve">”</w:t>
+      </w:r>
+      <w:r>
+        <w:t xml:space="preserve"> </w:t>
+      </w:r>
+      <w:r>
+        <w:t xml:space="preserve">— individuals with no history of COVID-19 infection or vaccination</w:t>
+      </w:r>
+    </w:p>
+    <w:p>
+      <w:pPr>
+        <w:pStyle w:val="FirstParagraph"/>
+      </w:pPr>
+      <w:r>
+        <w:t xml:space="preserve">The final cohort comprised: Severe (n=26), Moderate (n=9), Mild (n=30), Recovered (n=12), COVID Naive (n=8), and Healthy (n=9) (</w:t>
+      </w:r>
+      <w:r>
+        <w:rPr>
+          <w:bCs/>
+          <w:b/>
+        </w:rPr>
+        <w:t xml:space="preserve">Table 5</w:t>
+      </w:r>
+      <w:r>
+        <w:t xml:space="preserve">). It is important to note that the Recovered group includes both naturally recovered individuals (3 from the second hospital cohort) and vaccinated individuals who had recovered from prior COVID-19 infection (5 from the second vaccine study, 4 from the first vaccine study). The COVID Naive group consists entirely of vaccinated individuals from the first vaccine study who had never been infected with SARS-CoV-2. The Healthy group consists of individuals with no known COVID-19 history and no vaccination (3 from the convergent signatures study, 6 from the healthy donor atlas).</w:t>
+      </w:r>
+    </w:p>
+    <w:bookmarkEnd w:id="34"/>
+    <w:bookmarkStart w:id="35" w:name="is-api-architecture-and-implementation"/>
+    <w:p>
+      <w:pPr>
+        <w:pStyle w:val="Heading2"/>
+      </w:pPr>
+      <w:r>
+        <w:t xml:space="preserve">IS-API Architecture and Implementation</w:t>
+      </w:r>
+    </w:p>
+    <w:p>
+      <w:pPr>
+        <w:pStyle w:val="FirstParagraph"/>
+      </w:pPr>
+      <w:r>
+        <w:t xml:space="preserve">The overall workflow for building and querying immune repertoire databases is illustrated in</w:t>
+      </w:r>
+      <w:r>
+        <w:t xml:space="preserve"> </w:t>
+      </w:r>
+      <w:r>
+        <w:rPr>
+          <w:bCs/>
+          <w:b/>
+        </w:rPr>
+        <w:t xml:space="preserve">Methods Figure 1</w:t>
+      </w:r>
+      <w:r>
+        <w:t xml:space="preserve">: raw DNA sequences (FASTA/Q or IgBLAST-annotated) are processed with uniform and consistent metadata into ImmuneDB databases, which are then queried through IS-API.</w:t>
+      </w:r>
+    </w:p>
+    <w:p>
+      <w:pPr>
+        <w:pStyle w:val="BodyText"/>
+      </w:pPr>
+      <w:r>
+        <w:t xml:space="preserve">IS-API is a RESTful API written in Node.js [27] using the Express framework. It connects to multiple independent ImmuneDB MySQL database instances and executes queries across all of them in a single API call (</w:t>
+      </w:r>
+      <w:r>
+        <w:rPr>
+          <w:bCs/>
+          <w:b/>
+        </w:rPr>
+        <w:t xml:space="preserve">Methods Figure 2</w:t>
+      </w:r>
+      <w:r>
+        <w:t xml:space="preserve">). The five endpoint controllers — Metadata, Clones, Mutations, CDR3, and Gene Usage — each fan out to 1…N ImmuneDB instances and return results in a unified JSON format. The API is publicly available at https://github.com/DrexelSystemsImmunologyLab/IS-API.</w:t>
+      </w:r>
+    </w:p>
+    <w:p>
+      <w:pPr>
+        <w:pStyle w:val="BodyText"/>
+      </w:pPr>
+      <w:r>
+        <w:t xml:space="preserve">The analysis approach follows a three-tier pyramid (</w:t>
+      </w:r>
+      <w:r>
+        <w:rPr>
+          <w:bCs/>
+          <w:b/>
+        </w:rPr>
+        <w:t xml:space="preserve">Methods Figure 3</w:t>
+      </w:r>
+      <w:r>
+        <w:t xml:space="preserve">): (1) Metadata investigation at the base — examining available studies, individuals, samples, and processes to understand the data landscape; (2) Biological-statistical measurements in the middle — computing clones, clone size, gene usage, and mutations across all kinds of metadata; and (3) Specific biological questions at the top — testing whether, for example, clone size differences correlate with disease stage.</w:t>
+      </w:r>
+    </w:p>
+    <w:p>
+      <w:pPr>
+        <w:pStyle w:val="BodyText"/>
+      </w:pPr>
+      <w:r>
+        <w:t xml:space="preserve">All endpoints are designed as POST requests. The request body contains two objects in JSON format:</w:t>
+      </w:r>
+    </w:p>
+    <w:p>
+      <w:pPr>
+        <w:numPr>
+          <w:ilvl w:val="0"/>
+          <w:numId w:val="1005"/>
+        </w:numPr>
+        <w:pStyle w:val="Compact"/>
+      </w:pPr>
+      <w:r>
+        <w:rPr>
+          <w:bCs/>
+          <w:b/>
+        </w:rPr>
+        <w:t xml:space="preserve">repertoires</w:t>
+      </w:r>
+      <w:r>
+        <w:t xml:space="preserve">: specifies the metadata filters (e.g., disease_stage, tissue, sex, age)</w:t>
+      </w:r>
+    </w:p>
+    <w:p>
+      <w:pPr>
+        <w:numPr>
+          <w:ilvl w:val="0"/>
+          <w:numId w:val="1005"/>
+        </w:numPr>
+        <w:pStyle w:val="Compact"/>
+      </w:pPr>
+      <w:r>
+        <w:rPr>
+          <w:bCs/>
+          <w:b/>
+        </w:rPr>
+        <w:t xml:space="preserve">statistics</w:t>
+      </w:r>
+      <w:r>
+        <w:t xml:space="preserve">: specifies the statistical measure of interest</w:t>
+      </w:r>
+    </w:p>
+    <w:p>
+      <w:pPr>
+        <w:pStyle w:val="FirstParagraph"/>
+      </w:pPr>
+      <w:r>
+        <w:t xml:space="preserve">The response contains:</w:t>
+      </w:r>
+    </w:p>
+    <w:p>
+      <w:pPr>
+        <w:numPr>
+          <w:ilvl w:val="0"/>
+          <w:numId w:val="1006"/>
+        </w:numPr>
+        <w:pStyle w:val="Compact"/>
+      </w:pPr>
+      <w:r>
+        <w:rPr>
+          <w:bCs/>
+          <w:b/>
+        </w:rPr>
+        <w:t xml:space="preserve">Info</w:t>
+      </w:r>
+      <w:r>
+        <w:t xml:space="preserve">: project information (title, version, contacts)</w:t>
+      </w:r>
+    </w:p>
+    <w:p>
+      <w:pPr>
+        <w:numPr>
+          <w:ilvl w:val="0"/>
+          <w:numId w:val="1006"/>
+        </w:numPr>
+        <w:pStyle w:val="Compact"/>
+      </w:pPr>
+      <w:r>
+        <w:rPr>
+          <w:bCs/>
+          <w:b/>
+        </w:rPr>
+        <w:t xml:space="preserve">Result</w:t>
+      </w:r>
+      <w:r>
+        <w:t xml:space="preserve">: an array of objects, each containing the matched repertoire metadata and the computed statistics</w:t>
+      </w:r>
+    </w:p>
+    <w:p>
+      <w:pPr>
+        <w:pStyle w:val="FirstParagraph"/>
+      </w:pPr>
+      <w:r>
+        <w:t xml:space="preserve">The full set of available queries, organized by endpoint controller and statistic type, is shown in</w:t>
+      </w:r>
+      <w:r>
+        <w:t xml:space="preserve"> </w:t>
+      </w:r>
+      <w:r>
+        <w:rPr>
+          <w:bCs/>
+          <w:b/>
+        </w:rPr>
+        <w:t xml:space="preserve">Table 3</w:t>
       </w:r>
       <w:r>
         <w:t xml:space="preserve">.</w:t>
@@ -1588,148 +2318,20 @@
     </w:p>
     <w:p>
       <w:pPr>
-        <w:numPr>
-          <w:ilvl w:val="0"/>
-          <w:numId w:val="1003"/>
-        </w:numPr>
-        <w:pStyle w:val="Compact"/>
-      </w:pPr>
-      <w:r>
-        <w:rPr>
-          <w:bCs/>
-          <w:b/>
-        </w:rPr>
-        <w:t xml:space="preserve">CD2</w:t>
-      </w:r>
-      <w:r>
-        <w:t xml:space="preserve"> </w:t>
-      </w:r>
-      <w:r>
-        <w:t xml:space="preserve">(covid_db2): 19 individuals including severe, non-severe, recovered, and healthy individuals</w:t>
-      </w:r>
-      <w:r>
-        <w:t xml:space="preserve"> </w:t>
-      </w:r>
-      <w:r>
-        <w:t xml:space="preserve">[@Nielsen2020]</w:t>
-      </w:r>
-      <w:r>
-        <w:t xml:space="preserve">.</w:t>
-      </w:r>
-    </w:p>
-    <w:p>
-      <w:pPr>
-        <w:numPr>
-          <w:ilvl w:val="0"/>
-          <w:numId w:val="1003"/>
-        </w:numPr>
-        <w:pStyle w:val="Compact"/>
-      </w:pPr>
-      <w:r>
-        <w:rPr>
-          <w:bCs/>
-          <w:b/>
-        </w:rPr>
-        <w:t xml:space="preserve">CD3</w:t>
-      </w:r>
-      <w:r>
-        <w:t xml:space="preserve"> </w:t>
-      </w:r>
-      <w:r>
-        <w:t xml:space="preserve">(covid19): 13 individuals with severe COVID-19 and healthy controls</w:t>
-      </w:r>
-      <w:r>
-        <w:t xml:space="preserve"> </w:t>
-      </w:r>
-      <w:r>
-        <w:t xml:space="preserve">[@Galson2020]</w:t>
-      </w:r>
-      <w:r>
-        <w:t xml:space="preserve">.</w:t>
-      </w:r>
-    </w:p>
-    <w:p>
-      <w:pPr>
-        <w:numPr>
-          <w:ilvl w:val="0"/>
-          <w:numId w:val="1003"/>
-        </w:numPr>
-        <w:pStyle w:val="Compact"/>
-      </w:pPr>
-      <w:r>
-        <w:rPr>
-          <w:bCs/>
-          <w:b/>
-        </w:rPr>
-        <w:t xml:space="preserve">CVX1</w:t>
-      </w:r>
-      <w:r>
-        <w:t xml:space="preserve"> </w:t>
-      </w:r>
-      <w:r>
-        <w:t xml:space="preserve">(vaccine2): 12 individuals from a COVID-19 mRNA vaccine study, including COVID-recovered vaccinees and COVID-naive vaccinees</w:t>
-      </w:r>
-      <w:r>
-        <w:t xml:space="preserve"> </w:t>
-      </w:r>
-      <w:r>
-        <w:t xml:space="preserve">[@Goel2021]</w:t>
-      </w:r>
-      <w:r>
-        <w:t xml:space="preserve">.</w:t>
-      </w:r>
-    </w:p>
-    <w:p>
-      <w:pPr>
-        <w:numPr>
-          <w:ilvl w:val="0"/>
-          <w:numId w:val="1003"/>
-        </w:numPr>
-        <w:pStyle w:val="Compact"/>
-      </w:pPr>
-      <w:r>
-        <w:rPr>
-          <w:bCs/>
-          <w:b/>
-        </w:rPr>
-        <w:t xml:space="preserve">CVX2</w:t>
-      </w:r>
-      <w:r>
-        <w:t xml:space="preserve"> </w:t>
-      </w:r>
-      <w:r>
-        <w:t xml:space="preserve">(covid_vaccine_new): 5 individuals from a second vaccine cohort with recovered individuals.</w:t>
-      </w:r>
-    </w:p>
-    <w:p>
-      <w:pPr>
-        <w:numPr>
-          <w:ilvl w:val="0"/>
-          <w:numId w:val="1003"/>
-        </w:numPr>
-        <w:pStyle w:val="Compact"/>
-      </w:pPr>
-      <w:r>
-        <w:rPr>
-          <w:bCs/>
-          <w:b/>
-        </w:rPr>
-        <w:t xml:space="preserve">HC1</w:t>
-      </w:r>
-      <w:r>
-        <w:t xml:space="preserve"> </w:t>
-      </w:r>
-      <w:r>
-        <w:t xml:space="preserve">(lp16): 6 healthy control individuals (deceased organ donors) with no history of COVID-19 or vaccination</w:t>
-      </w:r>
-      <w:r>
-        <w:t xml:space="preserve"> </w:t>
-      </w:r>
-      <w:r>
-        <w:t xml:space="preserve">[@Meng2017]</w:t>
-      </w:r>
-      <w:r>
-        <w:t xml:space="preserve">.</w:t>
+        <w:pStyle w:val="BodyText"/>
+      </w:pPr>
+      <w:r>
+        <w:t xml:space="preserve">Version 0.3.0 introduced CTE-based queries (sampleMetaCTE) that first identify all samples matching the requested metadata for each individual, then aggregate statistics across those samples. This ensures correct per-individual results regardless of the number of samples or time points available.</w:t>
+      </w:r>
+    </w:p>
+    <w:bookmarkEnd w:id="35"/>
+    <w:bookmarkStart w:id="36" w:name="statistical-endpoints"/>
+    <w:p>
+      <w:pPr>
+        <w:pStyle w:val="Heading2"/>
+      </w:pPr>
+      <w:r>
+        <w:t xml:space="preserve">Statistical Endpoints</w:t>
       </w:r>
     </w:p>
     <w:p>
@@ -1737,575 +2339,7 @@
         <w:pStyle w:val="FirstParagraph"/>
       </w:pPr>
       <w:r>
-        <w:t xml:space="preserve">A seventh study (sykesIgblast2020, pediatric gut transplant) was available in the IS-API but excluded from this analysis as it is not relevant to COVID-19 or adult healthy controls.</w:t>
-      </w:r>
-    </w:p>
-    <w:bookmarkEnd w:id="31"/>
-    <w:bookmarkStart w:id="32" w:name="individual-selection-and-exclusions"/>
-    <w:p>
-      <w:pPr>
-        <w:pStyle w:val="Heading2"/>
-      </w:pPr>
-      <w:r>
-        <w:t xml:space="preserve">Individual Selection and Exclusions</w:t>
-      </w:r>
-    </w:p>
-    <w:p>
-      <w:pPr>
-        <w:pStyle w:val="FirstParagraph"/>
-      </w:pPr>
-      <w:r>
-        <w:t xml:space="preserve">From the six studies, we identified 94 unique individuals with blood-derived samples. Five individuals were excluded due to data quality issues or ambiguous metadata: three from HC1 (D159, D154, Hu-1) and two from CVX2 (Fb, Water — control samples). Three additional individuals from CD3 (H3, H4, H8) were healthy controls who lacked sex and age metadata; these were included in all analyses except the age and gender confounder analysis. After exclusions, 94 individuals contributed 106 blood-derived repertoires to the analysis (some individuals had multiple blood time points).</w:t>
-      </w:r>
-    </w:p>
-    <w:p>
-      <w:pPr>
-        <w:pStyle w:val="BodyText"/>
-      </w:pPr>
-      <w:r>
-        <w:t xml:space="preserve">Blood-derived tissues were defined as: blood, Peripheral blood, PBL, and PBMC. Non-blood tissues (bone marrow, lymph node, lung, gut) were excluded from the cross-study comparison to ensure tissue homogeneity.</w:t>
-      </w:r>
-    </w:p>
-    <w:bookmarkEnd w:id="32"/>
-    <w:bookmarkStart w:id="33" w:name="disease-stage-harmonization"/>
-    <w:p>
-      <w:pPr>
-        <w:pStyle w:val="Heading2"/>
-      </w:pPr>
-      <w:r>
-        <w:t xml:space="preserve">Disease Stage Harmonization</w:t>
-      </w:r>
-    </w:p>
-    <w:p>
-      <w:pPr>
-        <w:pStyle w:val="FirstParagraph"/>
-      </w:pPr>
-      <w:r>
-        <w:t xml:space="preserve">Different studies used different terminology for disease stages. We harmonized these into six categories (</w:t>
-      </w:r>
-      <w:r>
-        <w:rPr>
-          <w:bCs/>
-          <w:b/>
-        </w:rPr>
-        <w:t xml:space="preserve">Table 4</w:t>
-      </w:r>
-      <w:r>
-        <w:t xml:space="preserve">):</w:t>
-      </w:r>
-    </w:p>
-    <w:p>
-      <w:pPr>
-        <w:numPr>
-          <w:ilvl w:val="0"/>
-          <w:numId w:val="1004"/>
-        </w:numPr>
-        <w:pStyle w:val="Compact"/>
-      </w:pPr>
-      <w:r>
-        <w:rPr>
-          <w:bCs/>
-          <w:b/>
-        </w:rPr>
-        <w:t xml:space="preserve">Severe</w:t>
-      </w:r>
-      <w:r>
-        <w:t xml:space="preserve">:</w:t>
-      </w:r>
-      <w:r>
-        <w:t xml:space="preserve"> </w:t>
-      </w:r>
-      <w:r>
-        <w:t xml:space="preserve">“</w:t>
-      </w:r>
-      <w:r>
-        <w:t xml:space="preserve">severe</w:t>
-      </w:r>
-      <w:r>
-        <w:t xml:space="preserve">”</w:t>
-      </w:r>
-      <w:r>
-        <w:t xml:space="preserve"> </w:t>
-      </w:r>
-      <w:r>
-        <w:t xml:space="preserve">(CD2),</w:t>
-      </w:r>
-      <w:r>
-        <w:t xml:space="preserve"> </w:t>
-      </w:r>
-      <w:r>
-        <w:t xml:space="preserve">“</w:t>
-      </w:r>
-      <w:r>
-        <w:t xml:space="preserve">Early phase hypoxaemia</w:t>
-      </w:r>
-      <w:r>
-        <w:t xml:space="preserve">”</w:t>
-      </w:r>
-      <w:r>
-        <w:t xml:space="preserve"> </w:t>
-      </w:r>
-      <w:r>
-        <w:t xml:space="preserve">(CD1)</w:t>
-      </w:r>
-    </w:p>
-    <w:p>
-      <w:pPr>
-        <w:numPr>
-          <w:ilvl w:val="0"/>
-          <w:numId w:val="1004"/>
-        </w:numPr>
-        <w:pStyle w:val="Compact"/>
-      </w:pPr>
-      <w:r>
-        <w:rPr>
-          <w:bCs/>
-          <w:b/>
-        </w:rPr>
-        <w:t xml:space="preserve">Moderate</w:t>
-      </w:r>
-      <w:r>
-        <w:t xml:space="preserve">:</w:t>
-      </w:r>
-      <w:r>
-        <w:t xml:space="preserve"> </w:t>
-      </w:r>
-      <w:r>
-        <w:t xml:space="preserve">“</w:t>
-      </w:r>
-      <w:r>
-        <w:t xml:space="preserve">Early phase-Stable</w:t>
-      </w:r>
-      <w:r>
-        <w:t xml:space="preserve">”</w:t>
-      </w:r>
-      <w:r>
-        <w:t xml:space="preserve"> </w:t>
-      </w:r>
-      <w:r>
-        <w:t xml:space="preserve">(CD1),</w:t>
-      </w:r>
-      <w:r>
-        <w:t xml:space="preserve"> </w:t>
-      </w:r>
-      <w:r>
-        <w:t xml:space="preserve">“</w:t>
-      </w:r>
-      <w:r>
-        <w:t xml:space="preserve">Early phase-Improving</w:t>
-      </w:r>
-      <w:r>
-        <w:t xml:space="preserve">”</w:t>
-      </w:r>
-      <w:r>
-        <w:t xml:space="preserve"> </w:t>
-      </w:r>
-      <w:r>
-        <w:t xml:space="preserve">(CD1)</w:t>
-      </w:r>
-    </w:p>
-    <w:p>
-      <w:pPr>
-        <w:numPr>
-          <w:ilvl w:val="0"/>
-          <w:numId w:val="1004"/>
-        </w:numPr>
-        <w:pStyle w:val="Compact"/>
-      </w:pPr>
-      <w:r>
-        <w:rPr>
-          <w:bCs/>
-          <w:b/>
-        </w:rPr>
-        <w:t xml:space="preserve">Mild</w:t>
-      </w:r>
-      <w:r>
-        <w:t xml:space="preserve">:</w:t>
-      </w:r>
-      <w:r>
-        <w:t xml:space="preserve"> </w:t>
-      </w:r>
-      <w:r>
-        <w:t xml:space="preserve">“</w:t>
-      </w:r>
-      <w:r>
-        <w:t xml:space="preserve">mild</w:t>
-      </w:r>
-      <w:r>
-        <w:t xml:space="preserve">”</w:t>
-      </w:r>
-      <w:r>
-        <w:t xml:space="preserve"> </w:t>
-      </w:r>
-      <w:r>
-        <w:t xml:space="preserve">(CD2),</w:t>
-      </w:r>
-      <w:r>
-        <w:t xml:space="preserve"> </w:t>
-      </w:r>
-      <w:r>
-        <w:t xml:space="preserve">“</w:t>
-      </w:r>
-      <w:r>
-        <w:t xml:space="preserve">non-severe</w:t>
-      </w:r>
-      <w:r>
-        <w:t xml:space="preserve">”</w:t>
-      </w:r>
-      <w:r>
-        <w:t xml:space="preserve"> </w:t>
-      </w:r>
-      <w:r>
-        <w:t xml:space="preserve">(CD2)</w:t>
-      </w:r>
-    </w:p>
-    <w:p>
-      <w:pPr>
-        <w:numPr>
-          <w:ilvl w:val="0"/>
-          <w:numId w:val="1004"/>
-        </w:numPr>
-        <w:pStyle w:val="Compact"/>
-      </w:pPr>
-      <w:r>
-        <w:rPr>
-          <w:bCs/>
-          <w:b/>
-        </w:rPr>
-        <w:t xml:space="preserve">Recovered</w:t>
-      </w:r>
-      <w:r>
-        <w:t xml:space="preserve">:</w:t>
-      </w:r>
-      <w:r>
-        <w:t xml:space="preserve"> </w:t>
-      </w:r>
-      <w:r>
-        <w:t xml:space="preserve">“</w:t>
-      </w:r>
-      <w:r>
-        <w:t xml:space="preserve">Recovering without ICU-Improving</w:t>
-      </w:r>
-      <w:r>
-        <w:t xml:space="preserve">”</w:t>
-      </w:r>
-      <w:r>
-        <w:t xml:space="preserve"> </w:t>
-      </w:r>
-      <w:r>
-        <w:t xml:space="preserve">(CD1),</w:t>
-      </w:r>
-      <w:r>
-        <w:t xml:space="preserve"> </w:t>
-      </w:r>
-      <w:r>
-        <w:t xml:space="preserve">“</w:t>
-      </w:r>
-      <w:r>
-        <w:t xml:space="preserve">Recovering post-ICU -Improving</w:t>
-      </w:r>
-      <w:r>
-        <w:t xml:space="preserve">”</w:t>
-      </w:r>
-      <w:r>
-        <w:t xml:space="preserve"> </w:t>
-      </w:r>
-      <w:r>
-        <w:t xml:space="preserve">(CD1),</w:t>
-      </w:r>
-      <w:r>
-        <w:t xml:space="preserve"> </w:t>
-      </w:r>
-      <w:r>
-        <w:t xml:space="preserve">“</w:t>
-      </w:r>
-      <w:r>
-        <w:t xml:space="preserve">Recovering post-ICU</w:t>
-      </w:r>
-      <w:r>
-        <w:t xml:space="preserve">”</w:t>
-      </w:r>
-      <w:r>
-        <w:t xml:space="preserve"> </w:t>
-      </w:r>
-      <w:r>
-        <w:t xml:space="preserve">(CD1),</w:t>
-      </w:r>
-      <w:r>
-        <w:t xml:space="preserve"> </w:t>
-      </w:r>
-      <w:r>
-        <w:t xml:space="preserve">“</w:t>
-      </w:r>
-      <w:r>
-        <w:t xml:space="preserve">Recovered</w:t>
-      </w:r>
-      <w:r>
-        <w:t xml:space="preserve">”</w:t>
-      </w:r>
-      <w:r>
-        <w:t xml:space="preserve"> </w:t>
-      </w:r>
-      <w:r>
-        <w:t xml:space="preserve">(CD2),</w:t>
-      </w:r>
-      <w:r>
-        <w:t xml:space="preserve"> </w:t>
-      </w:r>
-      <w:r>
-        <w:t xml:space="preserve">“</w:t>
-      </w:r>
-      <w:r>
-        <w:t xml:space="preserve">COVID recovered</w:t>
-      </w:r>
-      <w:r>
-        <w:t xml:space="preserve">”</w:t>
-      </w:r>
-      <w:r>
-        <w:t xml:space="preserve"> </w:t>
-      </w:r>
-      <w:r>
-        <w:t xml:space="preserve">(CVX1, CVX2)</w:t>
-      </w:r>
-    </w:p>
-    <w:p>
-      <w:pPr>
-        <w:numPr>
-          <w:ilvl w:val="0"/>
-          <w:numId w:val="1004"/>
-        </w:numPr>
-        <w:pStyle w:val="Compact"/>
-      </w:pPr>
-      <w:r>
-        <w:rPr>
-          <w:bCs/>
-          <w:b/>
-        </w:rPr>
-        <w:t xml:space="preserve">COVID Naive</w:t>
-      </w:r>
-      <w:r>
-        <w:t xml:space="preserve">:</w:t>
-      </w:r>
-      <w:r>
-        <w:t xml:space="preserve"> </w:t>
-      </w:r>
-      <w:r>
-        <w:t xml:space="preserve">“</w:t>
-      </w:r>
-      <w:r>
-        <w:t xml:space="preserve">COVID Naive</w:t>
-      </w:r>
-      <w:r>
-        <w:t xml:space="preserve">”</w:t>
-      </w:r>
-      <w:r>
-        <w:t xml:space="preserve"> </w:t>
-      </w:r>
-      <w:r>
-        <w:t xml:space="preserve">(CVX1) — vaccinated individuals with no history of COVID-19 infection</w:t>
-      </w:r>
-    </w:p>
-    <w:p>
-      <w:pPr>
-        <w:numPr>
-          <w:ilvl w:val="0"/>
-          <w:numId w:val="1004"/>
-        </w:numPr>
-        <w:pStyle w:val="Compact"/>
-      </w:pPr>
-      <w:r>
-        <w:rPr>
-          <w:bCs/>
-          <w:b/>
-        </w:rPr>
-        <w:t xml:space="preserve">Healthy</w:t>
-      </w:r>
-      <w:r>
-        <w:t xml:space="preserve">:</w:t>
-      </w:r>
-      <w:r>
-        <w:t xml:space="preserve"> </w:t>
-      </w:r>
-      <w:r>
-        <w:t xml:space="preserve">“</w:t>
-      </w:r>
-      <w:r>
-        <w:t xml:space="preserve">healthy</w:t>
-      </w:r>
-      <w:r>
-        <w:t xml:space="preserve">”</w:t>
-      </w:r>
-      <w:r>
-        <w:t xml:space="preserve"> </w:t>
-      </w:r>
-      <w:r>
-        <w:t xml:space="preserve">(CD3, HC1) — individuals with no history of COVID-19 infection or vaccination</w:t>
-      </w:r>
-    </w:p>
-    <w:p>
-      <w:pPr>
-        <w:pStyle w:val="FirstParagraph"/>
-      </w:pPr>
-      <w:r>
-        <w:t xml:space="preserve">The final cohort comprised: Severe (n=26), Moderate (n=9), Mild (n=30), Recovered (n=12), COVID Naive (n=8), and Healthy (n=9) (</w:t>
-      </w:r>
-      <w:r>
-        <w:rPr>
-          <w:bCs/>
-          <w:b/>
-        </w:rPr>
-        <w:t xml:space="preserve">Table 5</w:t>
-      </w:r>
-      <w:r>
-        <w:t xml:space="preserve">). It is important to note that the Recovered group includes both naturally recovered individuals (3 from CD2) and vaccinated individuals who had recovered from prior COVID-19 infection (5 from CVX2, 4 from CVX1). The COVID Naive group consists entirely of vaccinated individuals from CVX1 who had never been infected with SARS-CoV-2. The Healthy group consists of individuals with no known COVID-19 history and no vaccination (3 from CD3, 6 from HC1).</w:t>
-      </w:r>
-    </w:p>
-    <w:bookmarkEnd w:id="33"/>
-    <w:bookmarkStart w:id="34" w:name="is-api-architecture-and-implementation"/>
-    <w:p>
-      <w:pPr>
-        <w:pStyle w:val="Heading2"/>
-      </w:pPr>
-      <w:r>
-        <w:t xml:space="preserve">IS-API Architecture and Implementation</w:t>
-      </w:r>
-    </w:p>
-    <w:p>
-      <w:pPr>
-        <w:pStyle w:val="FirstParagraph"/>
-      </w:pPr>
-      <w:r>
-        <w:t xml:space="preserve">IS-API is a RESTful API written in Node.js</w:t>
-      </w:r>
-      <w:r>
-        <w:t xml:space="preserve"> </w:t>
-      </w:r>
-      <w:r>
-        <w:t xml:space="preserve">[@Lambert2010]</w:t>
-      </w:r>
-      <w:r>
-        <w:t xml:space="preserve"> </w:t>
-      </w:r>
-      <w:r>
-        <w:t xml:space="preserve">using the Express framework. It connects to multiple independent ImmuneDB MySQL database instances and executes queries across all of them in a single API call. The API is publicly available at https://github.com/DrexelSystemsImmunologyLab/IS-API.</w:t>
-      </w:r>
-    </w:p>
-    <w:p>
-      <w:pPr>
-        <w:pStyle w:val="BodyText"/>
-      </w:pPr>
-      <w:r>
-        <w:t xml:space="preserve">All endpoints are designed as POST requests. The request body contains two objects in JSON format:</w:t>
-      </w:r>
-    </w:p>
-    <w:p>
-      <w:pPr>
-        <w:numPr>
-          <w:ilvl w:val="0"/>
-          <w:numId w:val="1005"/>
-        </w:numPr>
-        <w:pStyle w:val="Compact"/>
-      </w:pPr>
-      <w:r>
-        <w:rPr>
-          <w:bCs/>
-          <w:b/>
-        </w:rPr>
-        <w:t xml:space="preserve">repertoires</w:t>
-      </w:r>
-      <w:r>
-        <w:t xml:space="preserve">: specifies the metadata filters (e.g., disease_stage, tissue, sex, age)</w:t>
-      </w:r>
-    </w:p>
-    <w:p>
-      <w:pPr>
-        <w:numPr>
-          <w:ilvl w:val="0"/>
-          <w:numId w:val="1005"/>
-        </w:numPr>
-        <w:pStyle w:val="Compact"/>
-      </w:pPr>
-      <w:r>
-        <w:rPr>
-          <w:bCs/>
-          <w:b/>
-        </w:rPr>
-        <w:t xml:space="preserve">statistics</w:t>
-      </w:r>
-      <w:r>
-        <w:t xml:space="preserve">: specifies the statistical measure of interest</w:t>
-      </w:r>
-    </w:p>
-    <w:p>
-      <w:pPr>
-        <w:pStyle w:val="FirstParagraph"/>
-      </w:pPr>
-      <w:r>
-        <w:t xml:space="preserve">The response contains:</w:t>
-      </w:r>
-    </w:p>
-    <w:p>
-      <w:pPr>
-        <w:numPr>
-          <w:ilvl w:val="0"/>
-          <w:numId w:val="1006"/>
-        </w:numPr>
-        <w:pStyle w:val="Compact"/>
-      </w:pPr>
-      <w:r>
-        <w:rPr>
-          <w:bCs/>
-          <w:b/>
-        </w:rPr>
-        <w:t xml:space="preserve">Info</w:t>
-      </w:r>
-      <w:r>
-        <w:t xml:space="preserve">: project information (title, version, contacts)</w:t>
-      </w:r>
-    </w:p>
-    <w:p>
-      <w:pPr>
-        <w:numPr>
-          <w:ilvl w:val="0"/>
-          <w:numId w:val="1006"/>
-        </w:numPr>
-        <w:pStyle w:val="Compact"/>
-      </w:pPr>
-      <w:r>
-        <w:rPr>
-          <w:bCs/>
-          <w:b/>
-        </w:rPr>
-        <w:t xml:space="preserve">Result</w:t>
-      </w:r>
-      <w:r>
-        <w:t xml:space="preserve">: an array of objects, each containing the matched repertoire metadata and the computed statistics</w:t>
-      </w:r>
-    </w:p>
-    <w:p>
-      <w:pPr>
-        <w:pStyle w:val="FirstParagraph"/>
-      </w:pPr>
-      <w:r>
-        <w:t xml:space="preserve">Version 0.3.0 introduced CTE-based queries (sampleMetaCTE) that first identify all samples matching the requested metadata for each individual, then aggregate statistics across those samples. This ensures correct per-individual results regardless of the number of samples or time points available.</w:t>
-      </w:r>
-    </w:p>
-    <w:bookmarkEnd w:id="34"/>
-    <w:bookmarkStart w:id="35" w:name="statistical-endpoints"/>
-    <w:p>
-      <w:pPr>
-        <w:pStyle w:val="Heading2"/>
-      </w:pPr>
-      <w:r>
-        <w:t xml:space="preserve">Statistical Endpoints</w:t>
-      </w:r>
-    </w:p>
-    <w:p>
-      <w:pPr>
-        <w:pStyle w:val="FirstParagraph"/>
-      </w:pPr>
-      <w:r>
-        <w:t xml:space="preserve">IS-API provides three endpoint controllers:</w:t>
+        <w:t xml:space="preserve">IS-API provides a flexible and dynamic set of endpoints across four controllers. Importantly, many parameters are not hard-coded — researchers can choose how to measure and filter clones according to their specific research question.</w:t>
       </w:r>
     </w:p>
     <w:p>
@@ -2336,7 +2370,7 @@
         <w:t xml:space="preserve">clone_count</w:t>
       </w:r>
       <w:r>
-        <w:t xml:space="preserve">: Number of distinct clones per individual (clones with 20 or more unique sequences)</w:t>
+        <w:t xml:space="preserve">: Number of distinct clones per individual. The expansion threshold (default: 20 or more unique sequences) is configurable and can be adjusted to study clones at different levels of expansion.</w:t>
       </w:r>
     </w:p>
     <w:p>
@@ -2355,7 +2389,7 @@
         <w:t xml:space="preserve">clone_size</w:t>
       </w:r>
       <w:r>
-        <w:t xml:space="preserve">: Size of each clone, defined as the total number of unique sequences assigned to that clone</w:t>
+        <w:t xml:space="preserve">: Size of each clone, which can be measured in three different ways depending on the research question: by unique sequences (distinct sequences assigned to the clone), by copies (total sequence copies including duplicates), or by instances (number of samples in which the clone appears). This flexibility allows researchers to study clonal expansion from different perspectives — unique sequences reflect diversity, copies reflect abundance, and instances reflect tissue distribution.</w:t>
       </w:r>
     </w:p>
     <w:p>
@@ -2374,7 +2408,7 @@
         <w:t xml:space="preserve">topX_clone_size_copies</w:t>
       </w:r>
       <w:r>
-        <w:t xml:space="preserve">: Cumulative sequence copies for the top 10, 100, and 1000 clones per individual</w:t>
+        <w:t xml:space="preserve">: Cumulative sequence copies for the top 10, 100, and 1000 clones per individual, measuring repertoire concentration.</w:t>
       </w:r>
     </w:p>
     <w:p>
@@ -2402,29 +2436,17 @@
           <w:iCs/>
           <w:i/>
         </w:rPr>
-        <w:t xml:space="preserve">mutations_rs_ratio</w:t>
-      </w:r>
-      <w:r>
-        <w:t xml:space="preserve">: Non-synonymous (replacement) and synonymous (silent) mutation counts in CDR and framework (FW) regions per individual</w:t>
-      </w:r>
-    </w:p>
-    <w:p>
-      <w:pPr>
-        <w:pStyle w:val="FirstParagraph"/>
-      </w:pPr>
-      <w:r>
-        <w:rPr>
-          <w:bCs/>
-          <w:b/>
-        </w:rPr>
-        <w:t xml:space="preserve">CDR3 endpoints:</w:t>
-      </w:r>
-    </w:p>
-    <w:p>
-      <w:pPr>
-        <w:numPr>
-          <w:ilvl w:val="0"/>
-          <w:numId w:val="1009"/>
+        <w:t xml:space="preserve">topX_mutation_level</w:t>
+      </w:r>
+      <w:r>
+        <w:t xml:space="preserve">: Average mutation count across the top clones per individual.</w:t>
+      </w:r>
+    </w:p>
+    <w:p>
+      <w:pPr>
+        <w:numPr>
+          <w:ilvl w:val="0"/>
+          <w:numId w:val="1008"/>
         </w:numPr>
         <w:pStyle w:val="Compact"/>
       </w:pPr>
@@ -2433,29 +2455,17 @@
           <w:iCs/>
           <w:i/>
         </w:rPr>
-        <w:t xml:space="preserve">cdr3_length_distribution</w:t>
-      </w:r>
-      <w:r>
-        <w:t xml:space="preserve">: Mean and standard deviation of CDR3 length in both amino acids and nucleotides per individual</w:t>
-      </w:r>
-    </w:p>
-    <w:p>
-      <w:pPr>
-        <w:pStyle w:val="FirstParagraph"/>
-      </w:pPr>
-      <w:r>
-        <w:rPr>
-          <w:bCs/>
-          <w:b/>
-        </w:rPr>
-        <w:t xml:space="preserve">V gene usage endpoint:</w:t>
-      </w:r>
-    </w:p>
-    <w:p>
-      <w:pPr>
-        <w:numPr>
-          <w:ilvl w:val="0"/>
-          <w:numId w:val="1010"/>
+        <w:t xml:space="preserve">mutation_by_region</w:t>
+      </w:r>
+      <w:r>
+        <w:t xml:space="preserve">: Mutation counts split by CDR versus framework regions.</w:t>
+      </w:r>
+    </w:p>
+    <w:p>
+      <w:pPr>
+        <w:numPr>
+          <w:ilvl w:val="0"/>
+          <w:numId w:val="1008"/>
         </w:numPr>
         <w:pStyle w:val="Compact"/>
       </w:pPr>
@@ -2464,14 +2474,133 @@
           <w:iCs/>
           <w:i/>
         </w:rPr>
+        <w:t xml:space="preserve">mutation_by_type</w:t>
+      </w:r>
+      <w:r>
+        <w:t xml:space="preserve">: Replacement versus silent mutation counts.</w:t>
+      </w:r>
+    </w:p>
+    <w:p>
+      <w:pPr>
+        <w:numPr>
+          <w:ilvl w:val="0"/>
+          <w:numId w:val="1008"/>
+        </w:numPr>
+        <w:pStyle w:val="Compact"/>
+      </w:pPr>
+      <w:r>
+        <w:rPr>
+          <w:iCs/>
+          <w:i/>
+        </w:rPr>
+        <w:t xml:space="preserve">mutations_rs_ratio</w:t>
+      </w:r>
+      <w:r>
+        <w:t xml:space="preserve">: Non-synonymous (replacement) and synonymous (silent) mutation counts in CDR and framework (FW) regions per individual, enabling computation of NS/S ratios.</w:t>
+      </w:r>
+    </w:p>
+    <w:p>
+      <w:pPr>
+        <w:pStyle w:val="FirstParagraph"/>
+      </w:pPr>
+      <w:r>
+        <w:rPr>
+          <w:bCs/>
+          <w:b/>
+        </w:rPr>
+        <w:t xml:space="preserve">CDR3 endpoints:</w:t>
+      </w:r>
+    </w:p>
+    <w:p>
+      <w:pPr>
+        <w:numPr>
+          <w:ilvl w:val="0"/>
+          <w:numId w:val="1009"/>
+        </w:numPr>
+        <w:pStyle w:val="Compact"/>
+      </w:pPr>
+      <w:r>
+        <w:rPr>
+          <w:iCs/>
+          <w:i/>
+        </w:rPr>
+        <w:t xml:space="preserve">topX_nt_AVG_CDR3_length</w:t>
+      </w:r>
+      <w:r>
+        <w:t xml:space="preserve">: Average CDR3 nucleotide length for the top 10, 100, and 1000 clones per individual.</w:t>
+      </w:r>
+    </w:p>
+    <w:p>
+      <w:pPr>
+        <w:numPr>
+          <w:ilvl w:val="0"/>
+          <w:numId w:val="1009"/>
+        </w:numPr>
+        <w:pStyle w:val="Compact"/>
+      </w:pPr>
+      <w:r>
+        <w:rPr>
+          <w:iCs/>
+          <w:i/>
+        </w:rPr>
+        <w:t xml:space="preserve">topX_AA_AVG_CDR3_length</w:t>
+      </w:r>
+      <w:r>
+        <w:t xml:space="preserve">: Average CDR3 amino acid length for the top 10, 100, and 1000 clones per individual.</w:t>
+      </w:r>
+    </w:p>
+    <w:p>
+      <w:pPr>
+        <w:numPr>
+          <w:ilvl w:val="0"/>
+          <w:numId w:val="1009"/>
+        </w:numPr>
+        <w:pStyle w:val="Compact"/>
+      </w:pPr>
+      <w:r>
+        <w:rPr>
+          <w:iCs/>
+          <w:i/>
+        </w:rPr>
+        <w:t xml:space="preserve">cdr3_length_distribution</w:t>
+      </w:r>
+      <w:r>
+        <w:t xml:space="preserve">: Mean, standard deviation, and clone count for CDR3 length in both amino acids and nucleotides per individual — providing a comprehensive view of CDR3 length properties across the entire clone repertoire, not just the top clones.</w:t>
+      </w:r>
+    </w:p>
+    <w:p>
+      <w:pPr>
+        <w:pStyle w:val="FirstParagraph"/>
+      </w:pPr>
+      <w:r>
+        <w:rPr>
+          <w:bCs/>
+          <w:b/>
+        </w:rPr>
+        <w:t xml:space="preserve">V gene usage endpoint:</w:t>
+      </w:r>
+    </w:p>
+    <w:p>
+      <w:pPr>
+        <w:numPr>
+          <w:ilvl w:val="0"/>
+          <w:numId w:val="1010"/>
+        </w:numPr>
+        <w:pStyle w:val="Compact"/>
+      </w:pPr>
+      <w:r>
+        <w:rPr>
+          <w:iCs/>
+          <w:i/>
+        </w:rPr>
         <w:t xml:space="preserve">v_gene_usage</w:t>
       </w:r>
       <w:r>
-        <w:t xml:space="preserve">: Clone count and total copies per V gene per individual</w:t>
-      </w:r>
-    </w:p>
-    <w:bookmarkEnd w:id="35"/>
-    <w:bookmarkStart w:id="36" w:name="biological-statistical-measures"/>
+        <w:t xml:space="preserve">: Clone count and total copies per V gene per individual.</w:t>
+      </w:r>
+    </w:p>
+    <w:bookmarkEnd w:id="36"/>
+    <w:bookmarkStart w:id="37" w:name="biological-statistical-measures"/>
     <w:p>
       <w:pPr>
         <w:pStyle w:val="Heading2"/>
@@ -2623,8 +2752,8 @@
         <w:t xml:space="preserve">: Frequency of each V gene across individuals, filtered to V genes present at 1% or higher frequency in at least 85% of individuals.</w:t>
       </w:r>
     </w:p>
-    <w:bookmarkEnd w:id="36"/>
-    <w:bookmarkStart w:id="37" w:name="statistical-analysis"/>
+    <w:bookmarkEnd w:id="37"/>
+    <w:bookmarkStart w:id="38" w:name="statistical-analysis"/>
     <w:p>
       <w:pPr>
         <w:pStyle w:val="Heading2"/>
@@ -2641,8 +2770,8 @@
         <w:t xml:space="preserve">All statistical comparisons were performed in Python using SciPy. For comparisons across the six disease categories, we used the Kruskal-Wallis H test (a non-parametric test for comparing distributions across multiple groups). When the Kruskal-Wallis test was significant (p &lt; 0.05), pairwise comparisons were performed using the Mann-Whitney U test with Bonferroni correction for multiple testing. Significance levels are indicated as: * p &lt; 0.05, ** p &lt; 0.01, *** p &lt; 0.001. Only pairs with sufficient sample sizes (n &gt;= 3 per group) were tested.</w:t>
       </w:r>
     </w:p>
-    <w:bookmarkEnd w:id="37"/>
-    <w:bookmarkStart w:id="38" w:name="visualization"/>
+    <w:bookmarkEnd w:id="38"/>
+    <w:bookmarkStart w:id="39" w:name="visualization"/>
     <w:p>
       <w:pPr>
         <w:pStyle w:val="Heading2"/>
@@ -2656,12 +2785,12 @@
         <w:pStyle w:val="FirstParagraph"/>
       </w:pPr>
       <w:r>
-        <w:t xml:space="preserve">All figures were generated using Python with matplotlib and numpy. JSON-format API outputs were parsed and visualized with consistent color coding across all figures: Severe (dark red, #b71c1c), Moderate (dark orange, #e65100), Mild (salmon, #ff7043), Recovered (green, #43a047), COVID Naive (light blue, #42a5f5), and Healthy (dark blue, #1565c0). Boxplots show median, interquartile range, and whiskers extending to 1.5 times the interquartile range. Individual data points are overlaid with small random jitter for visibility. Statistical significance brackets are shown above the boxplots where pairwise comparisons reached significance after Bonferroni correction.</w:t>
-      </w:r>
-    </w:p>
-    <w:bookmarkEnd w:id="38"/>
+        <w:t xml:space="preserve">Figures were generated using both R (ggplot2, dplyr, tidyr, jsonlite) and Python (matplotlib, numpy). The JSON-format API outputs were parsed and visualized with consistent color coding across all figures: Severe (dark red, #b71c1c), Moderate (dark orange, #e65100), Mild (salmon, #ff7043), Recovered (green, #43a047), COVID Naive (light blue, #42a5f5), and Healthy (dark blue, #1565c0). Boxplots show median, interquartile range, and whiskers extending to 1.5 times the interquartile range. Individual data points are overlaid with small random jitter for visibility. Statistical significance brackets are shown above the boxplots where pairwise comparisons reached significance after Bonferroni correction.</w:t>
+      </w:r>
+    </w:p>
     <w:bookmarkEnd w:id="39"/>
-    <w:bookmarkStart w:id="50" w:name="results"/>
+    <w:bookmarkEnd w:id="40"/>
+    <w:bookmarkStart w:id="51" w:name="results"/>
     <w:p>
       <w:pPr>
         <w:pStyle w:val="Heading1"/>
@@ -2670,7 +2799,7 @@
         <w:t xml:space="preserve">Results</w:t>
       </w:r>
     </w:p>
-    <w:bookmarkStart w:id="42" w:name="part-1-is-api-tool-capabilities-1"/>
+    <w:bookmarkStart w:id="43" w:name="part-1-is-api-tool-capabilities-1"/>
     <w:p>
       <w:pPr>
         <w:pStyle w:val="Heading2"/>
@@ -2679,7 +2808,7 @@
         <w:t xml:space="preserve">Part 1: IS-API Tool Capabilities</w:t>
       </w:r>
     </w:p>
-    <w:bookmarkStart w:id="40" w:name="X0dc5015c466ba5f8101d47296a0fe60ee5a0057"/>
+    <w:bookmarkStart w:id="41" w:name="X0dc5015c466ba5f8101d47296a0fe60ee5a0057"/>
     <w:p>
       <w:pPr>
         <w:pStyle w:val="Heading3"/>
@@ -2924,8 +3053,8 @@
         <w:t xml:space="preserve">) in the top 10 clones, stratified by both sex and disease category. This demonstrates the API’s ability to perform intersectional queries across multiple metadata dimensions.</w:t>
       </w:r>
     </w:p>
-    <w:bookmarkEnd w:id="40"/>
-    <w:bookmarkStart w:id="41" w:name="within-individual-cross-tissue-analysis"/>
+    <w:bookmarkEnd w:id="41"/>
+    <w:bookmarkStart w:id="42" w:name="within-individual-cross-tissue-analysis"/>
     <w:p>
       <w:pPr>
         <w:pStyle w:val="Heading3"/>
@@ -2989,9 +3118,9 @@
         <w:t xml:space="preserve">.</w:t>
       </w:r>
     </w:p>
-    <w:bookmarkEnd w:id="41"/>
     <w:bookmarkEnd w:id="42"/>
-    <w:bookmarkStart w:id="49" w:name="part-2-covid-19-clonal-analysis-1"/>
+    <w:bookmarkEnd w:id="43"/>
+    <w:bookmarkStart w:id="50" w:name="part-2-covid-19-clonal-analysis-1"/>
     <w:p>
       <w:pPr>
         <w:pStyle w:val="Heading2"/>
@@ -3008,7 +3137,7 @@
         <w:t xml:space="preserve">Having demonstrated IS-API’s querying capabilities, we applied the tool to a focused clonal analysis of BCR repertoires across COVID-19 disease severities. All analyses in this section use blood-derived samples only, with individuals grouped into six harmonized disease categories: Severe (n=26), Moderate (n=9), Mild (n=30), Recovered (n=12), COVID Naive (n=8), and Healthy (n=9).</w:t>
       </w:r>
     </w:p>
-    <w:bookmarkStart w:id="43" w:name="X48f0727e95ba0a8daf9741742366660e615f42a"/>
+    <w:bookmarkStart w:id="44" w:name="X48f0727e95ba0a8daf9741742366660e615f42a"/>
     <w:p>
       <w:pPr>
         <w:pStyle w:val="Heading3"/>
@@ -3069,8 +3198,8 @@
         <w:t xml:space="preserve">), which plot all three Hill numbers for each individual with group medians highlighted, confirmed that the drop from Order 0 to Order 2 was steepest in disease groups (Severe, Moderate, Mild), indicating that these repertoires are dominated by a smaller number of large clones. In contrast, COVID Naive and Healthy individuals showed a more gradual decline, indicating a more even clone size distribution.</w:t>
       </w:r>
     </w:p>
-    <w:bookmarkEnd w:id="43"/>
-    <w:bookmarkStart w:id="44" w:name="X3f5b631ded05b3dcd12510f37cac77f411a6406"/>
+    <w:bookmarkEnd w:id="44"/>
+    <w:bookmarkStart w:id="45" w:name="X3f5b631ded05b3dcd12510f37cac77f411a6406"/>
     <w:p>
       <w:pPr>
         <w:pStyle w:val="Heading3"/>
@@ -3115,8 +3244,8 @@
         <w:t xml:space="preserve">) showed two complementary views. Panel A displayed the distribution of all individual clone sizes (log-transformed) as violin plots with overlaid boxplots, revealing that clone sizes were broadly similar across categories but with longer tails in the COVID Naive and Healthy groups. Panel B showed the median clone size per individual, which was significantly higher in COVID Naive individuals compared to the disease groups (Kruskal-Wallis p = 0.019).</w:t>
       </w:r>
     </w:p>
-    <w:bookmarkEnd w:id="44"/>
-    <w:bookmarkStart w:id="45" w:name="somatic-hypermutation-nss-ratios"/>
+    <w:bookmarkEnd w:id="45"/>
+    <w:bookmarkStart w:id="46" w:name="somatic-hypermutation-nss-ratios"/>
     <w:p>
       <w:pPr>
         <w:pStyle w:val="Heading3"/>
@@ -3167,8 +3296,8 @@
         <w:t xml:space="preserve">Panel C displayed the average mutation counts (non-synonymous and synonymous) as stacked bars for both CDR and FW regions across disease categories. This showed that the overall mutation burden was similar across groups, but the ratio of replacement to silent mutations differed, particularly in CDR regions.</w:t>
       </w:r>
     </w:p>
-    <w:bookmarkEnd w:id="45"/>
-    <w:bookmarkStart w:id="46" w:name="cdr3-length-distribution"/>
+    <w:bookmarkEnd w:id="46"/>
+    <w:bookmarkStart w:id="47" w:name="cdr3-length-distribution"/>
     <w:p>
       <w:pPr>
         <w:pStyle w:val="Heading3"/>
@@ -3211,8 +3340,8 @@
         <w:t xml:space="preserve">The standard deviation of CDR3 length (Panel B), reflecting within-individual variability, also differed across groups (Kruskal-Wallis p = 0.017). Severe individuals tended to have higher CDR3 length variability, suggesting a more heterogeneous repertoire in terms of CDR3 structure. A significant difference was observed between Moderate and Mild individuals (p &lt; 0.05).</w:t>
       </w:r>
     </w:p>
-    <w:bookmarkEnd w:id="46"/>
-    <w:bookmarkStart w:id="47" w:name="v-gene-usage"/>
+    <w:bookmarkEnd w:id="47"/>
+    <w:bookmarkStart w:id="48" w:name="v-gene-usage"/>
     <w:p>
       <w:pPr>
         <w:pStyle w:val="Heading3"/>
@@ -3256,8 +3385,8 @@
         <w:t xml:space="preserve">.</w:t>
       </w:r>
     </w:p>
-    <w:bookmarkEnd w:id="47"/>
-    <w:bookmarkStart w:id="48" w:name="age-and-gender-as-potential-confounders"/>
+    <w:bookmarkEnd w:id="48"/>
+    <w:bookmarkStart w:id="49" w:name="age-and-gender-as-potential-confounders"/>
     <w:p>
       <w:pPr>
         <w:pStyle w:val="Heading3"/>
@@ -3330,10 +3459,10 @@
         <w:t xml:space="preserve">Boxplots comparing male and female individuals within each disease category showed no systematic differences in clone count (Panel A, log scale), mean CDR3 length (Panel B), or CDR NS/S ratio (Panel C). The lack of sex-based differences is consistent with the literature for peripheral blood BCR repertoires, though our sample sizes within each sex-disease combination are limited, and subtle differences cannot be ruled out.</w:t>
       </w:r>
     </w:p>
-    <w:bookmarkEnd w:id="48"/>
     <w:bookmarkEnd w:id="49"/>
     <w:bookmarkEnd w:id="50"/>
-    <w:bookmarkStart w:id="55" w:name="discussion-and-conclusions"/>
+    <w:bookmarkEnd w:id="51"/>
+    <w:bookmarkStart w:id="56" w:name="discussion-and-conclusions"/>
     <w:p>
       <w:pPr>
         <w:pStyle w:val="Heading1"/>
@@ -3342,7 +3471,7 @@
         <w:t xml:space="preserve">Discussion and Conclusions</w:t>
       </w:r>
     </w:p>
-    <w:bookmarkStart w:id="51" w:name="X1adb304ed4de094e294cdd20c5432b83670de9e"/>
+    <w:bookmarkStart w:id="52" w:name="X1adb304ed4de094e294cdd20c5432b83670de9e"/>
     <w:p>
       <w:pPr>
         <w:pStyle w:val="Heading2"/>
@@ -3436,8 +3565,8 @@
         <w:t xml:space="preserve">A limitation of IS-API is that it currently operates on pre-built ImmuneDB databases, meaning that researchers must first process their data through the ImmuneDB pipeline. Future work should explore integration with other database formats and with the broader AIRR Data Commons ecosystem. Additionally, while IS-API handles dozens of databases and hundreds of individuals efficiently, scaling to thousands of individuals may require optimization of database queries and potentially distributed computing approaches.</w:t>
       </w:r>
     </w:p>
-    <w:bookmarkEnd w:id="51"/>
-    <w:bookmarkStart w:id="52" w:name="X5a10b7ac314f547fa47742c173a60aa39f2ce55"/>
+    <w:bookmarkEnd w:id="52"/>
+    <w:bookmarkStart w:id="53" w:name="X5a10b7ac314f547fa47742c173a60aa39f2ce55"/>
     <w:p>
       <w:pPr>
         <w:pStyle w:val="Heading2"/>
@@ -3597,8 +3726,8 @@
         <w:t xml:space="preserve">The lack of strong age or gender effects on clonal metrics within disease categories suggests that the observed differences between disease stages are not primarily driven by demographic confounders. However, this conclusion must be tempered by the limited sample sizes within each age-sex-disease combination and the uneven age distribution across disease categories (severe COVID-19 disproportionately affects older individuals).</w:t>
       </w:r>
     </w:p>
-    <w:bookmarkEnd w:id="52"/>
-    <w:bookmarkStart w:id="53" w:name="limitations"/>
+    <w:bookmarkEnd w:id="53"/>
+    <w:bookmarkStart w:id="54" w:name="limitations"/>
     <w:p>
       <w:pPr>
         <w:pStyle w:val="Heading2"/>
@@ -3615,8 +3744,8 @@
         <w:t xml:space="preserve">Several limitations should be acknowledged. First, the cohort is heterogeneous in terms of sequencing platforms, library preparation methods, and sample processing across studies. While IS-API standardizes the analysis, upstream differences could introduce systematic biases. Second, the clone definition (based on shared V gene, J gene, and CDR3 similarity) may not perfectly capture biological clones across different analysis pipelines. Third, the threshold of 20 or more unique sequences for clone inclusion means that rare clones are excluded, which may bias diversity estimates. Fourth, the sample sizes within some disease categories (particularly Moderate with n=9 and COVID Naive with n=8) are small, limiting statistical power. Fifth, the Recovered group includes both naturally recovered and vaccine-recovered individuals, which may have different repertoire characteristics. Future work should aim to analyze these subgroups separately with larger cohorts.</w:t>
       </w:r>
     </w:p>
-    <w:bookmarkEnd w:id="53"/>
-    <w:bookmarkStart w:id="54" w:name="conclusions"/>
+    <w:bookmarkEnd w:id="54"/>
+    <w:bookmarkStart w:id="55" w:name="conclusions"/>
     <w:p>
       <w:pPr>
         <w:pStyle w:val="Heading2"/>
@@ -3641,9 +3770,9 @@
         <w:t xml:space="preserve">The tool and its cross-study analytical framework can be applied to any disease context where multiple AIRR-seq datasets are available, providing a template for systematic repertoire comparison. Future development will focus on expanding the range of statistical endpoints, improving scalability, and integrating with the broader AIRR Data Commons ecosystem to maximize the utility of the growing body of immune repertoire sequencing data.</w:t>
       </w:r>
     </w:p>
-    <w:bookmarkEnd w:id="54"/>
     <w:bookmarkEnd w:id="55"/>
-    <w:bookmarkStart w:id="56" w:name="references"/>
+    <w:bookmarkEnd w:id="56"/>
+    <w:bookmarkStart w:id="57" w:name="references"/>
     <w:p>
       <w:pPr>
         <w:pStyle w:val="Heading1"/>
@@ -4767,7 +4896,31 @@
         <w:t xml:space="preserve">, 2023.11.15.23298517.</w:t>
       </w:r>
     </w:p>
-    <w:bookmarkEnd w:id="56"/>
+    <w:p>
+      <w:pPr>
+        <w:numPr>
+          <w:ilvl w:val="0"/>
+          <w:numId w:val="1012"/>
+        </w:numPr>
+      </w:pPr>
+      <w:r>
+        <w:t xml:space="preserve">Pejoski, D., Cuesta-Zuluaga, J., Gkoukou, E., et al. (2023). nf-core/airrflow: An adaptive immune receptor repertoire analysis workflow.</w:t>
+      </w:r>
+      <w:r>
+        <w:t xml:space="preserve"> </w:t>
+      </w:r>
+      <w:r>
+        <w:rPr>
+          <w:iCs/>
+          <w:i/>
+        </w:rPr>
+        <w:t xml:space="preserve">Bioinformatics</w:t>
+      </w:r>
+      <w:r>
+        <w:t xml:space="preserve">. https://github.com/nf-core/airrflow</w:t>
+      </w:r>
+    </w:p>
+    <w:bookmarkEnd w:id="57"/>
     <w:sectPr/>
   </w:body>
 </w:document>

</xml_diff>

<commit_message>
Restore CD1/CD2 naming, list all 7 datasets including GT1
Co-Authored-By: Claude Opus 4.6 <noreply@anthropic.com>
Claude-Session: https://claude.ai/code/session_01D55fsgxxDUfDTuPfRhF34U
</commit_message>
<xml_diff>
--- a/thesis/thesis.docx
+++ b/thesis/thesis.docx
@@ -1618,7 +1618,7 @@
         <w:pStyle w:val="BodyText"/>
       </w:pPr>
       <w:r>
-        <w:t xml:space="preserve">Six studies were included in the analysis (</w:t>
+        <w:t xml:space="preserve">Seven studies were available through IS-API (</w:t>
       </w:r>
       <w:r>
         <w:rPr>
@@ -1644,7 +1644,7 @@
           <w:bCs/>
           <w:b/>
         </w:rPr>
-        <w:t xml:space="preserve">COVID Hospital Cohort 1</w:t>
+        <w:t xml:space="preserve">CD1</w:t>
       </w:r>
       <w:r>
         <w:t xml:space="preserve">: 51 individuals with severe, mild, and moderate COVID-19 from multiple hospital cohorts [29, 30].</w:t>
@@ -1663,7 +1663,7 @@
           <w:bCs/>
           <w:b/>
         </w:rPr>
-        <w:t xml:space="preserve">COVID Hospital Cohort 2</w:t>
+        <w:t xml:space="preserve">CD2</w:t>
       </w:r>
       <w:r>
         <w:t xml:space="preserve">: 19 individuals including severe, non-severe, recovered, and healthy individuals [31].</w:t>
@@ -1682,7 +1682,7 @@
           <w:bCs/>
           <w:b/>
         </w:rPr>
-        <w:t xml:space="preserve">COVID Convergent Signatures Study</w:t>
+        <w:t xml:space="preserve">CD3</w:t>
       </w:r>
       <w:r>
         <w:t xml:space="preserve">: 13 individuals with severe COVID-19 and healthy controls [32].</w:t>
@@ -1701,7 +1701,7 @@
           <w:bCs/>
           <w:b/>
         </w:rPr>
-        <w:t xml:space="preserve">mRNA Vaccine Study 1</w:t>
+        <w:t xml:space="preserve">CVX1</w:t>
       </w:r>
       <w:r>
         <w:t xml:space="preserve">: 12 individuals from a COVID-19 mRNA vaccine study, including COVID-recovered vaccinees and COVID-naive vaccinees [33].</w:t>
@@ -1720,7 +1720,7 @@
           <w:bCs/>
           <w:b/>
         </w:rPr>
-        <w:t xml:space="preserve">mRNA Vaccine Study 2</w:t>
+        <w:t xml:space="preserve">CVX2</w:t>
       </w:r>
       <w:r>
         <w:t xml:space="preserve">: 5 individuals from a second vaccine cohort with recovered individuals.</w:t>
@@ -1739,7 +1739,7 @@
           <w:bCs/>
           <w:b/>
         </w:rPr>
-        <w:t xml:space="preserve">Healthy Donor Atlas</w:t>
+        <w:t xml:space="preserve">HC1</w:t>
       </w:r>
       <w:r>
         <w:t xml:space="preserve">: 6 healthy control individuals (deceased organ donors) with no history of COVID-19 or vaccination [34].</w:t>
@@ -1747,10 +1747,21 @@
     </w:p>
     <w:p>
       <w:pPr>
-        <w:pStyle w:val="FirstParagraph"/>
-      </w:pPr>
-      <w:r>
-        <w:t xml:space="preserve">A seventh study (pediatric gut transplant [47]) was available in the IS-API but excluded from this analysis as it is not relevant to COVID-19 or adult healthy controls.</w:t>
+        <w:numPr>
+          <w:ilvl w:val="0"/>
+          <w:numId w:val="1003"/>
+        </w:numPr>
+        <w:pStyle w:val="Compact"/>
+      </w:pPr>
+      <w:r>
+        <w:rPr>
+          <w:bCs/>
+          <w:b/>
+        </w:rPr>
+        <w:t xml:space="preserve">GT1</w:t>
+      </w:r>
+      <w:r>
+        <w:t xml:space="preserve">: 7 pediatric gut transplant recipients [47].</w:t>
       </w:r>
     </w:p>
     <w:bookmarkEnd w:id="32"/>
@@ -1776,7 +1787,7 @@
         <w:pStyle w:val="BodyText"/>
       </w:pPr>
       <w:r>
-        <w:t xml:space="preserve">From the six studies, we identified 94 unique individuals with blood-derived samples. Five individuals were excluded due to data quality issues or ambiguous metadata: three from the Healthy Donor Atlas (individuals with incomplete sequencing data) and two from the second vaccine study (fibroblast and water sequencing controls). Three additional healthy individuals from the COVID Convergent Signatures Study lacked sex and age metadata; these were included in all analyses except the age and gender confounder analysis. After exclusions, 94 individuals contributed 106 blood-derived repertoires to the analysis (some individuals had multiple blood time points).</w:t>
+        <w:t xml:space="preserve">From the six studies, we identified 94 unique individuals with blood-derived samples. Five individuals were excluded due to data quality issues or ambiguous metadata: three from HC1 (individuals with incomplete sequencing data) and two from CVX2 (fibroblast and water sequencing controls). Three additional healthy individuals from CD3 lacked sex and age metadata; these were included in all analyses except the age and gender confounder analysis. After exclusions, 94 individuals contributed 106 blood-derived repertoires to the analysis (some individuals had multiple blood time points).</w:t>
       </w:r>
     </w:p>
     <w:p>
@@ -2133,7 +2144,7 @@
         <w:t xml:space="preserve">Table 5</w:t>
       </w:r>
       <w:r>
-        <w:t xml:space="preserve">). It is important to note that the Recovered group includes both naturally recovered individuals (3 from the second hospital cohort) and vaccinated individuals who had recovered from prior COVID-19 infection (5 from the second vaccine study, 4 from the first vaccine study). The COVID Naive group consists entirely of vaccinated individuals from the first vaccine study who had never been infected with SARS-CoV-2. The Healthy group consists of individuals with no known COVID-19 history and no vaccination (3 from the convergent signatures study, 6 from the healthy donor atlas).</w:t>
+        <w:t xml:space="preserve">). It is important to note that the Recovered group includes both naturally recovered individuals (3 from CD2) and vaccinated individuals who had recovered from prior COVID-19 infection (5 from CVX2, 4 from CVX1). The COVID Naive group consists entirely of vaccinated individuals from CVX1 who had never been infected with SARS-CoV-2. The Healthy group consists of individuals with no known COVID-19 history and no vaccination (3 from CD3, 6 from HC1).</w:t>
       </w:r>
     </w:p>
     <w:bookmarkEnd w:id="34"/>

</xml_diff>

<commit_message>
Add comprehensive metadata analysis section to Part 1 Results
Restored the metadata analysis walkthrough covering: subjects per dataset
(all 7 datasets), metadata completeness, GT1 exclusion rationale, disease
harmonization, demographics scatter, and cross-stratification heatmap
(Metadata Figures 1-6).

Co-Authored-By: Claude Opus 4.6 <noreply@anthropic.com>
Claude-Session: https://claude.ai/code/session_01D55fsgxxDUfDTuPfRhF34U
</commit_message>
<xml_diff>
--- a/thesis/thesis.docx
+++ b/thesis/thesis.docx
@@ -2400,7 +2400,7 @@
         <w:t xml:space="preserve">clone_size</w:t>
       </w:r>
       <w:r>
-        <w:t xml:space="preserve">: Size of each clone, which can be measured in three different ways depending on the research question: by unique sequences (distinct sequences assigned to the clone), by copies (total sequence copies including duplicates), or by instances (number of samples in which the clone appears). This flexibility allows researchers to study clonal expansion from different perspectives — unique sequences reflect diversity, copies reflect abundance, and instances reflect tissue distribution.</w:t>
+        <w:t xml:space="preserve">: Size of each clone, which can be measured in three different ways depending on the research question: by unique sequences (distinct sequences across an entire individual), by instances (distinct sequences within a single sample), or by copy number (the number of raw reads associated with an instance or unique sequence). This flexibility allows researchers to study clonal expansion from different perspectives — unique sequences reflect overall diversity across all samples, instances capture sample-level diversity, and copy number reflects the raw abundance of each sequence.</w:t>
       </w:r>
     </w:p>
     <w:p>
@@ -2801,7 +2801,7 @@
     </w:p>
     <w:bookmarkEnd w:id="39"/>
     <w:bookmarkEnd w:id="40"/>
-    <w:bookmarkStart w:id="51" w:name="results"/>
+    <w:bookmarkStart w:id="53" w:name="results"/>
     <w:p>
       <w:pPr>
         <w:pStyle w:val="Heading1"/>
@@ -2810,7 +2810,7 @@
         <w:t xml:space="preserve">Results</w:t>
       </w:r>
     </w:p>
-    <w:bookmarkStart w:id="43" w:name="part-1-is-api-tool-capabilities-1"/>
+    <w:bookmarkStart w:id="45" w:name="part-1-is-api-tool-capabilities-1"/>
     <w:p>
       <w:pPr>
         <w:pStyle w:val="Heading2"/>
@@ -2819,12 +2819,262 @@
         <w:t xml:space="preserve">Part 1: IS-API Tool Capabilities</w:t>
       </w:r>
     </w:p>
-    <w:bookmarkStart w:id="41" w:name="X0dc5015c466ba5f8101d47296a0fe60ee5a0057"/>
+    <w:p>
+      <w:pPr>
+        <w:pStyle w:val="FirstParagraph"/>
+      </w:pPr>
+      <w:r>
+        <w:t xml:space="preserve">One of the main strengths of IS-API is that it enables researchers to conduct a high-level investigation of the available data and therefore refine their research questions — or at least become aware of potential pitfalls and weaknesses — before investing in detailed biological analysis. This investigation can be made through simple queries that execute within seconds through the IS-API metadata and statistical endpoints.</w:t>
+      </w:r>
+    </w:p>
+    <w:bookmarkStart w:id="41" w:name="metadata-overview"/>
     <w:p>
       <w:pPr>
         <w:pStyle w:val="Heading3"/>
       </w:pPr>
       <w:r>
+        <w:t xml:space="preserve">Metadata Overview</w:t>
+      </w:r>
+    </w:p>
+    <w:p>
+      <w:pPr>
+        <w:pStyle w:val="FirstParagraph"/>
+      </w:pPr>
+      <w:r>
+        <w:t xml:space="preserve">In the first step, we used IS-API to query the metadata endpoint across all available databases. This immediately revealed the scope of data accessible through the tool: seven datasets totaling 121 individuals (</w:t>
+      </w:r>
+      <w:r>
+        <w:rPr>
+          <w:bCs/>
+          <w:b/>
+        </w:rPr>
+        <w:t xml:space="preserve">Metadata Figure 1</w:t>
+      </w:r>
+      <w:r>
+        <w:t xml:space="preserve">). The per-dataset breakdown shows that the largest study (CD1) contributes 51 individuals, while the smallest (CVX2) contributes 5.</w:t>
+      </w:r>
+    </w:p>
+    <w:p>
+      <w:pPr>
+        <w:pStyle w:val="BodyText"/>
+      </w:pPr>
+      <w:r>
+        <w:t xml:space="preserve">Examining the metadata completeness across datasets (</w:t>
+      </w:r>
+      <w:r>
+        <w:rPr>
+          <w:bCs/>
+          <w:b/>
+        </w:rPr>
+        <w:t xml:space="preserve">Metadata Figure 2</w:t>
+      </w:r>
+      <w:r>
+        <w:t xml:space="preserve">) revealed important differences. While all datasets provide tissue and disease stage information, not all provide age or sex metadata — for example, CD3 has 13 individuals with tissue and disease stage data but only 10 with age information and no sex data. This kind of metadata investigation, available within seconds through IS-API, immediately alerts the researcher to the limitations of cross-study comparisons involving multiple metadata dimensions.</w:t>
+      </w:r>
+    </w:p>
+    <w:p>
+      <w:pPr>
+        <w:pStyle w:val="BodyText"/>
+      </w:pPr>
+      <w:r>
+        <w:rPr>
+          <w:bCs/>
+          <w:b/>
+        </w:rPr>
+        <w:t xml:space="preserve">Study selection and exclusions.</w:t>
+      </w:r>
+      <w:r>
+        <w:t xml:space="preserve"> </w:t>
+      </w:r>
+      <w:r>
+        <w:t xml:space="preserve">Based on the metadata overview, we excluded GT1 (pediatric gut transplant, n=15) from further analysis because it does not include COVID-19 disease stage metadata and represents a fundamentally different clinical context (pediatric transplant recipients). This left six COVID-19-related and healthy control datasets with 106 individuals.</w:t>
+      </w:r>
+    </w:p>
+    <w:p>
+      <w:pPr>
+        <w:pStyle w:val="BodyText"/>
+      </w:pPr>
+      <w:r>
+        <w:rPr>
+          <w:bCs/>
+          <w:b/>
+        </w:rPr>
+        <w:t xml:space="preserve">Disease category distribution.</w:t>
+      </w:r>
+      <w:r>
+        <w:t xml:space="preserve"> </w:t>
+      </w:r>
+      <w:r>
+        <w:t xml:space="preserve">Querying the disease_stage metadata field revealed 13 different raw disease labels across the six studies (</w:t>
+      </w:r>
+      <w:r>
+        <w:rPr>
+          <w:bCs/>
+          <w:b/>
+        </w:rPr>
+        <w:t xml:space="preserve">Metadata Figure 3</w:t>
+      </w:r>
+      <w:r>
+        <w:t xml:space="preserve">). These were harmonized into six categories as described in Methods. The harmonized distribution (</w:t>
+      </w:r>
+      <w:r>
+        <w:rPr>
+          <w:bCs/>
+          <w:b/>
+        </w:rPr>
+        <w:t xml:space="preserve">Metadata Figure 4</w:t>
+      </w:r>
+      <w:r>
+        <w:t xml:space="preserve">) shows that the cohort is dominated by Mild (n=41) and Severe (n=27) individuals, with smaller groups of NA/Unknown (n=15), Recovered (n=12), Healthy (n=9), Moderate (n=9), and COVID Naive (n=8). The stacked bar visualization also shows the contribution of each original study and label to the harmonized categories — for example, the Severe group includes individuals labeled</w:t>
+      </w:r>
+      <w:r>
+        <w:t xml:space="preserve"> </w:t>
+      </w:r>
+      <w:r>
+        <w:t xml:space="preserve">“</w:t>
+      </w:r>
+      <w:r>
+        <w:t xml:space="preserve">severe</w:t>
+      </w:r>
+      <w:r>
+        <w:t xml:space="preserve">”</w:t>
+      </w:r>
+      <w:r>
+        <w:t xml:space="preserve"> </w:t>
+      </w:r>
+      <w:r>
+        <w:t xml:space="preserve">from CD2 and</w:t>
+      </w:r>
+      <w:r>
+        <w:t xml:space="preserve"> </w:t>
+      </w:r>
+      <w:r>
+        <w:t xml:space="preserve">“</w:t>
+      </w:r>
+      <w:r>
+        <w:t xml:space="preserve">Early phase hypoxaemia</w:t>
+      </w:r>
+      <w:r>
+        <w:t xml:space="preserve">”</w:t>
+      </w:r>
+      <w:r>
+        <w:t xml:space="preserve"> </w:t>
+      </w:r>
+      <w:r>
+        <w:t xml:space="preserve">from CD1, while the Recovered group spans four different original labels across three studies (CD1, CD2, CVX1, CVX2). The 15 individuals with NA/Unknown disease stage (from GT1 and some CD3 individuals) were excluded from the disease-stage analysis.</w:t>
+      </w:r>
+    </w:p>
+    <w:p>
+      <w:pPr>
+        <w:pStyle w:val="BodyText"/>
+      </w:pPr>
+      <w:r>
+        <w:rPr>
+          <w:bCs/>
+          <w:b/>
+        </w:rPr>
+        <w:t xml:space="preserve">Demographics.</w:t>
+      </w:r>
+      <w:r>
+        <w:t xml:space="preserve"> </w:t>
+      </w:r>
+      <w:r>
+        <w:t xml:space="preserve">To assess whether age and gender could be examined alongside disease stage, we queried these metadata fields simultaneously. The demographics scatter plot (</w:t>
+      </w:r>
+      <w:r>
+        <w:rPr>
+          <w:bCs/>
+          <w:b/>
+        </w:rPr>
+        <w:t xml:space="preserve">Metadata Figure 5</w:t>
+      </w:r>
+      <w:r>
+        <w:t xml:space="preserve">) displays each individual by their disease category and age, colored by dataset and shaped by sex (circle = male, triangle = female, X = missing). This figure immediately reveals several important features of the data:</w:t>
+      </w:r>
+    </w:p>
+    <w:p>
+      <w:pPr>
+        <w:numPr>
+          <w:ilvl w:val="0"/>
+          <w:numId w:val="1012"/>
+        </w:numPr>
+        <w:pStyle w:val="Compact"/>
+      </w:pPr>
+      <w:r>
+        <w:t xml:space="preserve">Severe and Mild individuals span a wide age range (20-88 years), while Recovered and COVID Naive individuals tend to be younger (20-50 years).</w:t>
+      </w:r>
+    </w:p>
+    <w:p>
+      <w:pPr>
+        <w:numPr>
+          <w:ilvl w:val="0"/>
+          <w:numId w:val="1012"/>
+        </w:numPr>
+        <w:pStyle w:val="Compact"/>
+      </w:pPr>
+      <w:r>
+        <w:t xml:space="preserve">The Healthy group has a moderate age range (23-58 years).</w:t>
+      </w:r>
+    </w:p>
+    <w:p>
+      <w:pPr>
+        <w:numPr>
+          <w:ilvl w:val="0"/>
+          <w:numId w:val="1012"/>
+        </w:numPr>
+        <w:pStyle w:val="Compact"/>
+      </w:pPr>
+      <w:r>
+        <w:t xml:space="preserve">Sex data is missing for several individuals in CD3 (shown as X markers), limiting sex-stratified analyses in those disease categories.</w:t>
+      </w:r>
+    </w:p>
+    <w:p>
+      <w:pPr>
+        <w:numPr>
+          <w:ilvl w:val="0"/>
+          <w:numId w:val="1012"/>
+        </w:numPr>
+        <w:pStyle w:val="Compact"/>
+      </w:pPr>
+      <w:r>
+        <w:t xml:space="preserve">The dataset of origin is not uniformly distributed across disease categories — CD1 dominates the Severe and Mild groups, while CVX1 and CVX2 dominate the Recovered and COVID Naive groups.</w:t>
+      </w:r>
+    </w:p>
+    <w:p>
+      <w:pPr>
+        <w:pStyle w:val="FirstParagraph"/>
+      </w:pPr>
+      <w:r>
+        <w:rPr>
+          <w:bCs/>
+          <w:b/>
+        </w:rPr>
+        <w:t xml:space="preserve">Cross-stratification: disease, age, and sex.</w:t>
+      </w:r>
+      <w:r>
+        <w:t xml:space="preserve"> </w:t>
+      </w:r>
+      <w:r>
+        <w:t xml:space="preserve">The heatmap of individual counts across disease category, age group, and sex (</w:t>
+      </w:r>
+      <w:r>
+        <w:rPr>
+          <w:bCs/>
+          <w:b/>
+        </w:rPr>
+        <w:t xml:space="preserve">Metadata Figure 6</w:t>
+      </w:r>
+      <w:r>
+        <w:t xml:space="preserve">) provides a comprehensive view of which comparisons are statistically feasible. The Mild group has the most balanced distribution across age and sex, while the Moderate group has only females aged 66+ and males spanning all age groups. The Healthy group has predominantly males aged 31-65, and the COVID Naive group consists entirely of young adults (18-30). These imbalances must be considered when interpreting disease-stage comparisons, as they could confound biological differences with demographic ones — a point we address directly in the confounder analysis (Figures 24-25).</w:t>
+      </w:r>
+    </w:p>
+    <w:bookmarkEnd w:id="41"/>
+    <w:bookmarkStart w:id="42" w:name="X0dc5015c466ba5f8101d47296a0fe60ee5a0057"/>
+    <w:p>
+      <w:pPr>
+        <w:pStyle w:val="Heading3"/>
+      </w:pPr>
+      <w:r>
         <w:t xml:space="preserve">Querying Repertoire Statistics Across Studies</w:t>
       </w:r>
     </w:p>
@@ -2833,15 +3083,7 @@
         <w:pStyle w:val="FirstParagraph"/>
       </w:pPr>
       <w:r>
-        <w:t xml:space="preserve">One of the main strengths of IS-API is that it enables researchers to conduct a high-level investigation of available data and thereby refine their research questions — or at least become aware of potential pitfalls — before investing in detailed analysis. This investigation can be made through simple queries that execute within seconds.</w:t>
-      </w:r>
-    </w:p>
-    <w:p>
-      <w:pPr>
-        <w:pStyle w:val="BodyText"/>
-      </w:pPr>
-      <w:r>
-        <w:t xml:space="preserve">To demonstrate the range of IS-API’s capabilities, we queried the clone, mutation, and CDR3 endpoints across all six studies, filtering for blood-derived samples and grouping by disease stage. The following figures illustrate the breadth of questions that can be answered through the API.</w:t>
+        <w:t xml:space="preserve">Having characterized the metadata landscape, we used IS-API’s biological-statistical endpoints to query repertoire measures across all six studies, filtering for blood-derived samples and grouping by disease stage. The following figures demonstrate the breadth of questions that can be answered through the API.</w:t>
       </w:r>
     </w:p>
     <w:p>
@@ -3064,8 +3306,8 @@
         <w:t xml:space="preserve">) in the top 10 clones, stratified by both sex and disease category. This demonstrates the API’s ability to perform intersectional queries across multiple metadata dimensions.</w:t>
       </w:r>
     </w:p>
-    <w:bookmarkEnd w:id="41"/>
-    <w:bookmarkStart w:id="42" w:name="within-individual-cross-tissue-analysis"/>
+    <w:bookmarkEnd w:id="42"/>
+    <w:bookmarkStart w:id="43" w:name="within-individual-cross-tissue-analysis"/>
     <w:p>
       <w:pPr>
         <w:pStyle w:val="Heading3"/>
@@ -3117,27 +3359,387 @@
         <w:pStyle w:val="BodyText"/>
       </w:pPr>
       <w:r>
-        <w:t xml:space="preserve">This within-individual comparison revealed that clone counts and sizes can differ substantially between tissues in the same individual, highlighting the importance of specifying tissue type when making cross-study comparisons. The observation that bone marrow and blood repertoires from the same individual can have different clonal profiles is consistent with the known compartmentalization of B cell populations</w:t>
-      </w:r>
-      <w:r>
-        <w:t xml:space="preserve"> </w:t>
-      </w:r>
-      <w:r>
-        <w:t xml:space="preserve">[@Meng2017; @Stern2014]</w:t>
+        <w:t xml:space="preserve">This within-individual comparison revealed that clone counts and sizes can differ substantially between tissues in the same individual, highlighting the importance of specifying tissue type when making cross-study comparisons. The observation that bone marrow and blood repertoires from the same individual can have different clonal profiles is consistent with the known compartmentalization of B cell populations [34, 41].</w:t>
+      </w:r>
+    </w:p>
+    <w:bookmarkEnd w:id="43"/>
+    <w:bookmarkStart w:id="44" w:name="Xae1d9efdc0976dc4f64fa25a6796757be558d86"/>
+    <w:p>
+      <w:pPr>
+        <w:pStyle w:val="Heading3"/>
+      </w:pPr>
+      <w:r>
+        <w:t xml:space="preserve">Summary: Characterizing the Possibilities and Limitations of the Data</w:t>
+      </w:r>
+    </w:p>
+    <w:p>
+      <w:pPr>
+        <w:pStyle w:val="FirstParagraph"/>
+      </w:pPr>
+      <w:r>
+        <w:t xml:space="preserve">The metadata analysis enabled by IS-API revealed both the strengths and limitations of the available data. The strengths include a large cohort (94 individuals after exclusions) spanning six disease categories with data from six independent studies. The limitations include: (1) uneven sample sizes across disease categories, with Mild being the largest and COVID Naive the smallest; (2) incomplete sex metadata, particularly for CD3; (3) age distribution that is not uniform across disease categories, with severe individuals tending to be older; and (4) the Recovered group containing a mix of naturally recovered and vaccine-recovered individuals. These observations, all obtainable within minutes through IS-API queries, informed the design of the focused clonal analysis presented in Part 2.</w:t>
+      </w:r>
+    </w:p>
+    <w:bookmarkEnd w:id="44"/>
+    <w:bookmarkEnd w:id="45"/>
+    <w:bookmarkStart w:id="52" w:name="part-2-covid-19-clonal-analysis-1"/>
+    <w:p>
+      <w:pPr>
+        <w:pStyle w:val="Heading2"/>
+      </w:pPr>
+      <w:r>
+        <w:t xml:space="preserve">Part 2: COVID-19 Clonal Analysis</w:t>
+      </w:r>
+    </w:p>
+    <w:p>
+      <w:pPr>
+        <w:pStyle w:val="FirstParagraph"/>
+      </w:pPr>
+      <w:r>
+        <w:t xml:space="preserve">Having demonstrated IS-API’s querying capabilities, we applied the tool to a focused clonal analysis of BCR repertoires across COVID-19 disease severities. All analyses in this section use blood-derived samples only, with individuals grouped into six harmonized disease categories: Severe (n=26), Moderate (n=9), Mild (n=30), Recovered (n=12), COVID Naive (n=8), and Healthy (n=9).</w:t>
+      </w:r>
+    </w:p>
+    <w:bookmarkStart w:id="46" w:name="X48f0727e95ba0a8daf9741742366660e615f42a"/>
+    <w:p>
+      <w:pPr>
+        <w:pStyle w:val="Heading3"/>
+      </w:pPr>
+      <w:r>
+        <w:t xml:space="preserve">Clonal Diversity Across Disease Severities</w:t>
+      </w:r>
+    </w:p>
+    <w:p>
+      <w:pPr>
+        <w:pStyle w:val="FirstParagraph"/>
+      </w:pPr>
+      <w:r>
+        <w:t xml:space="preserve">To assess overall clonal diversity, we computed Hill numbers of orders 0 (richness), 1 (Shannon), and 2 (Simpson) from the clone size distribution of each individual (</w:t>
+      </w:r>
+      <w:r>
+        <w:rPr>
+          <w:bCs/>
+          <w:b/>
+        </w:rPr>
+        <w:t xml:space="preserve">Figure 17</w:t>
+      </w:r>
+      <w:r>
+        <w:t xml:space="preserve">).</w:t>
+      </w:r>
+    </w:p>
+    <w:p>
+      <w:pPr>
+        <w:pStyle w:val="BodyText"/>
+      </w:pPr>
+      <w:r>
+        <w:t xml:space="preserve">All three diversity measures showed significant differences across disease categories (Kruskal-Wallis p &lt; 0.001 for all three orders). The most striking pattern was that Mild and Recovered individuals had the lowest diversity across all three orders, while COVID Naive and Healthy individuals had the highest. Severe individuals showed intermediate diversity with high variability.</w:t>
+      </w:r>
+    </w:p>
+    <w:p>
+      <w:pPr>
+        <w:pStyle w:val="BodyText"/>
+      </w:pPr>
+      <w:r>
+        <w:t xml:space="preserve">Specifically, Order 0 (clone richness) was significantly higher in COVID Naive compared to Mild (p &lt; 0.01) and Recovered (p &lt; 0.001) individuals. The same pattern was evident in Order 1 (Shannon diversity), where COVID Naive and Healthy individuals had significantly higher effective clone numbers than Mild individuals (p &lt; 0.01 and p &lt; 0.001, respectively). Order 2 (Simpson diversity) similarly showed that Mild and Recovered individuals had repertoires dominated by fewer clones.</w:t>
+      </w:r>
+    </w:p>
+    <w:p>
+      <w:pPr>
+        <w:pStyle w:val="BodyText"/>
+      </w:pPr>
+      <w:r>
+        <w:t xml:space="preserve">The diversity profiles (</w:t>
+      </w:r>
+      <w:r>
+        <w:rPr>
+          <w:bCs/>
+          <w:b/>
+        </w:rPr>
+        <w:t xml:space="preserve">Figure 18</w:t>
+      </w:r>
+      <w:r>
+        <w:t xml:space="preserve">), which plot all three Hill numbers for each individual with group medians highlighted, confirmed that the drop from Order 0 to Order 2 was steepest in disease groups (Severe, Moderate, Mild), indicating that these repertoires are dominated by a smaller number of large clones. In contrast, COVID Naive and Healthy individuals showed a more gradual decline, indicating a more even clone size distribution.</w:t>
+      </w:r>
+    </w:p>
+    <w:bookmarkEnd w:id="46"/>
+    <w:bookmarkStart w:id="47" w:name="X3f5b631ded05b3dcd12510f37cac77f411a6406"/>
+    <w:p>
+      <w:pPr>
+        <w:pStyle w:val="Heading3"/>
+      </w:pPr>
+      <w:r>
+        <w:t xml:space="preserve">Expanded Clones and Clone Size Distribution</w:t>
+      </w:r>
+    </w:p>
+    <w:p>
+      <w:pPr>
+        <w:pStyle w:val="FirstParagraph"/>
+      </w:pPr>
+      <w:r>
+        <w:t xml:space="preserve">We examined the number of expanded clones at three expansion thresholds: 20, 50, and 100 unique sequences per clone (</w:t>
+      </w:r>
+      <w:r>
+        <w:rPr>
+          <w:bCs/>
+          <w:b/>
+        </w:rPr>
+        <w:t xml:space="preserve">Figure 19</w:t>
+      </w:r>
+      <w:r>
+        <w:t xml:space="preserve">). At the lowest threshold (&gt;20 unique sequences), 100% of individuals had at least one expanded clone. At the &gt;50 threshold, some individuals in the Mild and Recovered groups had no expanded clones, while most COVID Naive and Healthy individuals retained multiple expanded clones. At the &gt;100 threshold, the differences became more pronounced, with COVID Naive individuals consistently showing more expanded clones than disease groups.</w:t>
+      </w:r>
+    </w:p>
+    <w:p>
+      <w:pPr>
+        <w:pStyle w:val="BodyText"/>
+      </w:pPr>
+      <w:r>
+        <w:t xml:space="preserve">The clone size distribution analysis (</w:t>
+      </w:r>
+      <w:r>
+        <w:rPr>
+          <w:bCs/>
+          <w:b/>
+        </w:rPr>
+        <w:t xml:space="preserve">Figure 20</w:t>
+      </w:r>
+      <w:r>
+        <w:t xml:space="preserve">) showed two complementary views. Panel A displayed the distribution of all individual clone sizes (log-transformed) as violin plots with overlaid boxplots, revealing that clone sizes were broadly similar across categories but with longer tails in the COVID Naive and Healthy groups. Panel B showed the median clone size per individual, which was significantly higher in COVID Naive individuals compared to the disease groups (Kruskal-Wallis p = 0.019).</w:t>
+      </w:r>
+    </w:p>
+    <w:bookmarkEnd w:id="47"/>
+    <w:bookmarkStart w:id="48" w:name="somatic-hypermutation-nss-ratios"/>
+    <w:p>
+      <w:pPr>
+        <w:pStyle w:val="Heading3"/>
+      </w:pPr>
+      <w:r>
+        <w:t xml:space="preserve">Somatic Hypermutation: NS/S Ratios</w:t>
+      </w:r>
+    </w:p>
+    <w:p>
+      <w:pPr>
+        <w:pStyle w:val="FirstParagraph"/>
+      </w:pPr>
+      <w:r>
+        <w:t xml:space="preserve">The ratio of non-synonymous to synonymous mutations (NS/S ratio) provides insight into the selection pressures acting on the B cell repertoire. We computed NS/S ratios separately for CDR and framework (FW) regions (</w:t>
+      </w:r>
+      <w:r>
+        <w:rPr>
+          <w:bCs/>
+          <w:b/>
+        </w:rPr>
+        <w:t xml:space="preserve">Figure 21</w:t>
+      </w:r>
+      <w:r>
+        <w:t xml:space="preserve">).</w:t>
+      </w:r>
+    </w:p>
+    <w:p>
+      <w:pPr>
+        <w:pStyle w:val="BodyText"/>
+      </w:pPr>
+      <w:r>
+        <w:t xml:space="preserve">In CDR regions (Panel A), the NS/S ratio was consistently above 1.0 across all disease categories, indicating positive selection in CDR regions as expected for antigen-driven responses. The Kruskal-Wallis test showed significant differences across groups (p &lt; 0.001). Mild individuals tended to have higher CDR NS/S ratios, suggesting stronger positive selection in this group, while Severe individuals showed more variable ratios.</w:t>
+      </w:r>
+    </w:p>
+    <w:p>
+      <w:pPr>
+        <w:pStyle w:val="BodyText"/>
+      </w:pPr>
+      <w:r>
+        <w:t xml:space="preserve">In FW regions (Panel B), the NS/S ratio was generally lower than in CDR regions but still above 1.0, indicating some degree of replacement mutations in framework regions as well. The differences between groups were less pronounced in FW regions.</w:t>
+      </w:r>
+    </w:p>
+    <w:p>
+      <w:pPr>
+        <w:pStyle w:val="BodyText"/>
+      </w:pPr>
+      <w:r>
+        <w:t xml:space="preserve">Panel C displayed the average mutation counts (non-synonymous and synonymous) as stacked bars for both CDR and FW regions across disease categories. This showed that the overall mutation burden was similar across groups, but the ratio of replacement to silent mutations differed, particularly in CDR regions.</w:t>
+      </w:r>
+    </w:p>
+    <w:bookmarkEnd w:id="48"/>
+    <w:bookmarkStart w:id="49" w:name="cdr3-length-distribution"/>
+    <w:p>
+      <w:pPr>
+        <w:pStyle w:val="Heading3"/>
+      </w:pPr>
+      <w:r>
+        <w:t xml:space="preserve">CDR3 Length Distribution</w:t>
+      </w:r>
+    </w:p>
+    <w:p>
+      <w:pPr>
+        <w:pStyle w:val="FirstParagraph"/>
+      </w:pPr>
+      <w:r>
+        <w:t xml:space="preserve">The CDR3 amino acid length distribution was analyzed per individual, with both the mean and standard deviation computed across all clones (</w:t>
+      </w:r>
+      <w:r>
+        <w:rPr>
+          <w:bCs/>
+          <w:b/>
+        </w:rPr>
+        <w:t xml:space="preserve">Figure 22</w:t>
+      </w:r>
+      <w:r>
+        <w:t xml:space="preserve">).</w:t>
+      </w:r>
+    </w:p>
+    <w:p>
+      <w:pPr>
+        <w:pStyle w:val="BodyText"/>
+      </w:pPr>
+      <w:r>
+        <w:t xml:space="preserve">Mean CDR3 length showed significant variation across disease categories (Kruskal-Wallis p &lt; 0.001, Panel A). Moderate individuals had the longest mean CDR3 lengths (median approximately 17.8 AA), while Mild and Healthy individuals had shorter CDR3 lengths (median approximately 17.0 AA). This is consistent with previous observations that actively responding repertoires may include clones with longer CDR3 loops, which can form more complex antigen-binding structures.</w:t>
+      </w:r>
+    </w:p>
+    <w:p>
+      <w:pPr>
+        <w:pStyle w:val="BodyText"/>
+      </w:pPr>
+      <w:r>
+        <w:t xml:space="preserve">The standard deviation of CDR3 length (Panel B), reflecting within-individual variability, also differed across groups (Kruskal-Wallis p = 0.017). Severe individuals tended to have higher CDR3 length variability, suggesting a more heterogeneous repertoire in terms of CDR3 structure. A significant difference was observed between Moderate and Mild individuals (p &lt; 0.05).</w:t>
+      </w:r>
+    </w:p>
+    <w:bookmarkEnd w:id="49"/>
+    <w:bookmarkStart w:id="50" w:name="v-gene-usage"/>
+    <w:p>
+      <w:pPr>
+        <w:pStyle w:val="Heading3"/>
+      </w:pPr>
+      <w:r>
+        <w:t xml:space="preserve">V Gene Usage</w:t>
+      </w:r>
+    </w:p>
+    <w:p>
+      <w:pPr>
+        <w:pStyle w:val="FirstParagraph"/>
+      </w:pPr>
+      <w:r>
+        <w:t xml:space="preserve">To examine whether disease stage influences V gene segment usage, we analyzed the frequency of V genes across individuals using a heatmap (</w:t>
+      </w:r>
+      <w:r>
+        <w:rPr>
+          <w:bCs/>
+          <w:b/>
+        </w:rPr>
+        <w:t xml:space="preserve">Figure 23</w:t>
+      </w:r>
+      <w:r>
+        <w:t xml:space="preserve">). V genes were included if they were present at 1% or higher frequency in at least 85% of individuals, resulting in 16 V genes that met this criterion.</w:t>
+      </w:r>
+    </w:p>
+    <w:p>
+      <w:pPr>
+        <w:pStyle w:val="BodyText"/>
+      </w:pPr>
+      <w:r>
+        <w:t xml:space="preserve">The heatmap revealed that certain V genes were consistently used at high frequency across all disease categories (e.g., IGHV4-34, IGHV3-23, IGHV4-59), reflecting the known preferential usage of these gene segments in human BCR repertoires. Visual inspection did not reveal strong disease-specific V gene usage patterns, suggesting that V gene usage is relatively stable across disease states and is more reflective of underlying germline genetics than disease-driven selection. This observation is consistent with the known stability of V gene usage across individuals and conditions</w:t>
+      </w:r>
+      <w:r>
+        <w:t xml:space="preserve"> </w:t>
+      </w:r>
+      <w:r>
+        <w:t xml:space="preserve">[@Yang2021]</w:t>
       </w:r>
       <w:r>
         <w:t xml:space="preserve">.</w:t>
       </w:r>
     </w:p>
-    <w:bookmarkEnd w:id="42"/>
-    <w:bookmarkEnd w:id="43"/>
-    <w:bookmarkStart w:id="50" w:name="part-2-covid-19-clonal-analysis-1"/>
+    <w:bookmarkEnd w:id="50"/>
+    <w:bookmarkStart w:id="51" w:name="age-and-gender-as-potential-confounders"/>
+    <w:p>
+      <w:pPr>
+        <w:pStyle w:val="Heading3"/>
+      </w:pPr>
+      <w:r>
+        <w:t xml:space="preserve">Age and Gender as Potential Confounders</w:t>
+      </w:r>
+    </w:p>
+    <w:p>
+      <w:pPr>
+        <w:pStyle w:val="FirstParagraph"/>
+      </w:pPr>
+      <w:r>
+        <w:t xml:space="preserve">To assess whether age or gender could confound the disease-stage comparisons, we examined three key metrics — clone count, mean CDR3 length, and CDR NS/S ratio — in relation to age and gender. For this analysis, three healthy individuals from CD3 (H3, H4, H8) were excluded because they lacked age and sex metadata.</w:t>
+      </w:r>
+    </w:p>
+    <w:p>
+      <w:pPr>
+        <w:pStyle w:val="BodyText"/>
+      </w:pPr>
+      <w:r>
+        <w:rPr>
+          <w:bCs/>
+          <w:b/>
+        </w:rPr>
+        <w:t xml:space="preserve">Age (</w:t>
+      </w:r>
+      <w:r>
+        <w:t xml:space="preserve">Figure 24</w:t>
+      </w:r>
+      <w:r>
+        <w:rPr>
+          <w:bCs/>
+          <w:b/>
+        </w:rPr>
+        <w:t xml:space="preserve">).</w:t>
+      </w:r>
+      <w:r>
+        <w:t xml:space="preserve"> </w:t>
+      </w:r>
+      <w:r>
+        <w:t xml:space="preserve">Scatter plots of each metric against age showed no strong linear trends within any disease category. Clone count (Panel A, log scale) showed substantial variation within age groups but no systematic increase or decrease with age. Mean CDR3 length (Panel B) was similarly independent of age. The CDR NS/S ratio (Panel C) showed no age-dependent trend. These results suggest that age is not a major confounder in our disease-stage comparisons, though the limited age range within some disease categories (particularly Severe, where older individuals predominate) limits the power of this assessment.</w:t>
+      </w:r>
+    </w:p>
+    <w:p>
+      <w:pPr>
+        <w:pStyle w:val="BodyText"/>
+      </w:pPr>
+      <w:r>
+        <w:rPr>
+          <w:bCs/>
+          <w:b/>
+        </w:rPr>
+        <w:t xml:space="preserve">Gender (</w:t>
+      </w:r>
+      <w:r>
+        <w:t xml:space="preserve">Figure 25</w:t>
+      </w:r>
+      <w:r>
+        <w:rPr>
+          <w:bCs/>
+          <w:b/>
+        </w:rPr>
+        <w:t xml:space="preserve">).</w:t>
+      </w:r>
+      <w:r>
+        <w:t xml:space="preserve"> </w:t>
+      </w:r>
+      <w:r>
+        <w:t xml:space="preserve">Boxplots comparing male and female individuals within each disease category showed no systematic differences in clone count (Panel A, log scale), mean CDR3 length (Panel B), or CDR NS/S ratio (Panel C). The lack of sex-based differences is consistent with the literature for peripheral blood BCR repertoires, though our sample sizes within each sex-disease combination are limited, and subtle differences cannot be ruled out.</w:t>
+      </w:r>
+    </w:p>
+    <w:bookmarkEnd w:id="51"/>
+    <w:bookmarkEnd w:id="52"/>
+    <w:bookmarkEnd w:id="53"/>
+    <w:bookmarkStart w:id="58" w:name="discussion-and-conclusions"/>
+    <w:p>
+      <w:pPr>
+        <w:pStyle w:val="Heading1"/>
+      </w:pPr>
+      <w:r>
+        <w:t xml:space="preserve">Discussion and Conclusions</w:t>
+      </w:r>
+    </w:p>
+    <w:bookmarkStart w:id="54" w:name="X1adb304ed4de094e294cdd20c5432b83670de9e"/>
     <w:p>
       <w:pPr>
         <w:pStyle w:val="Heading2"/>
       </w:pPr>
       <w:r>
-        <w:t xml:space="preserve">Part 2: COVID-19 Clonal Analysis</w:t>
+        <w:t xml:space="preserve">IS-API as a Tool for Cross-Study Repertoire Analysis</w:t>
       </w:r>
     </w:p>
     <w:p>
@@ -3145,16 +3747,94 @@
         <w:pStyle w:val="FirstParagraph"/>
       </w:pPr>
       <w:r>
-        <w:t xml:space="preserve">Having demonstrated IS-API’s querying capabilities, we applied the tool to a focused clonal analysis of BCR repertoires across COVID-19 disease severities. All analyses in this section use blood-derived samples only, with individuals grouped into six harmonized disease categories: Severe (n=26), Moderate (n=9), Mild (n=30), Recovered (n=12), COVID Naive (n=8), and Healthy (n=9).</w:t>
-      </w:r>
-    </w:p>
-    <w:bookmarkStart w:id="44" w:name="X48f0727e95ba0a8daf9741742366660e615f42a"/>
-    <w:p>
-      <w:pPr>
-        <w:pStyle w:val="Heading3"/>
-      </w:pPr>
-      <w:r>
-        <w:t xml:space="preserve">Clonal Diversity Across Disease Severities</w:t>
+        <w:t xml:space="preserve">Large datasets have become essential in computational immunology, revealing patterns and trends that smaller, individual studies often miss. Recent high-throughput sequencing studies of B cell repertoires have shown promise in describing immune system dynamics across various conditions</w:t>
+      </w:r>
+      <w:r>
+        <w:t xml:space="preserve"> </w:t>
+      </w:r>
+      <w:r>
+        <w:t xml:space="preserve">[@Briney2019; @Soto2019]</w:t>
+      </w:r>
+      <w:r>
+        <w:t xml:space="preserve">. However, these studies frequently face limitations due to incomplete metadata, inconsistent data formatting, and the practical difficulty of combining datasets from different laboratories and sequencing platforms.</w:t>
+      </w:r>
+    </w:p>
+    <w:p>
+      <w:pPr>
+        <w:pStyle w:val="BodyText"/>
+      </w:pPr>
+      <w:r>
+        <w:t xml:space="preserve">IS-API addresses these challenges by providing a unified interface for querying multiple ImmuneDB database instances simultaneously. The tool operates on two levels — metadata exploration and biological data analysis — enabling researchers to first understand the scope and limitations of available data before conducting statistical comparisons. This two-level approach is a key strength: by first querying metadata, researchers can identify potential confounders (such as uneven age or sex distributions), recognize missing data, and design their analyses accordingly.</w:t>
+      </w:r>
+    </w:p>
+    <w:p>
+      <w:pPr>
+        <w:pStyle w:val="BodyText"/>
+      </w:pPr>
+      <w:r>
+        <w:t xml:space="preserve">The CTE-based query architecture introduced in version 0.3.0 represents a significant technical improvement. By ensuring correct per-individual, per-tissue aggregation, it eliminates a class of errors that can arise when individuals have different numbers of samples or when multiple tissue types are present. This is particularly important for cross-study analyses where sample structures vary across studies.</w:t>
+      </w:r>
+    </w:p>
+    <w:p>
+      <w:pPr>
+        <w:pStyle w:val="BodyText"/>
+      </w:pPr>
+      <w:r>
+        <w:t xml:space="preserve">Compared to existing tools for cross-study immune repertoire analysis, IS-API offers several advantages. The iReceptor Gateway</w:t>
+      </w:r>
+      <w:r>
+        <w:t xml:space="preserve"> </w:t>
+      </w:r>
+      <w:r>
+        <w:t xml:space="preserve">[@Corrie2018; @iReceptor]</w:t>
+      </w:r>
+      <w:r>
+        <w:t xml:space="preserve"> </w:t>
+      </w:r>
+      <w:r>
+        <w:t xml:space="preserve">provides federated access to AIRR-seq data but operates at the sequence level rather than the clone level, making it difficult to perform clonal analyses. The AIRR Data Commons API</w:t>
+      </w:r>
+      <w:r>
+        <w:t xml:space="preserve"> </w:t>
+      </w:r>
+      <w:r>
+        <w:t xml:space="preserve">[@Christley2020]</w:t>
+      </w:r>
+      <w:r>
+        <w:t xml:space="preserve"> </w:t>
+      </w:r>
+      <w:r>
+        <w:t xml:space="preserve">provides standardized access to repertoire metadata but does not compute statistical summaries. The Immcantation Framework</w:t>
+      </w:r>
+      <w:r>
+        <w:t xml:space="preserve"> </w:t>
+      </w:r>
+      <w:r>
+        <w:t xml:space="preserve">[@Gupta2015]</w:t>
+      </w:r>
+      <w:r>
+        <w:t xml:space="preserve"> </w:t>
+      </w:r>
+      <w:r>
+        <w:t xml:space="preserve">provides sophisticated analysis tools but requires substantial preprocessing to combine data from different sources. IS-API fills the gap between data access and analysis by providing pre-computed, clone-level statistical summaries across multiple databases through a simple REST interface.</w:t>
+      </w:r>
+    </w:p>
+    <w:p>
+      <w:pPr>
+        <w:pStyle w:val="BodyText"/>
+      </w:pPr>
+      <w:r>
+        <w:t xml:space="preserve">A limitation of IS-API is that it currently operates on pre-built ImmuneDB databases, meaning that researchers must first process their data through the ImmuneDB pipeline. Future work should explore integration with other database formats and with the broader AIRR Data Commons ecosystem. Additionally, while IS-API handles dozens of databases and hundreds of individuals efficiently, scaling to thousands of individuals may require optimization of database queries and potentially distributed computing approaches.</w:t>
+      </w:r>
+    </w:p>
+    <w:bookmarkEnd w:id="54"/>
+    <w:bookmarkStart w:id="55" w:name="X5a10b7ac314f547fa47742c173a60aa39f2ce55"/>
+    <w:p>
+      <w:pPr>
+        <w:pStyle w:val="Heading2"/>
+      </w:pPr>
+      <w:r>
+        <w:t xml:space="preserve">COVID-19 Clonal Analysis: Biological Insights</w:t>
       </w:r>
     </w:p>
     <w:p>
@@ -3162,61 +3842,160 @@
         <w:pStyle w:val="FirstParagraph"/>
       </w:pPr>
       <w:r>
-        <w:t xml:space="preserve">To assess overall clonal diversity, we computed Hill numbers of orders 0 (richness), 1 (Shannon), and 2 (Simpson) from the clone size distribution of each individual (</w:t>
-      </w:r>
-      <w:r>
-        <w:rPr>
-          <w:bCs/>
-          <w:b/>
-        </w:rPr>
-        <w:t xml:space="preserve">Figure 17</w:t>
-      </w:r>
-      <w:r>
-        <w:t xml:space="preserve">).</w:t>
-      </w:r>
-    </w:p>
-    <w:p>
-      <w:pPr>
-        <w:pStyle w:val="BodyText"/>
-      </w:pPr>
-      <w:r>
-        <w:t xml:space="preserve">All three diversity measures showed significant differences across disease categories (Kruskal-Wallis p &lt; 0.001 for all three orders). The most striking pattern was that Mild and Recovered individuals had the lowest diversity across all three orders, while COVID Naive and Healthy individuals had the highest. Severe individuals showed intermediate diversity with high variability.</w:t>
-      </w:r>
-    </w:p>
-    <w:p>
-      <w:pPr>
-        <w:pStyle w:val="BodyText"/>
-      </w:pPr>
-      <w:r>
-        <w:t xml:space="preserve">Specifically, Order 0 (clone richness) was significantly higher in COVID Naive compared to Mild (p &lt; 0.01) and Recovered (p &lt; 0.001) individuals. The same pattern was evident in Order 1 (Shannon diversity), where COVID Naive and Healthy individuals had significantly higher effective clone numbers than Mild individuals (p &lt; 0.01 and p &lt; 0.001, respectively). Order 2 (Simpson diversity) similarly showed that Mild and Recovered individuals had repertoires dominated by fewer clones.</w:t>
-      </w:r>
-    </w:p>
-    <w:p>
-      <w:pPr>
-        <w:pStyle w:val="BodyText"/>
-      </w:pPr>
-      <w:r>
-        <w:t xml:space="preserve">The diversity profiles (</w:t>
-      </w:r>
-      <w:r>
-        <w:rPr>
-          <w:bCs/>
-          <w:b/>
-        </w:rPr>
-        <w:t xml:space="preserve">Figure 18</w:t>
-      </w:r>
-      <w:r>
-        <w:t xml:space="preserve">), which plot all three Hill numbers for each individual with group medians highlighted, confirmed that the drop from Order 0 to Order 2 was steepest in disease groups (Severe, Moderate, Mild), indicating that these repertoires are dominated by a smaller number of large clones. In contrast, COVID Naive and Healthy individuals showed a more gradual decline, indicating a more even clone size distribution.</w:t>
-      </w:r>
-    </w:p>
-    <w:bookmarkEnd w:id="44"/>
-    <w:bookmarkStart w:id="45" w:name="X3f5b631ded05b3dcd12510f37cac77f411a6406"/>
-    <w:p>
-      <w:pPr>
-        <w:pStyle w:val="Heading3"/>
-      </w:pPr>
-      <w:r>
-        <w:t xml:space="preserve">Expanded Clones and Clone Size Distribution</w:t>
+        <w:t xml:space="preserve">The cross-study clonal analysis of BCR repertoires across COVID-19 disease severities revealed several notable patterns.</w:t>
+      </w:r>
+    </w:p>
+    <w:p>
+      <w:pPr>
+        <w:pStyle w:val="BodyText"/>
+      </w:pPr>
+      <w:r>
+        <w:rPr>
+          <w:bCs/>
+          <w:b/>
+        </w:rPr>
+        <w:t xml:space="preserve">Clonal diversity decreases in actively diseased individuals.</w:t>
+      </w:r>
+      <w:r>
+        <w:t xml:space="preserve"> </w:t>
+      </w:r>
+      <w:r>
+        <w:t xml:space="preserve">The Hill number analysis showed that individuals with Mild and Recovered COVID-19 had significantly lower clonal diversity than COVID Naive and Healthy individuals across all three diversity orders. This likely reflects the focusing of the B cell repertoire during and following an active immune response — antigen-driven clonal expansion leads to the dominance of a smaller number of clones, reducing overall diversity. The finding that Recovered individuals still show reduced diversity suggests that repertoire focusing persists beyond the acute phase of infection. Similar observations of reduced diversity during active immune responses have been reported in individual studies</w:t>
+      </w:r>
+      <w:r>
+        <w:t xml:space="preserve"> </w:t>
+      </w:r>
+      <w:r>
+        <w:t xml:space="preserve">[@Hoehn2021; @Galson2020]</w:t>
+      </w:r>
+      <w:r>
+        <w:t xml:space="preserve">.</w:t>
+      </w:r>
+    </w:p>
+    <w:p>
+      <w:pPr>
+        <w:pStyle w:val="BodyText"/>
+      </w:pPr>
+      <w:r>
+        <w:t xml:space="preserve">Interestingly, Severe individuals showed intermediate diversity with high variability. This could reflect the heterogeneous nature of severe COVID-19, which encompasses both individuals mounting strong but dysregulated immune responses (with low diversity) and individuals whose severe disease results from a failure to mount effective clonal expansion (with preserved but ineffective diversity).</w:t>
+      </w:r>
+    </w:p>
+    <w:p>
+      <w:pPr>
+        <w:pStyle w:val="BodyText"/>
+      </w:pPr>
+      <w:r>
+        <w:rPr>
+          <w:bCs/>
+          <w:b/>
+        </w:rPr>
+        <w:t xml:space="preserve">NS/S ratios indicate ongoing selection in disease states.</w:t>
+      </w:r>
+      <w:r>
+        <w:t xml:space="preserve"> </w:t>
+      </w:r>
+      <w:r>
+        <w:t xml:space="preserve">The CDR NS/S ratios above 1.0 across all disease categories confirm that positive selection is active in CDR regions, consistent with antigen-driven affinity maturation. The tendency for Mild individuals to show higher CDR NS/S ratios could indicate more efficient germinal center responses with stronger selection for improved antigen binding. In contrast, the more variable NS/S ratios in Severe individuals may reflect disrupted germinal center activity, which has been reported in severe COVID-19</w:t>
+      </w:r>
+      <w:r>
+        <w:t xml:space="preserve"> </w:t>
+      </w:r>
+      <w:r>
+        <w:t xml:space="preserve">[@Kaneko2020]</w:t>
+      </w:r>
+      <w:r>
+        <w:t xml:space="preserve">. The framework NS/S ratios being lower than CDR ratios, yet still above 1.0, suggest some degree of structural adaptation beyond simple conservation.</w:t>
+      </w:r>
+    </w:p>
+    <w:p>
+      <w:pPr>
+        <w:pStyle w:val="BodyText"/>
+      </w:pPr>
+      <w:r>
+        <w:rPr>
+          <w:bCs/>
+          <w:b/>
+        </w:rPr>
+        <w:t xml:space="preserve">CDR3 length varies with disease severity.</w:t>
+      </w:r>
+      <w:r>
+        <w:t xml:space="preserve"> </w:t>
+      </w:r>
+      <w:r>
+        <w:t xml:space="preserve">The observation that Moderate individuals had the longest CDR3 lengths, while Mild and Healthy individuals had shorter CDR3 lengths, is consistent with the known association between longer CDR3 loops and broadly neutralizing antibody responses</w:t>
+      </w:r>
+      <w:r>
+        <w:t xml:space="preserve"> </w:t>
+      </w:r>
+      <w:r>
+        <w:t xml:space="preserve">[@Saada2007]</w:t>
+      </w:r>
+      <w:r>
+        <w:t xml:space="preserve">. Longer CDR3 regions can form more complex antigen-binding structures, potentially enabling recognition of diverse viral epitopes. The higher CDR3 length variability in Severe individuals may reflect a less focused, more heterogeneous response.</w:t>
+      </w:r>
+    </w:p>
+    <w:p>
+      <w:pPr>
+        <w:pStyle w:val="BodyText"/>
+      </w:pPr>
+      <w:r>
+        <w:rPr>
+          <w:bCs/>
+          <w:b/>
+        </w:rPr>
+        <w:t xml:space="preserve">V gene usage is relatively stable across disease states.</w:t>
+      </w:r>
+      <w:r>
+        <w:t xml:space="preserve"> </w:t>
+      </w:r>
+      <w:r>
+        <w:t xml:space="preserve">The lack of strong disease-specific V gene usage patterns is consistent with findings from large-scale repertoire studies showing that V gene usage is primarily determined by germline genetics rather than by antigen exposure or disease state</w:t>
+      </w:r>
+      <w:r>
+        <w:t xml:space="preserve"> </w:t>
+      </w:r>
+      <w:r>
+        <w:t xml:space="preserve">[@Yang2021; @Briney2019]</w:t>
+      </w:r>
+      <w:r>
+        <w:t xml:space="preserve">. While specific antibody lineages targeting SARS-CoV-2 epitopes may preferentially use certain V genes</w:t>
+      </w:r>
+      <w:r>
+        <w:t xml:space="preserve"> </w:t>
+      </w:r>
+      <w:r>
+        <w:t xml:space="preserve">[@Robbiani2020]</w:t>
+      </w:r>
+      <w:r>
+        <w:t xml:space="preserve">, these represent a small fraction of the total repertoire and may not be detectable at the level of overall V gene frequency.</w:t>
+      </w:r>
+    </w:p>
+    <w:p>
+      <w:pPr>
+        <w:pStyle w:val="BodyText"/>
+      </w:pPr>
+      <w:r>
+        <w:rPr>
+          <w:bCs/>
+          <w:b/>
+        </w:rPr>
+        <w:t xml:space="preserve">Age and gender are not major confounders.</w:t>
+      </w:r>
+      <w:r>
+        <w:t xml:space="preserve"> </w:t>
+      </w:r>
+      <w:r>
+        <w:t xml:space="preserve">The lack of strong age or gender effects on clonal metrics within disease categories suggests that the observed differences between disease stages are not primarily driven by demographic confounders. However, this conclusion must be tempered by the limited sample sizes within each age-sex-disease combination and the uneven age distribution across disease categories (severe COVID-19 disproportionately affects older individuals).</w:t>
+      </w:r>
+    </w:p>
+    <w:bookmarkEnd w:id="55"/>
+    <w:bookmarkStart w:id="56" w:name="limitations"/>
+    <w:p>
+      <w:pPr>
+        <w:pStyle w:val="Heading2"/>
+      </w:pPr>
+      <w:r>
+        <w:t xml:space="preserve">Limitations</w:t>
       </w:r>
     </w:p>
     <w:p>
@@ -3224,45 +4003,17 @@
         <w:pStyle w:val="FirstParagraph"/>
       </w:pPr>
       <w:r>
-        <w:t xml:space="preserve">We examined the number of expanded clones at three expansion thresholds: 20, 50, and 100 unique sequences per clone (</w:t>
-      </w:r>
-      <w:r>
-        <w:rPr>
-          <w:bCs/>
-          <w:b/>
-        </w:rPr>
-        <w:t xml:space="preserve">Figure 19</w:t>
-      </w:r>
-      <w:r>
-        <w:t xml:space="preserve">). At the lowest threshold (&gt;20 unique sequences), 100% of individuals had at least one expanded clone. At the &gt;50 threshold, some individuals in the Mild and Recovered groups had no expanded clones, while most COVID Naive and Healthy individuals retained multiple expanded clones. At the &gt;100 threshold, the differences became more pronounced, with COVID Naive individuals consistently showing more expanded clones than disease groups.</w:t>
-      </w:r>
-    </w:p>
-    <w:p>
-      <w:pPr>
-        <w:pStyle w:val="BodyText"/>
-      </w:pPr>
-      <w:r>
-        <w:t xml:space="preserve">The clone size distribution analysis (</w:t>
-      </w:r>
-      <w:r>
-        <w:rPr>
-          <w:bCs/>
-          <w:b/>
-        </w:rPr>
-        <w:t xml:space="preserve">Figure 20</w:t>
-      </w:r>
-      <w:r>
-        <w:t xml:space="preserve">) showed two complementary views. Panel A displayed the distribution of all individual clone sizes (log-transformed) as violin plots with overlaid boxplots, revealing that clone sizes were broadly similar across categories but with longer tails in the COVID Naive and Healthy groups. Panel B showed the median clone size per individual, which was significantly higher in COVID Naive individuals compared to the disease groups (Kruskal-Wallis p = 0.019).</w:t>
-      </w:r>
-    </w:p>
-    <w:bookmarkEnd w:id="45"/>
-    <w:bookmarkStart w:id="46" w:name="somatic-hypermutation-nss-ratios"/>
-    <w:p>
-      <w:pPr>
-        <w:pStyle w:val="Heading3"/>
-      </w:pPr>
-      <w:r>
-        <w:t xml:space="preserve">Somatic Hypermutation: NS/S Ratios</w:t>
+        <w:t xml:space="preserve">Several limitations should be acknowledged. First, the cohort is heterogeneous in terms of sequencing platforms, library preparation methods, and sample processing across studies. While IS-API standardizes the analysis, upstream differences could introduce systematic biases. Second, the clone definition (based on shared V gene, J gene, and CDR3 similarity) may not perfectly capture biological clones across different analysis pipelines. Third, the threshold of 20 or more unique sequences for clone inclusion means that rare clones are excluded, which may bias diversity estimates. Fourth, the sample sizes within some disease categories (particularly Moderate with n=9 and COVID Naive with n=8) are small, limiting statistical power. Fifth, the Recovered group includes both naturally recovered and vaccine-recovered individuals, which may have different repertoire characteristics. Future work should aim to analyze these subgroups separately with larger cohorts.</w:t>
+      </w:r>
+    </w:p>
+    <w:bookmarkEnd w:id="56"/>
+    <w:bookmarkStart w:id="57" w:name="conclusions"/>
+    <w:p>
+      <w:pPr>
+        <w:pStyle w:val="Heading2"/>
+      </w:pPr>
+      <w:r>
+        <w:t xml:space="preserve">Conclusions</w:t>
       </w:r>
     </w:p>
     <w:p>
@@ -3270,525 +4021,25 @@
         <w:pStyle w:val="FirstParagraph"/>
       </w:pPr>
       <w:r>
-        <w:t xml:space="preserve">The ratio of non-synonymous to synonymous mutations (NS/S ratio) provides insight into the selection pressures acting on the B cell repertoire. We computed NS/S ratios separately for CDR and framework (FW) regions (</w:t>
-      </w:r>
-      <w:r>
-        <w:rPr>
-          <w:bCs/>
-          <w:b/>
-        </w:rPr>
-        <w:t xml:space="preserve">Figure 21</w:t>
-      </w:r>
-      <w:r>
-        <w:t xml:space="preserve">).</w:t>
-      </w:r>
-    </w:p>
-    <w:p>
-      <w:pPr>
-        <w:pStyle w:val="BodyText"/>
-      </w:pPr>
-      <w:r>
-        <w:t xml:space="preserve">In CDR regions (Panel A), the NS/S ratio was consistently above 1.0 across all disease categories, indicating positive selection in CDR regions as expected for antigen-driven responses. The Kruskal-Wallis test showed significant differences across groups (p &lt; 0.001). Mild individuals tended to have higher CDR NS/S ratios, suggesting stronger positive selection in this group, while Severe individuals showed more variable ratios.</w:t>
-      </w:r>
-    </w:p>
-    <w:p>
-      <w:pPr>
-        <w:pStyle w:val="BodyText"/>
-      </w:pPr>
-      <w:r>
-        <w:t xml:space="preserve">In FW regions (Panel B), the NS/S ratio was generally lower than in CDR regions but still above 1.0, indicating some degree of replacement mutations in framework regions as well. The differences between groups were less pronounced in FW regions.</w:t>
-      </w:r>
-    </w:p>
-    <w:p>
-      <w:pPr>
-        <w:pStyle w:val="BodyText"/>
-      </w:pPr>
-      <w:r>
-        <w:t xml:space="preserve">Panel C displayed the average mutation counts (non-synonymous and synonymous) as stacked bars for both CDR and FW regions across disease categories. This showed that the overall mutation burden was similar across groups, but the ratio of replacement to silent mutations differed, particularly in CDR regions.</w:t>
-      </w:r>
-    </w:p>
-    <w:bookmarkEnd w:id="46"/>
-    <w:bookmarkStart w:id="47" w:name="cdr3-length-distribution"/>
-    <w:p>
-      <w:pPr>
-        <w:pStyle w:val="Heading3"/>
-      </w:pPr>
-      <w:r>
-        <w:t xml:space="preserve">CDR3 Length Distribution</w:t>
-      </w:r>
-    </w:p>
-    <w:p>
-      <w:pPr>
-        <w:pStyle w:val="FirstParagraph"/>
-      </w:pPr>
-      <w:r>
-        <w:t xml:space="preserve">The CDR3 amino acid length distribution was analyzed per individual, with both the mean and standard deviation computed across all clones (</w:t>
-      </w:r>
-      <w:r>
-        <w:rPr>
-          <w:bCs/>
-          <w:b/>
-        </w:rPr>
-        <w:t xml:space="preserve">Figure 22</w:t>
-      </w:r>
-      <w:r>
-        <w:t xml:space="preserve">).</w:t>
-      </w:r>
-    </w:p>
-    <w:p>
-      <w:pPr>
-        <w:pStyle w:val="BodyText"/>
-      </w:pPr>
-      <w:r>
-        <w:t xml:space="preserve">Mean CDR3 length showed significant variation across disease categories (Kruskal-Wallis p &lt; 0.001, Panel A). Moderate individuals had the longest mean CDR3 lengths (median approximately 17.8 AA), while Mild and Healthy individuals had shorter CDR3 lengths (median approximately 17.0 AA). This is consistent with previous observations that actively responding repertoires may include clones with longer CDR3 loops, which can form more complex antigen-binding structures.</w:t>
-      </w:r>
-    </w:p>
-    <w:p>
-      <w:pPr>
-        <w:pStyle w:val="BodyText"/>
-      </w:pPr>
-      <w:r>
-        <w:t xml:space="preserve">The standard deviation of CDR3 length (Panel B), reflecting within-individual variability, also differed across groups (Kruskal-Wallis p = 0.017). Severe individuals tended to have higher CDR3 length variability, suggesting a more heterogeneous repertoire in terms of CDR3 structure. A significant difference was observed between Moderate and Mild individuals (p &lt; 0.05).</w:t>
-      </w:r>
-    </w:p>
-    <w:bookmarkEnd w:id="47"/>
-    <w:bookmarkStart w:id="48" w:name="v-gene-usage"/>
-    <w:p>
-      <w:pPr>
-        <w:pStyle w:val="Heading3"/>
-      </w:pPr>
-      <w:r>
-        <w:t xml:space="preserve">V Gene Usage</w:t>
-      </w:r>
-    </w:p>
-    <w:p>
-      <w:pPr>
-        <w:pStyle w:val="FirstParagraph"/>
-      </w:pPr>
-      <w:r>
-        <w:t xml:space="preserve">To examine whether disease stage influences V gene segment usage, we analyzed the frequency of V genes across individuals using a heatmap (</w:t>
-      </w:r>
-      <w:r>
-        <w:rPr>
-          <w:bCs/>
-          <w:b/>
-        </w:rPr>
-        <w:t xml:space="preserve">Figure 23</w:t>
-      </w:r>
-      <w:r>
-        <w:t xml:space="preserve">). V genes were included if they were present at 1% or higher frequency in at least 85% of individuals, resulting in 16 V genes that met this criterion.</w:t>
-      </w:r>
-    </w:p>
-    <w:p>
-      <w:pPr>
-        <w:pStyle w:val="BodyText"/>
-      </w:pPr>
-      <w:r>
-        <w:t xml:space="preserve">The heatmap revealed that certain V genes were consistently used at high frequency across all disease categories (e.g., IGHV4-34, IGHV3-23, IGHV4-59), reflecting the known preferential usage of these gene segments in human BCR repertoires. Visual inspection did not reveal strong disease-specific V gene usage patterns, suggesting that V gene usage is relatively stable across disease states and is more reflective of underlying germline genetics than disease-driven selection. This observation is consistent with the known stability of V gene usage across individuals and conditions</w:t>
-      </w:r>
-      <w:r>
-        <w:t xml:space="preserve"> </w:t>
-      </w:r>
-      <w:r>
-        <w:t xml:space="preserve">[@Yang2021]</w:t>
-      </w:r>
-      <w:r>
-        <w:t xml:space="preserve">.</w:t>
-      </w:r>
-    </w:p>
-    <w:bookmarkEnd w:id="48"/>
-    <w:bookmarkStart w:id="49" w:name="age-and-gender-as-potential-confounders"/>
-    <w:p>
-      <w:pPr>
-        <w:pStyle w:val="Heading3"/>
-      </w:pPr>
-      <w:r>
-        <w:t xml:space="preserve">Age and Gender as Potential Confounders</w:t>
-      </w:r>
-    </w:p>
-    <w:p>
-      <w:pPr>
-        <w:pStyle w:val="FirstParagraph"/>
-      </w:pPr>
-      <w:r>
-        <w:t xml:space="preserve">To assess whether age or gender could confound the disease-stage comparisons, we examined three key metrics — clone count, mean CDR3 length, and CDR NS/S ratio — in relation to age and gender. For this analysis, three healthy individuals from CD3 (H3, H4, H8) were excluded because they lacked age and sex metadata.</w:t>
-      </w:r>
-    </w:p>
-    <w:p>
-      <w:pPr>
-        <w:pStyle w:val="BodyText"/>
-      </w:pPr>
-      <w:r>
-        <w:rPr>
-          <w:bCs/>
-          <w:b/>
-        </w:rPr>
-        <w:t xml:space="preserve">Age (</w:t>
-      </w:r>
-      <w:r>
-        <w:t xml:space="preserve">Figure 24</w:t>
-      </w:r>
-      <w:r>
-        <w:rPr>
-          <w:bCs/>
-          <w:b/>
-        </w:rPr>
-        <w:t xml:space="preserve">).</w:t>
-      </w:r>
-      <w:r>
-        <w:t xml:space="preserve"> </w:t>
-      </w:r>
-      <w:r>
-        <w:t xml:space="preserve">Scatter plots of each metric against age showed no strong linear trends within any disease category. Clone count (Panel A, log scale) showed substantial variation within age groups but no systematic increase or decrease with age. Mean CDR3 length (Panel B) was similarly independent of age. The CDR NS/S ratio (Panel C) showed no age-dependent trend. These results suggest that age is not a major confounder in our disease-stage comparisons, though the limited age range within some disease categories (particularly Severe, where older individuals predominate) limits the power of this assessment.</w:t>
-      </w:r>
-    </w:p>
-    <w:p>
-      <w:pPr>
-        <w:pStyle w:val="BodyText"/>
-      </w:pPr>
-      <w:r>
-        <w:rPr>
-          <w:bCs/>
-          <w:b/>
-        </w:rPr>
-        <w:t xml:space="preserve">Gender (</w:t>
-      </w:r>
-      <w:r>
-        <w:t xml:space="preserve">Figure 25</w:t>
-      </w:r>
-      <w:r>
-        <w:rPr>
-          <w:bCs/>
-          <w:b/>
-        </w:rPr>
-        <w:t xml:space="preserve">).</w:t>
-      </w:r>
-      <w:r>
-        <w:t xml:space="preserve"> </w:t>
-      </w:r>
-      <w:r>
-        <w:t xml:space="preserve">Boxplots comparing male and female individuals within each disease category showed no systematic differences in clone count (Panel A, log scale), mean CDR3 length (Panel B), or CDR NS/S ratio (Panel C). The lack of sex-based differences is consistent with the literature for peripheral blood BCR repertoires, though our sample sizes within each sex-disease combination are limited, and subtle differences cannot be ruled out.</w:t>
-      </w:r>
-    </w:p>
-    <w:bookmarkEnd w:id="49"/>
-    <w:bookmarkEnd w:id="50"/>
-    <w:bookmarkEnd w:id="51"/>
-    <w:bookmarkStart w:id="56" w:name="discussion-and-conclusions"/>
+        <w:t xml:space="preserve">IS-API version 0.3.0 provides a practical and efficient tool for cross-study B cell repertoire analysis. By integrating metadata exploration with clone-level statistical queries across multiple databases, it enables researchers to conduct meta-analyses that would otherwise require substantial manual effort in data harmonization and processing. The COVID-19 analysis presented here demonstrates that cross-study approaches can reveal reproducible patterns in repertoire diversity, mutation, and CDR3 characteristics across disease severities — patterns that are consistent with known immunological mechanisms but are strengthened by the larger sample sizes achievable through data integration.</w:t>
+      </w:r>
+    </w:p>
+    <w:p>
+      <w:pPr>
+        <w:pStyle w:val="BodyText"/>
+      </w:pPr>
+      <w:r>
+        <w:t xml:space="preserve">The tool and its cross-study analytical framework can be applied to any disease context where multiple AIRR-seq datasets are available, providing a template for systematic repertoire comparison. Future development will focus on expanding the range of statistical endpoints, improving scalability, and integrating with the broader AIRR Data Commons ecosystem to maximize the utility of the growing body of immune repertoire sequencing data.</w:t>
+      </w:r>
+    </w:p>
+    <w:bookmarkEnd w:id="57"/>
+    <w:bookmarkEnd w:id="58"/>
+    <w:bookmarkStart w:id="59" w:name="references"/>
     <w:p>
       <w:pPr>
         <w:pStyle w:val="Heading1"/>
       </w:pPr>
       <w:r>
-        <w:t xml:space="preserve">Discussion and Conclusions</w:t>
-      </w:r>
-    </w:p>
-    <w:bookmarkStart w:id="52" w:name="X1adb304ed4de094e294cdd20c5432b83670de9e"/>
-    <w:p>
-      <w:pPr>
-        <w:pStyle w:val="Heading2"/>
-      </w:pPr>
-      <w:r>
-        <w:t xml:space="preserve">IS-API as a Tool for Cross-Study Repertoire Analysis</w:t>
-      </w:r>
-    </w:p>
-    <w:p>
-      <w:pPr>
-        <w:pStyle w:val="FirstParagraph"/>
-      </w:pPr>
-      <w:r>
-        <w:t xml:space="preserve">Large datasets have become essential in computational immunology, revealing patterns and trends that smaller, individual studies often miss. Recent high-throughput sequencing studies of B cell repertoires have shown promise in describing immune system dynamics across various conditions</w:t>
-      </w:r>
-      <w:r>
-        <w:t xml:space="preserve"> </w:t>
-      </w:r>
-      <w:r>
-        <w:t xml:space="preserve">[@Briney2019; @Soto2019]</w:t>
-      </w:r>
-      <w:r>
-        <w:t xml:space="preserve">. However, these studies frequently face limitations due to incomplete metadata, inconsistent data formatting, and the practical difficulty of combining datasets from different laboratories and sequencing platforms.</w:t>
-      </w:r>
-    </w:p>
-    <w:p>
-      <w:pPr>
-        <w:pStyle w:val="BodyText"/>
-      </w:pPr>
-      <w:r>
-        <w:t xml:space="preserve">IS-API addresses these challenges by providing a unified interface for querying multiple ImmuneDB database instances simultaneously. The tool operates on two levels — metadata exploration and biological data analysis — enabling researchers to first understand the scope and limitations of available data before conducting statistical comparisons. This two-level approach is a key strength: by first querying metadata, researchers can identify potential confounders (such as uneven age or sex distributions), recognize missing data, and design their analyses accordingly.</w:t>
-      </w:r>
-    </w:p>
-    <w:p>
-      <w:pPr>
-        <w:pStyle w:val="BodyText"/>
-      </w:pPr>
-      <w:r>
-        <w:t xml:space="preserve">The CTE-based query architecture introduced in version 0.3.0 represents a significant technical improvement. By ensuring correct per-individual, per-tissue aggregation, it eliminates a class of errors that can arise when individuals have different numbers of samples or when multiple tissue types are present. This is particularly important for cross-study analyses where sample structures vary across studies.</w:t>
-      </w:r>
-    </w:p>
-    <w:p>
-      <w:pPr>
-        <w:pStyle w:val="BodyText"/>
-      </w:pPr>
-      <w:r>
-        <w:t xml:space="preserve">Compared to existing tools for cross-study immune repertoire analysis, IS-API offers several advantages. The iReceptor Gateway</w:t>
-      </w:r>
-      <w:r>
-        <w:t xml:space="preserve"> </w:t>
-      </w:r>
-      <w:r>
-        <w:t xml:space="preserve">[@Corrie2018; @iReceptor]</w:t>
-      </w:r>
-      <w:r>
-        <w:t xml:space="preserve"> </w:t>
-      </w:r>
-      <w:r>
-        <w:t xml:space="preserve">provides federated access to AIRR-seq data but operates at the sequence level rather than the clone level, making it difficult to perform clonal analyses. The AIRR Data Commons API</w:t>
-      </w:r>
-      <w:r>
-        <w:t xml:space="preserve"> </w:t>
-      </w:r>
-      <w:r>
-        <w:t xml:space="preserve">[@Christley2020]</w:t>
-      </w:r>
-      <w:r>
-        <w:t xml:space="preserve"> </w:t>
-      </w:r>
-      <w:r>
-        <w:t xml:space="preserve">provides standardized access to repertoire metadata but does not compute statistical summaries. The Immcantation Framework</w:t>
-      </w:r>
-      <w:r>
-        <w:t xml:space="preserve"> </w:t>
-      </w:r>
-      <w:r>
-        <w:t xml:space="preserve">[@Gupta2015]</w:t>
-      </w:r>
-      <w:r>
-        <w:t xml:space="preserve"> </w:t>
-      </w:r>
-      <w:r>
-        <w:t xml:space="preserve">provides sophisticated analysis tools but requires substantial preprocessing to combine data from different sources. IS-API fills the gap between data access and analysis by providing pre-computed, clone-level statistical summaries across multiple databases through a simple REST interface.</w:t>
-      </w:r>
-    </w:p>
-    <w:p>
-      <w:pPr>
-        <w:pStyle w:val="BodyText"/>
-      </w:pPr>
-      <w:r>
-        <w:t xml:space="preserve">A limitation of IS-API is that it currently operates on pre-built ImmuneDB databases, meaning that researchers must first process their data through the ImmuneDB pipeline. Future work should explore integration with other database formats and with the broader AIRR Data Commons ecosystem. Additionally, while IS-API handles dozens of databases and hundreds of individuals efficiently, scaling to thousands of individuals may require optimization of database queries and potentially distributed computing approaches.</w:t>
-      </w:r>
-    </w:p>
-    <w:bookmarkEnd w:id="52"/>
-    <w:bookmarkStart w:id="53" w:name="X5a10b7ac314f547fa47742c173a60aa39f2ce55"/>
-    <w:p>
-      <w:pPr>
-        <w:pStyle w:val="Heading2"/>
-      </w:pPr>
-      <w:r>
-        <w:t xml:space="preserve">COVID-19 Clonal Analysis: Biological Insights</w:t>
-      </w:r>
-    </w:p>
-    <w:p>
-      <w:pPr>
-        <w:pStyle w:val="FirstParagraph"/>
-      </w:pPr>
-      <w:r>
-        <w:t xml:space="preserve">The cross-study clonal analysis of BCR repertoires across COVID-19 disease severities revealed several notable patterns.</w:t>
-      </w:r>
-    </w:p>
-    <w:p>
-      <w:pPr>
-        <w:pStyle w:val="BodyText"/>
-      </w:pPr>
-      <w:r>
-        <w:rPr>
-          <w:bCs/>
-          <w:b/>
-        </w:rPr>
-        <w:t xml:space="preserve">Clonal diversity decreases in actively diseased individuals.</w:t>
-      </w:r>
-      <w:r>
-        <w:t xml:space="preserve"> </w:t>
-      </w:r>
-      <w:r>
-        <w:t xml:space="preserve">The Hill number analysis showed that individuals with Mild and Recovered COVID-19 had significantly lower clonal diversity than COVID Naive and Healthy individuals across all three diversity orders. This likely reflects the focusing of the B cell repertoire during and following an active immune response — antigen-driven clonal expansion leads to the dominance of a smaller number of clones, reducing overall diversity. The finding that Recovered individuals still show reduced diversity suggests that repertoire focusing persists beyond the acute phase of infection. Similar observations of reduced diversity during active immune responses have been reported in individual studies</w:t>
-      </w:r>
-      <w:r>
-        <w:t xml:space="preserve"> </w:t>
-      </w:r>
-      <w:r>
-        <w:t xml:space="preserve">[@Hoehn2021; @Galson2020]</w:t>
-      </w:r>
-      <w:r>
-        <w:t xml:space="preserve">.</w:t>
-      </w:r>
-    </w:p>
-    <w:p>
-      <w:pPr>
-        <w:pStyle w:val="BodyText"/>
-      </w:pPr>
-      <w:r>
-        <w:t xml:space="preserve">Interestingly, Severe individuals showed intermediate diversity with high variability. This could reflect the heterogeneous nature of severe COVID-19, which encompasses both individuals mounting strong but dysregulated immune responses (with low diversity) and individuals whose severe disease results from a failure to mount effective clonal expansion (with preserved but ineffective diversity).</w:t>
-      </w:r>
-    </w:p>
-    <w:p>
-      <w:pPr>
-        <w:pStyle w:val="BodyText"/>
-      </w:pPr>
-      <w:r>
-        <w:rPr>
-          <w:bCs/>
-          <w:b/>
-        </w:rPr>
-        <w:t xml:space="preserve">NS/S ratios indicate ongoing selection in disease states.</w:t>
-      </w:r>
-      <w:r>
-        <w:t xml:space="preserve"> </w:t>
-      </w:r>
-      <w:r>
-        <w:t xml:space="preserve">The CDR NS/S ratios above 1.0 across all disease categories confirm that positive selection is active in CDR regions, consistent with antigen-driven affinity maturation. The tendency for Mild individuals to show higher CDR NS/S ratios could indicate more efficient germinal center responses with stronger selection for improved antigen binding. In contrast, the more variable NS/S ratios in Severe individuals may reflect disrupted germinal center activity, which has been reported in severe COVID-19</w:t>
-      </w:r>
-      <w:r>
-        <w:t xml:space="preserve"> </w:t>
-      </w:r>
-      <w:r>
-        <w:t xml:space="preserve">[@Kaneko2020]</w:t>
-      </w:r>
-      <w:r>
-        <w:t xml:space="preserve">. The framework NS/S ratios being lower than CDR ratios, yet still above 1.0, suggest some degree of structural adaptation beyond simple conservation.</w:t>
-      </w:r>
-    </w:p>
-    <w:p>
-      <w:pPr>
-        <w:pStyle w:val="BodyText"/>
-      </w:pPr>
-      <w:r>
-        <w:rPr>
-          <w:bCs/>
-          <w:b/>
-        </w:rPr>
-        <w:t xml:space="preserve">CDR3 length varies with disease severity.</w:t>
-      </w:r>
-      <w:r>
-        <w:t xml:space="preserve"> </w:t>
-      </w:r>
-      <w:r>
-        <w:t xml:space="preserve">The observation that Moderate individuals had the longest CDR3 lengths, while Mild and Healthy individuals had shorter CDR3 lengths, is consistent with the known association between longer CDR3 loops and broadly neutralizing antibody responses</w:t>
-      </w:r>
-      <w:r>
-        <w:t xml:space="preserve"> </w:t>
-      </w:r>
-      <w:r>
-        <w:t xml:space="preserve">[@Saada2007]</w:t>
-      </w:r>
-      <w:r>
-        <w:t xml:space="preserve">. Longer CDR3 regions can form more complex antigen-binding structures, potentially enabling recognition of diverse viral epitopes. The higher CDR3 length variability in Severe individuals may reflect a less focused, more heterogeneous response.</w:t>
-      </w:r>
-    </w:p>
-    <w:p>
-      <w:pPr>
-        <w:pStyle w:val="BodyText"/>
-      </w:pPr>
-      <w:r>
-        <w:rPr>
-          <w:bCs/>
-          <w:b/>
-        </w:rPr>
-        <w:t xml:space="preserve">V gene usage is relatively stable across disease states.</w:t>
-      </w:r>
-      <w:r>
-        <w:t xml:space="preserve"> </w:t>
-      </w:r>
-      <w:r>
-        <w:t xml:space="preserve">The lack of strong disease-specific V gene usage patterns is consistent with findings from large-scale repertoire studies showing that V gene usage is primarily determined by germline genetics rather than by antigen exposure or disease state</w:t>
-      </w:r>
-      <w:r>
-        <w:t xml:space="preserve"> </w:t>
-      </w:r>
-      <w:r>
-        <w:t xml:space="preserve">[@Yang2021; @Briney2019]</w:t>
-      </w:r>
-      <w:r>
-        <w:t xml:space="preserve">. While specific antibody lineages targeting SARS-CoV-2 epitopes may preferentially use certain V genes</w:t>
-      </w:r>
-      <w:r>
-        <w:t xml:space="preserve"> </w:t>
-      </w:r>
-      <w:r>
-        <w:t xml:space="preserve">[@Robbiani2020]</w:t>
-      </w:r>
-      <w:r>
-        <w:t xml:space="preserve">, these represent a small fraction of the total repertoire and may not be detectable at the level of overall V gene frequency.</w:t>
-      </w:r>
-    </w:p>
-    <w:p>
-      <w:pPr>
-        <w:pStyle w:val="BodyText"/>
-      </w:pPr>
-      <w:r>
-        <w:rPr>
-          <w:bCs/>
-          <w:b/>
-        </w:rPr>
-        <w:t xml:space="preserve">Age and gender are not major confounders.</w:t>
-      </w:r>
-      <w:r>
-        <w:t xml:space="preserve"> </w:t>
-      </w:r>
-      <w:r>
-        <w:t xml:space="preserve">The lack of strong age or gender effects on clonal metrics within disease categories suggests that the observed differences between disease stages are not primarily driven by demographic confounders. However, this conclusion must be tempered by the limited sample sizes within each age-sex-disease combination and the uneven age distribution across disease categories (severe COVID-19 disproportionately affects older individuals).</w:t>
-      </w:r>
-    </w:p>
-    <w:bookmarkEnd w:id="53"/>
-    <w:bookmarkStart w:id="54" w:name="limitations"/>
-    <w:p>
-      <w:pPr>
-        <w:pStyle w:val="Heading2"/>
-      </w:pPr>
-      <w:r>
-        <w:t xml:space="preserve">Limitations</w:t>
-      </w:r>
-    </w:p>
-    <w:p>
-      <w:pPr>
-        <w:pStyle w:val="FirstParagraph"/>
-      </w:pPr>
-      <w:r>
-        <w:t xml:space="preserve">Several limitations should be acknowledged. First, the cohort is heterogeneous in terms of sequencing platforms, library preparation methods, and sample processing across studies. While IS-API standardizes the analysis, upstream differences could introduce systematic biases. Second, the clone definition (based on shared V gene, J gene, and CDR3 similarity) may not perfectly capture biological clones across different analysis pipelines. Third, the threshold of 20 or more unique sequences for clone inclusion means that rare clones are excluded, which may bias diversity estimates. Fourth, the sample sizes within some disease categories (particularly Moderate with n=9 and COVID Naive with n=8) are small, limiting statistical power. Fifth, the Recovered group includes both naturally recovered and vaccine-recovered individuals, which may have different repertoire characteristics. Future work should aim to analyze these subgroups separately with larger cohorts.</w:t>
-      </w:r>
-    </w:p>
-    <w:bookmarkEnd w:id="54"/>
-    <w:bookmarkStart w:id="55" w:name="conclusions"/>
-    <w:p>
-      <w:pPr>
-        <w:pStyle w:val="Heading2"/>
-      </w:pPr>
-      <w:r>
-        <w:t xml:space="preserve">Conclusions</w:t>
-      </w:r>
-    </w:p>
-    <w:p>
-      <w:pPr>
-        <w:pStyle w:val="FirstParagraph"/>
-      </w:pPr>
-      <w:r>
-        <w:t xml:space="preserve">IS-API version 0.3.0 provides a practical and efficient tool for cross-study B cell repertoire analysis. By integrating metadata exploration with clone-level statistical queries across multiple databases, it enables researchers to conduct meta-analyses that would otherwise require substantial manual effort in data harmonization and processing. The COVID-19 analysis presented here demonstrates that cross-study approaches can reveal reproducible patterns in repertoire diversity, mutation, and CDR3 characteristics across disease severities — patterns that are consistent with known immunological mechanisms but are strengthened by the larger sample sizes achievable through data integration.</w:t>
-      </w:r>
-    </w:p>
-    <w:p>
-      <w:pPr>
-        <w:pStyle w:val="BodyText"/>
-      </w:pPr>
-      <w:r>
-        <w:t xml:space="preserve">The tool and its cross-study analytical framework can be applied to any disease context where multiple AIRR-seq datasets are available, providing a template for systematic repertoire comparison. Future development will focus on expanding the range of statistical endpoints, improving scalability, and integrating with the broader AIRR Data Commons ecosystem to maximize the utility of the growing body of immune repertoire sequencing data.</w:t>
-      </w:r>
-    </w:p>
-    <w:bookmarkEnd w:id="55"/>
-    <w:bookmarkEnd w:id="56"/>
-    <w:bookmarkStart w:id="57" w:name="references"/>
-    <w:p>
-      <w:pPr>
-        <w:pStyle w:val="Heading1"/>
-      </w:pPr>
-      <w:r>
         <w:t xml:space="preserve">References</w:t>
       </w:r>
     </w:p>
@@ -3796,7 +4047,7 @@
       <w:pPr>
         <w:numPr>
           <w:ilvl w:val="0"/>
-          <w:numId w:val="1012"/>
+          <w:numId w:val="1013"/>
         </w:numPr>
       </w:pPr>
       <w:r>
@@ -3820,7 +4071,7 @@
       <w:pPr>
         <w:numPr>
           <w:ilvl w:val="0"/>
-          <w:numId w:val="1012"/>
+          <w:numId w:val="1013"/>
         </w:numPr>
       </w:pPr>
       <w:r>
@@ -3844,7 +4095,7 @@
       <w:pPr>
         <w:numPr>
           <w:ilvl w:val="0"/>
-          <w:numId w:val="1012"/>
+          <w:numId w:val="1013"/>
         </w:numPr>
       </w:pPr>
       <w:r>
@@ -3868,7 +4119,7 @@
       <w:pPr>
         <w:numPr>
           <w:ilvl w:val="0"/>
-          <w:numId w:val="1012"/>
+          <w:numId w:val="1013"/>
         </w:numPr>
       </w:pPr>
       <w:r>
@@ -3892,7 +4143,7 @@
       <w:pPr>
         <w:numPr>
           <w:ilvl w:val="0"/>
-          <w:numId w:val="1012"/>
+          <w:numId w:val="1013"/>
         </w:numPr>
       </w:pPr>
       <w:r>
@@ -3916,7 +4167,7 @@
       <w:pPr>
         <w:numPr>
           <w:ilvl w:val="0"/>
-          <w:numId w:val="1012"/>
+          <w:numId w:val="1013"/>
         </w:numPr>
       </w:pPr>
       <w:r>
@@ -3940,7 +4191,7 @@
       <w:pPr>
         <w:numPr>
           <w:ilvl w:val="0"/>
-          <w:numId w:val="1012"/>
+          <w:numId w:val="1013"/>
         </w:numPr>
       </w:pPr>
       <w:r>
@@ -3964,7 +4215,7 @@
       <w:pPr>
         <w:numPr>
           <w:ilvl w:val="0"/>
-          <w:numId w:val="1012"/>
+          <w:numId w:val="1013"/>
         </w:numPr>
       </w:pPr>
       <w:r>
@@ -3988,7 +4239,7 @@
       <w:pPr>
         <w:numPr>
           <w:ilvl w:val="0"/>
-          <w:numId w:val="1012"/>
+          <w:numId w:val="1013"/>
         </w:numPr>
       </w:pPr>
       <w:r>
@@ -4012,7 +4263,7 @@
       <w:pPr>
         <w:numPr>
           <w:ilvl w:val="0"/>
-          <w:numId w:val="1012"/>
+          <w:numId w:val="1013"/>
         </w:numPr>
       </w:pPr>
       <w:r>
@@ -4036,7 +4287,7 @@
       <w:pPr>
         <w:numPr>
           <w:ilvl w:val="0"/>
-          <w:numId w:val="1012"/>
+          <w:numId w:val="1013"/>
         </w:numPr>
       </w:pPr>
       <w:r>
@@ -4060,7 +4311,7 @@
       <w:pPr>
         <w:numPr>
           <w:ilvl w:val="0"/>
-          <w:numId w:val="1012"/>
+          <w:numId w:val="1013"/>
         </w:numPr>
       </w:pPr>
       <w:r>
@@ -4084,7 +4335,7 @@
       <w:pPr>
         <w:numPr>
           <w:ilvl w:val="0"/>
-          <w:numId w:val="1012"/>
+          <w:numId w:val="1013"/>
         </w:numPr>
       </w:pPr>
       <w:r>
@@ -4108,7 +4359,7 @@
       <w:pPr>
         <w:numPr>
           <w:ilvl w:val="0"/>
-          <w:numId w:val="1012"/>
+          <w:numId w:val="1013"/>
         </w:numPr>
       </w:pPr>
       <w:r>
@@ -4132,7 +4383,7 @@
       <w:pPr>
         <w:numPr>
           <w:ilvl w:val="0"/>
-          <w:numId w:val="1012"/>
+          <w:numId w:val="1013"/>
         </w:numPr>
       </w:pPr>
       <w:r>
@@ -4156,7 +4407,7 @@
       <w:pPr>
         <w:numPr>
           <w:ilvl w:val="0"/>
-          <w:numId w:val="1012"/>
+          <w:numId w:val="1013"/>
         </w:numPr>
       </w:pPr>
       <w:r>
@@ -4180,7 +4431,7 @@
       <w:pPr>
         <w:numPr>
           <w:ilvl w:val="0"/>
-          <w:numId w:val="1012"/>
+          <w:numId w:val="1013"/>
         </w:numPr>
       </w:pPr>
       <w:r>
@@ -4191,7 +4442,7 @@
       <w:pPr>
         <w:numPr>
           <w:ilvl w:val="0"/>
-          <w:numId w:val="1012"/>
+          <w:numId w:val="1013"/>
         </w:numPr>
       </w:pPr>
       <w:r>
@@ -4215,7 +4466,7 @@
       <w:pPr>
         <w:numPr>
           <w:ilvl w:val="0"/>
-          <w:numId w:val="1012"/>
+          <w:numId w:val="1013"/>
         </w:numPr>
       </w:pPr>
       <w:r>
@@ -4239,7 +4490,7 @@
       <w:pPr>
         <w:numPr>
           <w:ilvl w:val="0"/>
-          <w:numId w:val="1012"/>
+          <w:numId w:val="1013"/>
         </w:numPr>
       </w:pPr>
       <w:r>
@@ -4263,7 +4514,7 @@
       <w:pPr>
         <w:numPr>
           <w:ilvl w:val="0"/>
-          <w:numId w:val="1012"/>
+          <w:numId w:val="1013"/>
         </w:numPr>
       </w:pPr>
       <w:r>
@@ -4287,7 +4538,7 @@
       <w:pPr>
         <w:numPr>
           <w:ilvl w:val="0"/>
-          <w:numId w:val="1012"/>
+          <w:numId w:val="1013"/>
         </w:numPr>
       </w:pPr>
       <w:r>
@@ -4311,7 +4562,7 @@
       <w:pPr>
         <w:numPr>
           <w:ilvl w:val="0"/>
-          <w:numId w:val="1012"/>
+          <w:numId w:val="1013"/>
         </w:numPr>
       </w:pPr>
       <w:r>
@@ -4335,7 +4586,7 @@
       <w:pPr>
         <w:numPr>
           <w:ilvl w:val="0"/>
-          <w:numId w:val="1012"/>
+          <w:numId w:val="1013"/>
         </w:numPr>
       </w:pPr>
       <w:r>
@@ -4359,7 +4610,7 @@
       <w:pPr>
         <w:numPr>
           <w:ilvl w:val="0"/>
-          <w:numId w:val="1012"/>
+          <w:numId w:val="1013"/>
         </w:numPr>
       </w:pPr>
       <w:r>
@@ -4383,7 +4634,7 @@
       <w:pPr>
         <w:numPr>
           <w:ilvl w:val="0"/>
-          <w:numId w:val="1012"/>
+          <w:numId w:val="1013"/>
         </w:numPr>
       </w:pPr>
       <w:r>
@@ -4407,7 +4658,7 @@
       <w:pPr>
         <w:numPr>
           <w:ilvl w:val="0"/>
-          <w:numId w:val="1012"/>
+          <w:numId w:val="1013"/>
         </w:numPr>
       </w:pPr>
       <w:r>
@@ -4431,7 +4682,7 @@
       <w:pPr>
         <w:numPr>
           <w:ilvl w:val="0"/>
-          <w:numId w:val="1012"/>
+          <w:numId w:val="1013"/>
         </w:numPr>
       </w:pPr>
       <w:r>
@@ -4455,7 +4706,7 @@
       <w:pPr>
         <w:numPr>
           <w:ilvl w:val="0"/>
-          <w:numId w:val="1012"/>
+          <w:numId w:val="1013"/>
         </w:numPr>
       </w:pPr>
       <w:r>
@@ -4479,7 +4730,7 @@
       <w:pPr>
         <w:numPr>
           <w:ilvl w:val="0"/>
-          <w:numId w:val="1012"/>
+          <w:numId w:val="1013"/>
         </w:numPr>
       </w:pPr>
       <w:r>
@@ -4503,7 +4754,7 @@
       <w:pPr>
         <w:numPr>
           <w:ilvl w:val="0"/>
-          <w:numId w:val="1012"/>
+          <w:numId w:val="1013"/>
         </w:numPr>
       </w:pPr>
       <w:r>
@@ -4527,7 +4778,7 @@
       <w:pPr>
         <w:numPr>
           <w:ilvl w:val="0"/>
-          <w:numId w:val="1012"/>
+          <w:numId w:val="1013"/>
         </w:numPr>
       </w:pPr>
       <w:r>
@@ -4551,7 +4802,7 @@
       <w:pPr>
         <w:numPr>
           <w:ilvl w:val="0"/>
-          <w:numId w:val="1012"/>
+          <w:numId w:val="1013"/>
         </w:numPr>
       </w:pPr>
       <w:r>
@@ -4575,7 +4826,7 @@
       <w:pPr>
         <w:numPr>
           <w:ilvl w:val="0"/>
-          <w:numId w:val="1012"/>
+          <w:numId w:val="1013"/>
         </w:numPr>
       </w:pPr>
       <w:r>
@@ -4599,7 +4850,7 @@
       <w:pPr>
         <w:numPr>
           <w:ilvl w:val="0"/>
-          <w:numId w:val="1012"/>
+          <w:numId w:val="1013"/>
         </w:numPr>
       </w:pPr>
       <w:r>
@@ -4623,7 +4874,7 @@
       <w:pPr>
         <w:numPr>
           <w:ilvl w:val="0"/>
-          <w:numId w:val="1012"/>
+          <w:numId w:val="1013"/>
         </w:numPr>
       </w:pPr>
       <w:r>
@@ -4647,7 +4898,7 @@
       <w:pPr>
         <w:numPr>
           <w:ilvl w:val="0"/>
-          <w:numId w:val="1012"/>
+          <w:numId w:val="1013"/>
         </w:numPr>
       </w:pPr>
       <w:r>
@@ -4671,7 +4922,7 @@
       <w:pPr>
         <w:numPr>
           <w:ilvl w:val="0"/>
-          <w:numId w:val="1012"/>
+          <w:numId w:val="1013"/>
         </w:numPr>
       </w:pPr>
       <w:r>
@@ -4695,7 +4946,7 @@
       <w:pPr>
         <w:numPr>
           <w:ilvl w:val="0"/>
-          <w:numId w:val="1012"/>
+          <w:numId w:val="1013"/>
         </w:numPr>
       </w:pPr>
       <w:r>
@@ -4719,7 +4970,7 @@
       <w:pPr>
         <w:numPr>
           <w:ilvl w:val="0"/>
-          <w:numId w:val="1012"/>
+          <w:numId w:val="1013"/>
         </w:numPr>
       </w:pPr>
       <w:r>
@@ -4743,7 +4994,7 @@
       <w:pPr>
         <w:numPr>
           <w:ilvl w:val="0"/>
-          <w:numId w:val="1012"/>
+          <w:numId w:val="1013"/>
         </w:numPr>
       </w:pPr>
       <w:r>
@@ -4767,7 +5018,7 @@
       <w:pPr>
         <w:numPr>
           <w:ilvl w:val="0"/>
-          <w:numId w:val="1012"/>
+          <w:numId w:val="1013"/>
         </w:numPr>
       </w:pPr>
       <w:r>
@@ -4791,7 +5042,7 @@
       <w:pPr>
         <w:numPr>
           <w:ilvl w:val="0"/>
-          <w:numId w:val="1012"/>
+          <w:numId w:val="1013"/>
         </w:numPr>
       </w:pPr>
       <w:r>
@@ -4815,7 +5066,7 @@
       <w:pPr>
         <w:numPr>
           <w:ilvl w:val="0"/>
-          <w:numId w:val="1012"/>
+          <w:numId w:val="1013"/>
         </w:numPr>
       </w:pPr>
       <w:r>
@@ -4839,7 +5090,7 @@
       <w:pPr>
         <w:numPr>
           <w:ilvl w:val="0"/>
-          <w:numId w:val="1012"/>
+          <w:numId w:val="1013"/>
         </w:numPr>
       </w:pPr>
       <w:r>
@@ -4863,7 +5114,7 @@
       <w:pPr>
         <w:numPr>
           <w:ilvl w:val="0"/>
-          <w:numId w:val="1012"/>
+          <w:numId w:val="1013"/>
         </w:numPr>
       </w:pPr>
       <w:r>
@@ -4887,7 +5138,7 @@
       <w:pPr>
         <w:numPr>
           <w:ilvl w:val="0"/>
-          <w:numId w:val="1012"/>
+          <w:numId w:val="1013"/>
         </w:numPr>
       </w:pPr>
       <w:r>
@@ -4911,7 +5162,7 @@
       <w:pPr>
         <w:numPr>
           <w:ilvl w:val="0"/>
-          <w:numId w:val="1012"/>
+          <w:numId w:val="1013"/>
         </w:numPr>
       </w:pPr>
       <w:r>
@@ -4931,7 +5182,7 @@
         <w:t xml:space="preserve">. https://github.com/nf-core/airrflow</w:t>
       </w:r>
     </w:p>
-    <w:bookmarkEnd w:id="57"/>
+    <w:bookmarkEnd w:id="59"/>
     <w:sectPr/>
   </w:body>
 </w:document>
@@ -5456,6 +5707,9 @@
     </w:lvlOverride>
   </w:num>
   <w:num w:numId="1012">
+    <w:abstractNumId w:val="991"/>
+  </w:num>
+  <w:num w:numId="1013">
     <w:abstractNumId w:val="99411"/>
     <w:lvlOverride w:ilvl="0">
       <w:startOverride w:val="1"/>

</xml_diff>

<commit_message>
Add datasets table with PMIDs to Materials and Methods
Replaced bullet-point dataset list with a proper table (Table 1) including
Study ID, description, N individuals, PMID, and reference for all 7 datasets.

Co-Authored-By: Claude Opus 4.6 <noreply@anthropic.com>
Claude-Session: https://claude.ai/code/session_01D55fsgxxDUfDTuPfRhF34U
</commit_message>
<xml_diff>
--- a/thesis/thesis.docx
+++ b/thesis/thesis.docx
@@ -1633,137 +1633,536 @@
     </w:p>
     <w:p>
       <w:pPr>
-        <w:numPr>
-          <w:ilvl w:val="0"/>
-          <w:numId w:val="1003"/>
-        </w:numPr>
-        <w:pStyle w:val="Compact"/>
-      </w:pPr>
-      <w:r>
-        <w:rPr>
-          <w:bCs/>
-          <w:b/>
-        </w:rPr>
-        <w:t xml:space="preserve">CD1</w:t>
-      </w:r>
-      <w:r>
-        <w:t xml:space="preserve">: 51 individuals with severe, mild, and moderate COVID-19 from multiple hospital cohorts [29, 30].</w:t>
-      </w:r>
-    </w:p>
-    <w:p>
-      <w:pPr>
-        <w:numPr>
-          <w:ilvl w:val="0"/>
-          <w:numId w:val="1003"/>
-        </w:numPr>
-        <w:pStyle w:val="Compact"/>
-      </w:pPr>
-      <w:r>
-        <w:rPr>
-          <w:bCs/>
-          <w:b/>
-        </w:rPr>
-        <w:t xml:space="preserve">CD2</w:t>
-      </w:r>
-      <w:r>
-        <w:t xml:space="preserve">: 19 individuals including severe, non-severe, recovered, and healthy individuals [31].</w:t>
-      </w:r>
-    </w:p>
-    <w:p>
-      <w:pPr>
-        <w:numPr>
-          <w:ilvl w:val="0"/>
-          <w:numId w:val="1003"/>
-        </w:numPr>
-        <w:pStyle w:val="Compact"/>
-      </w:pPr>
-      <w:r>
-        <w:rPr>
-          <w:bCs/>
-          <w:b/>
-        </w:rPr>
-        <w:t xml:space="preserve">CD3</w:t>
-      </w:r>
-      <w:r>
-        <w:t xml:space="preserve">: 13 individuals with severe COVID-19 and healthy controls [32].</w:t>
-      </w:r>
-    </w:p>
-    <w:p>
-      <w:pPr>
-        <w:numPr>
-          <w:ilvl w:val="0"/>
-          <w:numId w:val="1003"/>
-        </w:numPr>
-        <w:pStyle w:val="Compact"/>
-      </w:pPr>
-      <w:r>
-        <w:rPr>
-          <w:bCs/>
-          <w:b/>
-        </w:rPr>
-        <w:t xml:space="preserve">CVX1</w:t>
-      </w:r>
-      <w:r>
-        <w:t xml:space="preserve">: 12 individuals from a COVID-19 mRNA vaccine study, including COVID-recovered vaccinees and COVID-naive vaccinees [33].</w:t>
-      </w:r>
-    </w:p>
-    <w:p>
-      <w:pPr>
-        <w:numPr>
-          <w:ilvl w:val="0"/>
-          <w:numId w:val="1003"/>
-        </w:numPr>
-        <w:pStyle w:val="Compact"/>
-      </w:pPr>
-      <w:r>
-        <w:rPr>
-          <w:bCs/>
-          <w:b/>
-        </w:rPr>
-        <w:t xml:space="preserve">CVX2</w:t>
-      </w:r>
-      <w:r>
-        <w:t xml:space="preserve">: 5 individuals from a second vaccine cohort with recovered individuals.</w:t>
-      </w:r>
-    </w:p>
-    <w:p>
-      <w:pPr>
-        <w:numPr>
-          <w:ilvl w:val="0"/>
-          <w:numId w:val="1003"/>
-        </w:numPr>
-        <w:pStyle w:val="Compact"/>
-      </w:pPr>
-      <w:r>
-        <w:rPr>
-          <w:bCs/>
-          <w:b/>
-        </w:rPr>
-        <w:t xml:space="preserve">HC1</w:t>
-      </w:r>
-      <w:r>
-        <w:t xml:space="preserve">: 6 healthy control individuals (deceased organ donors) with no history of COVID-19 or vaccination [34].</w:t>
-      </w:r>
-    </w:p>
-    <w:p>
-      <w:pPr>
-        <w:numPr>
-          <w:ilvl w:val="0"/>
-          <w:numId w:val="1003"/>
-        </w:numPr>
-        <w:pStyle w:val="Compact"/>
-      </w:pPr>
-      <w:r>
-        <w:rPr>
-          <w:bCs/>
-          <w:b/>
-        </w:rPr>
-        <w:t xml:space="preserve">GT1</w:t>
-      </w:r>
-      <w:r>
-        <w:t xml:space="preserve">: 7 pediatric gut transplant recipients [47].</w:t>
-      </w:r>
-    </w:p>
+        <w:pStyle w:val="BodyText"/>
+      </w:pPr>
+      <w:r>
+        <w:rPr>
+          <w:bCs/>
+          <w:b/>
+        </w:rPr>
+        <w:t xml:space="preserve">Table 1.</w:t>
+      </w:r>
+      <w:r>
+        <w:t xml:space="preserve"> </w:t>
+      </w:r>
+      <w:r>
+        <w:t xml:space="preserve">Datasets available through IS-API v0.3.0.</w:t>
+      </w:r>
+    </w:p>
+    <w:tbl>
+      <w:tblPr>
+        <w:tblStyle w:val="Table"/>
+        <w:tblW w:type="pct" w:w="5000"/>
+        <w:tblLook w:firstRow="1" w:lastRow="0" w:firstColumn="0" w:lastColumn="0" w:noHBand="0" w:noVBand="0" w:val="0020"/>
+        <w:jc w:val="start"/>
+      </w:tblPr>
+      <w:tblGrid>
+        <w:gridCol w:w="1584"/>
+        <w:gridCol w:w="1584"/>
+        <w:gridCol w:w="1584"/>
+        <w:gridCol w:w="1584"/>
+        <w:gridCol w:w="1584"/>
+      </w:tblGrid>
+      <w:tr>
+        <w:trPr>
+          <w:tblHeader w:val="true"/>
+        </w:trPr>
+        <w:tc>
+          <w:tcPr/>
+          <w:p>
+            <w:pPr>
+              <w:pStyle w:val="Compact"/>
+              <w:jc w:val="left"/>
+            </w:pPr>
+            <w:r>
+              <w:t xml:space="preserve">Study ID</w:t>
+            </w:r>
+          </w:p>
+        </w:tc>
+        <w:tc>
+          <w:tcPr/>
+          <w:p>
+            <w:pPr>
+              <w:pStyle w:val="Compact"/>
+              <w:jc w:val="left"/>
+            </w:pPr>
+            <w:r>
+              <w:t xml:space="preserve">Description</w:t>
+            </w:r>
+          </w:p>
+        </w:tc>
+        <w:tc>
+          <w:tcPr/>
+          <w:p>
+            <w:pPr>
+              <w:pStyle w:val="Compact"/>
+              <w:jc w:val="left"/>
+            </w:pPr>
+            <w:r>
+              <w:t xml:space="preserve">N</w:t>
+            </w:r>
+          </w:p>
+        </w:tc>
+        <w:tc>
+          <w:tcPr/>
+          <w:p>
+            <w:pPr>
+              <w:pStyle w:val="Compact"/>
+              <w:jc w:val="left"/>
+            </w:pPr>
+            <w:r>
+              <w:t xml:space="preserve">PMID</w:t>
+            </w:r>
+          </w:p>
+        </w:tc>
+        <w:tc>
+          <w:tcPr/>
+          <w:p>
+            <w:pPr>
+              <w:pStyle w:val="Compact"/>
+              <w:jc w:val="left"/>
+            </w:pPr>
+            <w:r>
+              <w:t xml:space="preserve">Ref</w:t>
+            </w:r>
+          </w:p>
+        </w:tc>
+      </w:tr>
+      <w:tr>
+        <w:tc>
+          <w:tcPr/>
+          <w:p>
+            <w:pPr>
+              <w:pStyle w:val="Compact"/>
+              <w:jc w:val="left"/>
+            </w:pPr>
+            <w:r>
+              <w:t xml:space="preserve">CD1</w:t>
+            </w:r>
+          </w:p>
+        </w:tc>
+        <w:tc>
+          <w:tcPr/>
+          <w:p>
+            <w:pPr>
+              <w:pStyle w:val="Compact"/>
+              <w:jc w:val="left"/>
+            </w:pPr>
+            <w:r>
+              <w:t xml:space="preserve">Severe, mild, and moderate COVID-19 from multiple hospital cohorts</w:t>
+            </w:r>
+          </w:p>
+        </w:tc>
+        <w:tc>
+          <w:tcPr/>
+          <w:p>
+            <w:pPr>
+              <w:pStyle w:val="Compact"/>
+              <w:jc w:val="left"/>
+            </w:pPr>
+            <w:r>
+              <w:t xml:space="preserve">51</w:t>
+            </w:r>
+          </w:p>
+        </w:tc>
+        <w:tc>
+          <w:tcPr/>
+          <w:p>
+            <w:pPr>
+              <w:pStyle w:val="Compact"/>
+              <w:jc w:val="left"/>
+            </w:pPr>
+            <w:r>
+              <w:t xml:space="preserve">37153628</w:t>
+            </w:r>
+          </w:p>
+        </w:tc>
+        <w:tc>
+          <w:tcPr/>
+          <w:p>
+            <w:pPr>
+              <w:pStyle w:val="Compact"/>
+              <w:jc w:val="left"/>
+            </w:pPr>
+            <w:r>
+              <w:t xml:space="preserve">[29, 30]</w:t>
+            </w:r>
+          </w:p>
+        </w:tc>
+      </w:tr>
+      <w:tr>
+        <w:tc>
+          <w:tcPr/>
+          <w:p>
+            <w:pPr>
+              <w:pStyle w:val="Compact"/>
+              <w:jc w:val="left"/>
+            </w:pPr>
+            <w:r>
+              <w:t xml:space="preserve">CD2</w:t>
+            </w:r>
+          </w:p>
+        </w:tc>
+        <w:tc>
+          <w:tcPr/>
+          <w:p>
+            <w:pPr>
+              <w:pStyle w:val="Compact"/>
+              <w:jc w:val="left"/>
+            </w:pPr>
+            <w:r>
+              <w:t xml:space="preserve">Severe, non-severe, recovered, and healthy individuals</w:t>
+            </w:r>
+          </w:p>
+        </w:tc>
+        <w:tc>
+          <w:tcPr/>
+          <w:p>
+            <w:pPr>
+              <w:pStyle w:val="Compact"/>
+              <w:jc w:val="left"/>
+            </w:pPr>
+            <w:r>
+              <w:t xml:space="preserve">19</w:t>
+            </w:r>
+          </w:p>
+        </w:tc>
+        <w:tc>
+          <w:tcPr/>
+          <w:p>
+            <w:pPr>
+              <w:pStyle w:val="Compact"/>
+              <w:jc w:val="left"/>
+            </w:pPr>
+            <w:r>
+              <w:t xml:space="preserve">33384691</w:t>
+            </w:r>
+          </w:p>
+        </w:tc>
+        <w:tc>
+          <w:tcPr/>
+          <w:p>
+            <w:pPr>
+              <w:pStyle w:val="Compact"/>
+              <w:jc w:val="left"/>
+            </w:pPr>
+            <w:r>
+              <w:t xml:space="preserve">[31]</w:t>
+            </w:r>
+          </w:p>
+        </w:tc>
+      </w:tr>
+      <w:tr>
+        <w:tc>
+          <w:tcPr/>
+          <w:p>
+            <w:pPr>
+              <w:pStyle w:val="Compact"/>
+              <w:jc w:val="left"/>
+            </w:pPr>
+            <w:r>
+              <w:t xml:space="preserve">CD3</w:t>
+            </w:r>
+          </w:p>
+        </w:tc>
+        <w:tc>
+          <w:tcPr/>
+          <w:p>
+            <w:pPr>
+              <w:pStyle w:val="Compact"/>
+              <w:jc w:val="left"/>
+            </w:pPr>
+            <w:r>
+              <w:t xml:space="preserve">Severe COVID-19 and healthy controls</w:t>
+            </w:r>
+          </w:p>
+        </w:tc>
+        <w:tc>
+          <w:tcPr/>
+          <w:p>
+            <w:pPr>
+              <w:pStyle w:val="Compact"/>
+              <w:jc w:val="left"/>
+            </w:pPr>
+            <w:r>
+              <w:t xml:space="preserve">13</w:t>
+            </w:r>
+          </w:p>
+        </w:tc>
+        <w:tc>
+          <w:tcPr/>
+          <w:p>
+            <w:pPr>
+              <w:pStyle w:val="Compact"/>
+              <w:jc w:val="left"/>
+            </w:pPr>
+            <w:r>
+              <w:t xml:space="preserve">32669287</w:t>
+            </w:r>
+          </w:p>
+        </w:tc>
+        <w:tc>
+          <w:tcPr/>
+          <w:p>
+            <w:pPr>
+              <w:pStyle w:val="Compact"/>
+              <w:jc w:val="left"/>
+            </w:pPr>
+            <w:r>
+              <w:t xml:space="preserve">[32]</w:t>
+            </w:r>
+          </w:p>
+        </w:tc>
+      </w:tr>
+      <w:tr>
+        <w:tc>
+          <w:tcPr/>
+          <w:p>
+            <w:pPr>
+              <w:pStyle w:val="Compact"/>
+              <w:jc w:val="left"/>
+            </w:pPr>
+            <w:r>
+              <w:t xml:space="preserve">CVX1</w:t>
+            </w:r>
+          </w:p>
+        </w:tc>
+        <w:tc>
+          <w:tcPr/>
+          <w:p>
+            <w:pPr>
+              <w:pStyle w:val="Compact"/>
+              <w:jc w:val="left"/>
+            </w:pPr>
+            <w:r>
+              <w:t xml:space="preserve">COVID-19 mRNA vaccine study (recovered and naive vaccinees)</w:t>
+            </w:r>
+          </w:p>
+        </w:tc>
+        <w:tc>
+          <w:tcPr/>
+          <w:p>
+            <w:pPr>
+              <w:pStyle w:val="Compact"/>
+              <w:jc w:val="left"/>
+            </w:pPr>
+            <w:r>
+              <w:t xml:space="preserve">12</w:t>
+            </w:r>
+          </w:p>
+        </w:tc>
+        <w:tc>
+          <w:tcPr/>
+          <w:p>
+            <w:pPr>
+              <w:pStyle w:val="Compact"/>
+              <w:jc w:val="left"/>
+            </w:pPr>
+            <w:r>
+              <w:t xml:space="preserve">34648302</w:t>
+            </w:r>
+          </w:p>
+        </w:tc>
+        <w:tc>
+          <w:tcPr/>
+          <w:p>
+            <w:pPr>
+              <w:pStyle w:val="Compact"/>
+              <w:jc w:val="left"/>
+            </w:pPr>
+            <w:r>
+              <w:t xml:space="preserve">[33]</w:t>
+            </w:r>
+          </w:p>
+        </w:tc>
+      </w:tr>
+      <w:tr>
+        <w:tc>
+          <w:tcPr/>
+          <w:p>
+            <w:pPr>
+              <w:pStyle w:val="Compact"/>
+              <w:jc w:val="left"/>
+            </w:pPr>
+            <w:r>
+              <w:t xml:space="preserve">CVX2</w:t>
+            </w:r>
+          </w:p>
+        </w:tc>
+        <w:tc>
+          <w:tcPr/>
+          <w:p>
+            <w:pPr>
+              <w:pStyle w:val="Compact"/>
+              <w:jc w:val="left"/>
+            </w:pPr>
+            <w:r>
+              <w:t xml:space="preserve">Second vaccine cohort with recovered individuals</w:t>
+            </w:r>
+          </w:p>
+        </w:tc>
+        <w:tc>
+          <w:tcPr/>
+          <w:p>
+            <w:pPr>
+              <w:pStyle w:val="Compact"/>
+              <w:jc w:val="left"/>
+            </w:pPr>
+            <w:r>
+              <w:t xml:space="preserve">5</w:t>
+            </w:r>
+          </w:p>
+        </w:tc>
+        <w:tc>
+          <w:tcPr/>
+          <w:p>
+            <w:pPr>
+              <w:pStyle w:val="Compact"/>
+              <w:jc w:val="left"/>
+            </w:pPr>
+            <w:r>
+              <w:t xml:space="preserve">33858945</w:t>
+            </w:r>
+          </w:p>
+        </w:tc>
+        <w:tc>
+          <w:tcPr/>
+          <w:p>
+            <w:pPr>
+              <w:pStyle w:val="Compact"/>
+              <w:jc w:val="left"/>
+            </w:pPr>
+            <w:r>
+              <w:t xml:space="preserve">—</w:t>
+            </w:r>
+          </w:p>
+        </w:tc>
+      </w:tr>
+      <w:tr>
+        <w:tc>
+          <w:tcPr/>
+          <w:p>
+            <w:pPr>
+              <w:pStyle w:val="Compact"/>
+              <w:jc w:val="left"/>
+            </w:pPr>
+            <w:r>
+              <w:t xml:space="preserve">HC1</w:t>
+            </w:r>
+          </w:p>
+        </w:tc>
+        <w:tc>
+          <w:tcPr/>
+          <w:p>
+            <w:pPr>
+              <w:pStyle w:val="Compact"/>
+              <w:jc w:val="left"/>
+            </w:pPr>
+            <w:r>
+              <w:t xml:space="preserve">Healthy control organ donors, no COVID-19 or vaccination</w:t>
+            </w:r>
+          </w:p>
+        </w:tc>
+        <w:tc>
+          <w:tcPr/>
+          <w:p>
+            <w:pPr>
+              <w:pStyle w:val="Compact"/>
+              <w:jc w:val="left"/>
+            </w:pPr>
+            <w:r>
+              <w:t xml:space="preserve">6</w:t>
+            </w:r>
+          </w:p>
+        </w:tc>
+        <w:tc>
+          <w:tcPr/>
+          <w:p>
+            <w:pPr>
+              <w:pStyle w:val="Compact"/>
+              <w:jc w:val="left"/>
+            </w:pPr>
+            <w:r>
+              <w:t xml:space="preserve">28829438</w:t>
+            </w:r>
+          </w:p>
+        </w:tc>
+        <w:tc>
+          <w:tcPr/>
+          <w:p>
+            <w:pPr>
+              <w:pStyle w:val="Compact"/>
+              <w:jc w:val="left"/>
+            </w:pPr>
+            <w:r>
+              <w:t xml:space="preserve">[34]</w:t>
+            </w:r>
+          </w:p>
+        </w:tc>
+      </w:tr>
+      <w:tr>
+        <w:tc>
+          <w:tcPr/>
+          <w:p>
+            <w:pPr>
+              <w:pStyle w:val="Compact"/>
+              <w:jc w:val="left"/>
+            </w:pPr>
+            <w:r>
+              <w:t xml:space="preserve">GT1</w:t>
+            </w:r>
+          </w:p>
+        </w:tc>
+        <w:tc>
+          <w:tcPr/>
+          <w:p>
+            <w:pPr>
+              <w:pStyle w:val="Compact"/>
+              <w:jc w:val="left"/>
+            </w:pPr>
+            <w:r>
+              <w:t xml:space="preserve">Pediatric gut transplant recipients</w:t>
+            </w:r>
+          </w:p>
+        </w:tc>
+        <w:tc>
+          <w:tcPr/>
+          <w:p>
+            <w:pPr>
+              <w:pStyle w:val="Compact"/>
+              <w:jc w:val="left"/>
+            </w:pPr>
+            <w:r>
+              <w:t xml:space="preserve">7</w:t>
+            </w:r>
+          </w:p>
+        </w:tc>
+        <w:tc>
+          <w:tcPr/>
+          <w:p>
+            <w:pPr>
+              <w:pStyle w:val="Compact"/>
+              <w:jc w:val="left"/>
+            </w:pPr>
+            <w:r>
+              <w:t xml:space="preserve">38014202</w:t>
+            </w:r>
+          </w:p>
+        </w:tc>
+        <w:tc>
+          <w:tcPr/>
+          <w:p>
+            <w:pPr>
+              <w:pStyle w:val="Compact"/>
+              <w:jc w:val="left"/>
+            </w:pPr>
+            <w:r>
+              <w:t xml:space="preserve">[47]</w:t>
+            </w:r>
+          </w:p>
+        </w:tc>
+      </w:tr>
+    </w:tbl>
     <w:bookmarkEnd w:id="32"/>
     <w:bookmarkStart w:id="33" w:name="individual-selection-and-exclusions"/>
     <w:p>
@@ -1830,7 +2229,7 @@
       <w:pPr>
         <w:numPr>
           <w:ilvl w:val="0"/>
-          <w:numId w:val="1004"/>
+          <w:numId w:val="1003"/>
         </w:numPr>
         <w:pStyle w:val="Compact"/>
       </w:pPr>
@@ -1876,7 +2275,7 @@
       <w:pPr>
         <w:numPr>
           <w:ilvl w:val="0"/>
-          <w:numId w:val="1004"/>
+          <w:numId w:val="1003"/>
         </w:numPr>
         <w:pStyle w:val="Compact"/>
       </w:pPr>
@@ -1922,7 +2321,7 @@
       <w:pPr>
         <w:numPr>
           <w:ilvl w:val="0"/>
-          <w:numId w:val="1004"/>
+          <w:numId w:val="1003"/>
         </w:numPr>
         <w:pStyle w:val="Compact"/>
       </w:pPr>
@@ -1968,7 +2367,7 @@
       <w:pPr>
         <w:numPr>
           <w:ilvl w:val="0"/>
-          <w:numId w:val="1004"/>
+          <w:numId w:val="1003"/>
         </w:numPr>
         <w:pStyle w:val="Compact"/>
       </w:pPr>
@@ -2059,7 +2458,7 @@
       <w:pPr>
         <w:numPr>
           <w:ilvl w:val="0"/>
-          <w:numId w:val="1004"/>
+          <w:numId w:val="1003"/>
         </w:numPr>
         <w:pStyle w:val="Compact"/>
       </w:pPr>
@@ -2096,7 +2495,7 @@
       <w:pPr>
         <w:numPr>
           <w:ilvl w:val="0"/>
-          <w:numId w:val="1004"/>
+          <w:numId w:val="1003"/>
         </w:numPr>
         <w:pStyle w:val="Compact"/>
       </w:pPr>
@@ -2226,6 +2625,52 @@
       <w:pPr>
         <w:numPr>
           <w:ilvl w:val="0"/>
+          <w:numId w:val="1004"/>
+        </w:numPr>
+        <w:pStyle w:val="Compact"/>
+      </w:pPr>
+      <w:r>
+        <w:rPr>
+          <w:bCs/>
+          <w:b/>
+        </w:rPr>
+        <w:t xml:space="preserve">repertoires</w:t>
+      </w:r>
+      <w:r>
+        <w:t xml:space="preserve">: specifies the metadata filters (e.g., disease_stage, tissue, sex, age)</w:t>
+      </w:r>
+    </w:p>
+    <w:p>
+      <w:pPr>
+        <w:numPr>
+          <w:ilvl w:val="0"/>
+          <w:numId w:val="1004"/>
+        </w:numPr>
+        <w:pStyle w:val="Compact"/>
+      </w:pPr>
+      <w:r>
+        <w:rPr>
+          <w:bCs/>
+          <w:b/>
+        </w:rPr>
+        <w:t xml:space="preserve">statistics</w:t>
+      </w:r>
+      <w:r>
+        <w:t xml:space="preserve">: specifies the statistical measure of interest</w:t>
+      </w:r>
+    </w:p>
+    <w:p>
+      <w:pPr>
+        <w:pStyle w:val="FirstParagraph"/>
+      </w:pPr>
+      <w:r>
+        <w:t xml:space="preserve">The response contains:</w:t>
+      </w:r>
+    </w:p>
+    <w:p>
+      <w:pPr>
+        <w:numPr>
+          <w:ilvl w:val="0"/>
           <w:numId w:val="1005"/>
         </w:numPr>
         <w:pStyle w:val="Compact"/>
@@ -2235,10 +2680,10 @@
           <w:bCs/>
           <w:b/>
         </w:rPr>
-        <w:t xml:space="preserve">repertoires</w:t>
-      </w:r>
-      <w:r>
-        <w:t xml:space="preserve">: specifies the metadata filters (e.g., disease_stage, tissue, sex, age)</w:t>
+        <w:t xml:space="preserve">Info</w:t>
+      </w:r>
+      <w:r>
+        <w:t xml:space="preserve">: project information (title, version, contacts)</w:t>
       </w:r>
     </w:p>
     <w:p>
@@ -2246,52 +2691,6 @@
         <w:numPr>
           <w:ilvl w:val="0"/>
           <w:numId w:val="1005"/>
-        </w:numPr>
-        <w:pStyle w:val="Compact"/>
-      </w:pPr>
-      <w:r>
-        <w:rPr>
-          <w:bCs/>
-          <w:b/>
-        </w:rPr>
-        <w:t xml:space="preserve">statistics</w:t>
-      </w:r>
-      <w:r>
-        <w:t xml:space="preserve">: specifies the statistical measure of interest</w:t>
-      </w:r>
-    </w:p>
-    <w:p>
-      <w:pPr>
-        <w:pStyle w:val="FirstParagraph"/>
-      </w:pPr>
-      <w:r>
-        <w:t xml:space="preserve">The response contains:</w:t>
-      </w:r>
-    </w:p>
-    <w:p>
-      <w:pPr>
-        <w:numPr>
-          <w:ilvl w:val="0"/>
-          <w:numId w:val="1006"/>
-        </w:numPr>
-        <w:pStyle w:val="Compact"/>
-      </w:pPr>
-      <w:r>
-        <w:rPr>
-          <w:bCs/>
-          <w:b/>
-        </w:rPr>
-        <w:t xml:space="preserve">Info</w:t>
-      </w:r>
-      <w:r>
-        <w:t xml:space="preserve">: project information (title, version, contacts)</w:t>
-      </w:r>
-    </w:p>
-    <w:p>
-      <w:pPr>
-        <w:numPr>
-          <w:ilvl w:val="0"/>
-          <w:numId w:val="1006"/>
         </w:numPr>
         <w:pStyle w:val="Compact"/>
       </w:pPr>
@@ -2369,7 +2768,7 @@
       <w:pPr>
         <w:numPr>
           <w:ilvl w:val="0"/>
-          <w:numId w:val="1007"/>
+          <w:numId w:val="1006"/>
         </w:numPr>
         <w:pStyle w:val="Compact"/>
       </w:pPr>
@@ -2388,7 +2787,7 @@
       <w:pPr>
         <w:numPr>
           <w:ilvl w:val="0"/>
-          <w:numId w:val="1007"/>
+          <w:numId w:val="1006"/>
         </w:numPr>
         <w:pStyle w:val="Compact"/>
       </w:pPr>
@@ -2407,7 +2806,7 @@
       <w:pPr>
         <w:numPr>
           <w:ilvl w:val="0"/>
-          <w:numId w:val="1007"/>
+          <w:numId w:val="1006"/>
         </w:numPr>
         <w:pStyle w:val="Compact"/>
       </w:pPr>
@@ -2438,7 +2837,7 @@
       <w:pPr>
         <w:numPr>
           <w:ilvl w:val="0"/>
-          <w:numId w:val="1008"/>
+          <w:numId w:val="1007"/>
         </w:numPr>
         <w:pStyle w:val="Compact"/>
       </w:pPr>
@@ -2457,7 +2856,7 @@
       <w:pPr>
         <w:numPr>
           <w:ilvl w:val="0"/>
-          <w:numId w:val="1008"/>
+          <w:numId w:val="1007"/>
         </w:numPr>
         <w:pStyle w:val="Compact"/>
       </w:pPr>
@@ -2476,7 +2875,7 @@
       <w:pPr>
         <w:numPr>
           <w:ilvl w:val="0"/>
-          <w:numId w:val="1008"/>
+          <w:numId w:val="1007"/>
         </w:numPr>
         <w:pStyle w:val="Compact"/>
       </w:pPr>
@@ -2495,7 +2894,7 @@
       <w:pPr>
         <w:numPr>
           <w:ilvl w:val="0"/>
-          <w:numId w:val="1008"/>
+          <w:numId w:val="1007"/>
         </w:numPr>
         <w:pStyle w:val="Compact"/>
       </w:pPr>
@@ -2526,7 +2925,7 @@
       <w:pPr>
         <w:numPr>
           <w:ilvl w:val="0"/>
-          <w:numId w:val="1009"/>
+          <w:numId w:val="1008"/>
         </w:numPr>
         <w:pStyle w:val="Compact"/>
       </w:pPr>
@@ -2545,7 +2944,7 @@
       <w:pPr>
         <w:numPr>
           <w:ilvl w:val="0"/>
-          <w:numId w:val="1009"/>
+          <w:numId w:val="1008"/>
         </w:numPr>
         <w:pStyle w:val="Compact"/>
       </w:pPr>
@@ -2564,7 +2963,7 @@
       <w:pPr>
         <w:numPr>
           <w:ilvl w:val="0"/>
-          <w:numId w:val="1009"/>
+          <w:numId w:val="1008"/>
         </w:numPr>
         <w:pStyle w:val="Compact"/>
       </w:pPr>
@@ -2595,7 +2994,7 @@
       <w:pPr>
         <w:numPr>
           <w:ilvl w:val="0"/>
-          <w:numId w:val="1010"/>
+          <w:numId w:val="1009"/>
         </w:numPr>
         <w:pStyle w:val="Compact"/>
       </w:pPr>
@@ -2632,7 +3031,7 @@
       <w:pPr>
         <w:numPr>
           <w:ilvl w:val="0"/>
-          <w:numId w:val="1011"/>
+          <w:numId w:val="1010"/>
         </w:numPr>
       </w:pPr>
       <w:r>
@@ -2686,7 +3085,7 @@
       <w:pPr>
         <w:numPr>
           <w:ilvl w:val="0"/>
-          <w:numId w:val="1011"/>
+          <w:numId w:val="1010"/>
         </w:numPr>
       </w:pPr>
       <w:r>
@@ -2704,7 +3103,7 @@
       <w:pPr>
         <w:numPr>
           <w:ilvl w:val="0"/>
-          <w:numId w:val="1011"/>
+          <w:numId w:val="1010"/>
         </w:numPr>
       </w:pPr>
       <w:r>
@@ -2731,7 +3130,7 @@
       <w:pPr>
         <w:numPr>
           <w:ilvl w:val="0"/>
-          <w:numId w:val="1011"/>
+          <w:numId w:val="1010"/>
         </w:numPr>
       </w:pPr>
       <w:r>
@@ -2749,7 +3148,7 @@
       <w:pPr>
         <w:numPr>
           <w:ilvl w:val="0"/>
-          <w:numId w:val="1011"/>
+          <w:numId w:val="1010"/>
         </w:numPr>
       </w:pPr>
       <w:r>
@@ -2996,7 +3395,7 @@
       <w:pPr>
         <w:numPr>
           <w:ilvl w:val="0"/>
-          <w:numId w:val="1012"/>
+          <w:numId w:val="1011"/>
         </w:numPr>
         <w:pStyle w:val="Compact"/>
       </w:pPr>
@@ -3008,7 +3407,7 @@
       <w:pPr>
         <w:numPr>
           <w:ilvl w:val="0"/>
-          <w:numId w:val="1012"/>
+          <w:numId w:val="1011"/>
         </w:numPr>
         <w:pStyle w:val="Compact"/>
       </w:pPr>
@@ -3020,7 +3419,7 @@
       <w:pPr>
         <w:numPr>
           <w:ilvl w:val="0"/>
-          <w:numId w:val="1012"/>
+          <w:numId w:val="1011"/>
         </w:numPr>
         <w:pStyle w:val="Compact"/>
       </w:pPr>
@@ -3032,7 +3431,7 @@
       <w:pPr>
         <w:numPr>
           <w:ilvl w:val="0"/>
-          <w:numId w:val="1012"/>
+          <w:numId w:val="1011"/>
         </w:numPr>
         <w:pStyle w:val="Compact"/>
       </w:pPr>
@@ -4047,7 +4446,7 @@
       <w:pPr>
         <w:numPr>
           <w:ilvl w:val="0"/>
-          <w:numId w:val="1013"/>
+          <w:numId w:val="1012"/>
         </w:numPr>
       </w:pPr>
       <w:r>
@@ -4071,7 +4470,7 @@
       <w:pPr>
         <w:numPr>
           <w:ilvl w:val="0"/>
-          <w:numId w:val="1013"/>
+          <w:numId w:val="1012"/>
         </w:numPr>
       </w:pPr>
       <w:r>
@@ -4095,7 +4494,7 @@
       <w:pPr>
         <w:numPr>
           <w:ilvl w:val="0"/>
-          <w:numId w:val="1013"/>
+          <w:numId w:val="1012"/>
         </w:numPr>
       </w:pPr>
       <w:r>
@@ -4119,7 +4518,7 @@
       <w:pPr>
         <w:numPr>
           <w:ilvl w:val="0"/>
-          <w:numId w:val="1013"/>
+          <w:numId w:val="1012"/>
         </w:numPr>
       </w:pPr>
       <w:r>
@@ -4143,7 +4542,7 @@
       <w:pPr>
         <w:numPr>
           <w:ilvl w:val="0"/>
-          <w:numId w:val="1013"/>
+          <w:numId w:val="1012"/>
         </w:numPr>
       </w:pPr>
       <w:r>
@@ -4167,7 +4566,7 @@
       <w:pPr>
         <w:numPr>
           <w:ilvl w:val="0"/>
-          <w:numId w:val="1013"/>
+          <w:numId w:val="1012"/>
         </w:numPr>
       </w:pPr>
       <w:r>
@@ -4191,7 +4590,7 @@
       <w:pPr>
         <w:numPr>
           <w:ilvl w:val="0"/>
-          <w:numId w:val="1013"/>
+          <w:numId w:val="1012"/>
         </w:numPr>
       </w:pPr>
       <w:r>
@@ -4215,7 +4614,7 @@
       <w:pPr>
         <w:numPr>
           <w:ilvl w:val="0"/>
-          <w:numId w:val="1013"/>
+          <w:numId w:val="1012"/>
         </w:numPr>
       </w:pPr>
       <w:r>
@@ -4239,7 +4638,7 @@
       <w:pPr>
         <w:numPr>
           <w:ilvl w:val="0"/>
-          <w:numId w:val="1013"/>
+          <w:numId w:val="1012"/>
         </w:numPr>
       </w:pPr>
       <w:r>
@@ -4263,7 +4662,7 @@
       <w:pPr>
         <w:numPr>
           <w:ilvl w:val="0"/>
-          <w:numId w:val="1013"/>
+          <w:numId w:val="1012"/>
         </w:numPr>
       </w:pPr>
       <w:r>
@@ -4287,7 +4686,7 @@
       <w:pPr>
         <w:numPr>
           <w:ilvl w:val="0"/>
-          <w:numId w:val="1013"/>
+          <w:numId w:val="1012"/>
         </w:numPr>
       </w:pPr>
       <w:r>
@@ -4311,7 +4710,7 @@
       <w:pPr>
         <w:numPr>
           <w:ilvl w:val="0"/>
-          <w:numId w:val="1013"/>
+          <w:numId w:val="1012"/>
         </w:numPr>
       </w:pPr>
       <w:r>
@@ -4335,7 +4734,7 @@
       <w:pPr>
         <w:numPr>
           <w:ilvl w:val="0"/>
-          <w:numId w:val="1013"/>
+          <w:numId w:val="1012"/>
         </w:numPr>
       </w:pPr>
       <w:r>
@@ -4359,7 +4758,7 @@
       <w:pPr>
         <w:numPr>
           <w:ilvl w:val="0"/>
-          <w:numId w:val="1013"/>
+          <w:numId w:val="1012"/>
         </w:numPr>
       </w:pPr>
       <w:r>
@@ -4383,7 +4782,7 @@
       <w:pPr>
         <w:numPr>
           <w:ilvl w:val="0"/>
-          <w:numId w:val="1013"/>
+          <w:numId w:val="1012"/>
         </w:numPr>
       </w:pPr>
       <w:r>
@@ -4407,7 +4806,7 @@
       <w:pPr>
         <w:numPr>
           <w:ilvl w:val="0"/>
-          <w:numId w:val="1013"/>
+          <w:numId w:val="1012"/>
         </w:numPr>
       </w:pPr>
       <w:r>
@@ -4431,7 +4830,7 @@
       <w:pPr>
         <w:numPr>
           <w:ilvl w:val="0"/>
-          <w:numId w:val="1013"/>
+          <w:numId w:val="1012"/>
         </w:numPr>
       </w:pPr>
       <w:r>
@@ -4442,7 +4841,7 @@
       <w:pPr>
         <w:numPr>
           <w:ilvl w:val="0"/>
-          <w:numId w:val="1013"/>
+          <w:numId w:val="1012"/>
         </w:numPr>
       </w:pPr>
       <w:r>
@@ -4466,7 +4865,7 @@
       <w:pPr>
         <w:numPr>
           <w:ilvl w:val="0"/>
-          <w:numId w:val="1013"/>
+          <w:numId w:val="1012"/>
         </w:numPr>
       </w:pPr>
       <w:r>
@@ -4490,7 +4889,7 @@
       <w:pPr>
         <w:numPr>
           <w:ilvl w:val="0"/>
-          <w:numId w:val="1013"/>
+          <w:numId w:val="1012"/>
         </w:numPr>
       </w:pPr>
       <w:r>
@@ -4514,7 +4913,7 @@
       <w:pPr>
         <w:numPr>
           <w:ilvl w:val="0"/>
-          <w:numId w:val="1013"/>
+          <w:numId w:val="1012"/>
         </w:numPr>
       </w:pPr>
       <w:r>
@@ -4538,7 +4937,7 @@
       <w:pPr>
         <w:numPr>
           <w:ilvl w:val="0"/>
-          <w:numId w:val="1013"/>
+          <w:numId w:val="1012"/>
         </w:numPr>
       </w:pPr>
       <w:r>
@@ -4562,7 +4961,7 @@
       <w:pPr>
         <w:numPr>
           <w:ilvl w:val="0"/>
-          <w:numId w:val="1013"/>
+          <w:numId w:val="1012"/>
         </w:numPr>
       </w:pPr>
       <w:r>
@@ -4586,7 +4985,7 @@
       <w:pPr>
         <w:numPr>
           <w:ilvl w:val="0"/>
-          <w:numId w:val="1013"/>
+          <w:numId w:val="1012"/>
         </w:numPr>
       </w:pPr>
       <w:r>
@@ -4610,7 +5009,7 @@
       <w:pPr>
         <w:numPr>
           <w:ilvl w:val="0"/>
-          <w:numId w:val="1013"/>
+          <w:numId w:val="1012"/>
         </w:numPr>
       </w:pPr>
       <w:r>
@@ -4634,7 +5033,7 @@
       <w:pPr>
         <w:numPr>
           <w:ilvl w:val="0"/>
-          <w:numId w:val="1013"/>
+          <w:numId w:val="1012"/>
         </w:numPr>
       </w:pPr>
       <w:r>
@@ -4658,7 +5057,7 @@
       <w:pPr>
         <w:numPr>
           <w:ilvl w:val="0"/>
-          <w:numId w:val="1013"/>
+          <w:numId w:val="1012"/>
         </w:numPr>
       </w:pPr>
       <w:r>
@@ -4682,7 +5081,7 @@
       <w:pPr>
         <w:numPr>
           <w:ilvl w:val="0"/>
-          <w:numId w:val="1013"/>
+          <w:numId w:val="1012"/>
         </w:numPr>
       </w:pPr>
       <w:r>
@@ -4706,7 +5105,7 @@
       <w:pPr>
         <w:numPr>
           <w:ilvl w:val="0"/>
-          <w:numId w:val="1013"/>
+          <w:numId w:val="1012"/>
         </w:numPr>
       </w:pPr>
       <w:r>
@@ -4730,7 +5129,7 @@
       <w:pPr>
         <w:numPr>
           <w:ilvl w:val="0"/>
-          <w:numId w:val="1013"/>
+          <w:numId w:val="1012"/>
         </w:numPr>
       </w:pPr>
       <w:r>
@@ -4754,7 +5153,7 @@
       <w:pPr>
         <w:numPr>
           <w:ilvl w:val="0"/>
-          <w:numId w:val="1013"/>
+          <w:numId w:val="1012"/>
         </w:numPr>
       </w:pPr>
       <w:r>
@@ -4778,7 +5177,7 @@
       <w:pPr>
         <w:numPr>
           <w:ilvl w:val="0"/>
-          <w:numId w:val="1013"/>
+          <w:numId w:val="1012"/>
         </w:numPr>
       </w:pPr>
       <w:r>
@@ -4802,7 +5201,7 @@
       <w:pPr>
         <w:numPr>
           <w:ilvl w:val="0"/>
-          <w:numId w:val="1013"/>
+          <w:numId w:val="1012"/>
         </w:numPr>
       </w:pPr>
       <w:r>
@@ -4826,7 +5225,7 @@
       <w:pPr>
         <w:numPr>
           <w:ilvl w:val="0"/>
-          <w:numId w:val="1013"/>
+          <w:numId w:val="1012"/>
         </w:numPr>
       </w:pPr>
       <w:r>
@@ -4850,7 +5249,7 @@
       <w:pPr>
         <w:numPr>
           <w:ilvl w:val="0"/>
-          <w:numId w:val="1013"/>
+          <w:numId w:val="1012"/>
         </w:numPr>
       </w:pPr>
       <w:r>
@@ -4874,7 +5273,7 @@
       <w:pPr>
         <w:numPr>
           <w:ilvl w:val="0"/>
-          <w:numId w:val="1013"/>
+          <w:numId w:val="1012"/>
         </w:numPr>
       </w:pPr>
       <w:r>
@@ -4898,7 +5297,7 @@
       <w:pPr>
         <w:numPr>
           <w:ilvl w:val="0"/>
-          <w:numId w:val="1013"/>
+          <w:numId w:val="1012"/>
         </w:numPr>
       </w:pPr>
       <w:r>
@@ -4922,7 +5321,7 @@
       <w:pPr>
         <w:numPr>
           <w:ilvl w:val="0"/>
-          <w:numId w:val="1013"/>
+          <w:numId w:val="1012"/>
         </w:numPr>
       </w:pPr>
       <w:r>
@@ -4946,7 +5345,7 @@
       <w:pPr>
         <w:numPr>
           <w:ilvl w:val="0"/>
-          <w:numId w:val="1013"/>
+          <w:numId w:val="1012"/>
         </w:numPr>
       </w:pPr>
       <w:r>
@@ -4970,7 +5369,7 @@
       <w:pPr>
         <w:numPr>
           <w:ilvl w:val="0"/>
-          <w:numId w:val="1013"/>
+          <w:numId w:val="1012"/>
         </w:numPr>
       </w:pPr>
       <w:r>
@@ -4994,7 +5393,7 @@
       <w:pPr>
         <w:numPr>
           <w:ilvl w:val="0"/>
-          <w:numId w:val="1013"/>
+          <w:numId w:val="1012"/>
         </w:numPr>
       </w:pPr>
       <w:r>
@@ -5018,7 +5417,7 @@
       <w:pPr>
         <w:numPr>
           <w:ilvl w:val="0"/>
-          <w:numId w:val="1013"/>
+          <w:numId w:val="1012"/>
         </w:numPr>
       </w:pPr>
       <w:r>
@@ -5042,7 +5441,7 @@
       <w:pPr>
         <w:numPr>
           <w:ilvl w:val="0"/>
-          <w:numId w:val="1013"/>
+          <w:numId w:val="1012"/>
         </w:numPr>
       </w:pPr>
       <w:r>
@@ -5066,7 +5465,7 @@
       <w:pPr>
         <w:numPr>
           <w:ilvl w:val="0"/>
-          <w:numId w:val="1013"/>
+          <w:numId w:val="1012"/>
         </w:numPr>
       </w:pPr>
       <w:r>
@@ -5090,7 +5489,7 @@
       <w:pPr>
         <w:numPr>
           <w:ilvl w:val="0"/>
-          <w:numId w:val="1013"/>
+          <w:numId w:val="1012"/>
         </w:numPr>
       </w:pPr>
       <w:r>
@@ -5114,7 +5513,7 @@
       <w:pPr>
         <w:numPr>
           <w:ilvl w:val="0"/>
-          <w:numId w:val="1013"/>
+          <w:numId w:val="1012"/>
         </w:numPr>
       </w:pPr>
       <w:r>
@@ -5138,7 +5537,7 @@
       <w:pPr>
         <w:numPr>
           <w:ilvl w:val="0"/>
-          <w:numId w:val="1013"/>
+          <w:numId w:val="1012"/>
         </w:numPr>
       </w:pPr>
       <w:r>
@@ -5162,7 +5561,7 @@
       <w:pPr>
         <w:numPr>
           <w:ilvl w:val="0"/>
-          <w:numId w:val="1013"/>
+          <w:numId w:val="1012"/>
         </w:numPr>
       </w:pPr>
       <w:r>
@@ -5602,7 +6001,34 @@
     <w:abstractNumId w:val="991"/>
   </w:num>
   <w:num w:numId="1004">
-    <w:abstractNumId w:val="991"/>
+    <w:abstractNumId w:val="99411"/>
+    <w:lvlOverride w:ilvl="0">
+      <w:startOverride w:val="1"/>
+    </w:lvlOverride>
+    <w:lvlOverride w:ilvl="1">
+      <w:startOverride w:val="1"/>
+    </w:lvlOverride>
+    <w:lvlOverride w:ilvl="2">
+      <w:startOverride w:val="1"/>
+    </w:lvlOverride>
+    <w:lvlOverride w:ilvl="3">
+      <w:startOverride w:val="1"/>
+    </w:lvlOverride>
+    <w:lvlOverride w:ilvl="4">
+      <w:startOverride w:val="1"/>
+    </w:lvlOverride>
+    <w:lvlOverride w:ilvl="5">
+      <w:startOverride w:val="1"/>
+    </w:lvlOverride>
+    <w:lvlOverride w:ilvl="6">
+      <w:startOverride w:val="1"/>
+    </w:lvlOverride>
+    <w:lvlOverride w:ilvl="7">
+      <w:startOverride w:val="1"/>
+    </w:lvlOverride>
+    <w:lvlOverride w:ilvl="8">
+      <w:startOverride w:val="1"/>
+    </w:lvlOverride>
   </w:num>
   <w:num w:numId="1005">
     <w:abstractNumId w:val="99411"/>
@@ -5635,6 +6061,18 @@
     </w:lvlOverride>
   </w:num>
   <w:num w:numId="1006">
+    <w:abstractNumId w:val="991"/>
+  </w:num>
+  <w:num w:numId="1007">
+    <w:abstractNumId w:val="991"/>
+  </w:num>
+  <w:num w:numId="1008">
+    <w:abstractNumId w:val="991"/>
+  </w:num>
+  <w:num w:numId="1009">
+    <w:abstractNumId w:val="991"/>
+  </w:num>
+  <w:num w:numId="1010">
     <w:abstractNumId w:val="99411"/>
     <w:lvlOverride w:ilvl="0">
       <w:startOverride w:val="1"/>
@@ -5664,52 +6102,10 @@
       <w:startOverride w:val="1"/>
     </w:lvlOverride>
   </w:num>
-  <w:num w:numId="1007">
+  <w:num w:numId="1011">
     <w:abstractNumId w:val="991"/>
   </w:num>
-  <w:num w:numId="1008">
-    <w:abstractNumId w:val="991"/>
-  </w:num>
-  <w:num w:numId="1009">
-    <w:abstractNumId w:val="991"/>
-  </w:num>
-  <w:num w:numId="1010">
-    <w:abstractNumId w:val="991"/>
-  </w:num>
-  <w:num w:numId="1011">
-    <w:abstractNumId w:val="99411"/>
-    <w:lvlOverride w:ilvl="0">
-      <w:startOverride w:val="1"/>
-    </w:lvlOverride>
-    <w:lvlOverride w:ilvl="1">
-      <w:startOverride w:val="1"/>
-    </w:lvlOverride>
-    <w:lvlOverride w:ilvl="2">
-      <w:startOverride w:val="1"/>
-    </w:lvlOverride>
-    <w:lvlOverride w:ilvl="3">
-      <w:startOverride w:val="1"/>
-    </w:lvlOverride>
-    <w:lvlOverride w:ilvl="4">
-      <w:startOverride w:val="1"/>
-    </w:lvlOverride>
-    <w:lvlOverride w:ilvl="5">
-      <w:startOverride w:val="1"/>
-    </w:lvlOverride>
-    <w:lvlOverride w:ilvl="6">
-      <w:startOverride w:val="1"/>
-    </w:lvlOverride>
-    <w:lvlOverride w:ilvl="7">
-      <w:startOverride w:val="1"/>
-    </w:lvlOverride>
-    <w:lvlOverride w:ilvl="8">
-      <w:startOverride w:val="1"/>
-    </w:lvlOverride>
-  </w:num>
   <w:num w:numId="1012">
-    <w:abstractNumId w:val="991"/>
-  </w:num>
-  <w:num w:numId="1013">
     <w:abstractNumId w:val="99411"/>
     <w:lvlOverride w:ilvl="0">
       <w:startOverride w:val="1"/>

</xml_diff>

<commit_message>
Reorder Part 1 demo figures: clone count, clone size, CDR3, mutation, sex
Moved clone size paragraph (Figures 9-11) to appear right after clone count
(Figures 1-2), before CDR3 and mutation sections, for a more logical flow.

Co-Authored-By: Claude Opus 4.6 <noreply@anthropic.com>
Claude-Session: https://claude.ai/code/session_01D55fsgxxDUfDTuPfRhF34U
</commit_message>
<xml_diff>
--- a/thesis/thesis.docx
+++ b/thesis/thesis.docx
@@ -3532,6 +3532,54 @@
           <w:bCs/>
           <w:b/>
         </w:rPr>
+        <w:t xml:space="preserve">Clone size and expansion.</w:t>
+      </w:r>
+      <w:r>
+        <w:t xml:space="preserve"> </w:t>
+      </w:r>
+      <w:r>
+        <w:t xml:space="preserve">The clone_size endpoint returned the distribution of clone sizes across disease categories (</w:t>
+      </w:r>
+      <w:r>
+        <w:rPr>
+          <w:bCs/>
+          <w:b/>
+        </w:rPr>
+        <w:t xml:space="preserve">Figure 9</w:t>
+      </w:r>
+      <w:r>
+        <w:t xml:space="preserve">), the count of expanded clones per individual (</w:t>
+      </w:r>
+      <w:r>
+        <w:rPr>
+          <w:bCs/>
+          <w:b/>
+        </w:rPr>
+        <w:t xml:space="preserve">Figure 10</w:t>
+      </w:r>
+      <w:r>
+        <w:t xml:space="preserve">), and the size of expanded clones (</w:t>
+      </w:r>
+      <w:r>
+        <w:rPr>
+          <w:bCs/>
+          <w:b/>
+        </w:rPr>
+        <w:t xml:space="preserve">Figure 11</w:t>
+      </w:r>
+      <w:r>
+        <w:t xml:space="preserve">).</w:t>
+      </w:r>
+    </w:p>
+    <w:p>
+      <w:pPr>
+        <w:pStyle w:val="BodyText"/>
+      </w:pPr>
+      <w:r>
+        <w:rPr>
+          <w:bCs/>
+          <w:b/>
+        </w:rPr>
         <w:t xml:space="preserve">CDR3 length in dominant clones.</w:t>
       </w:r>
       <w:r>
@@ -3614,54 +3662,6 @@
           <w:b/>
         </w:rPr>
         <w:t xml:space="preserve">Figure 8</w:t>
-      </w:r>
-      <w:r>
-        <w:t xml:space="preserve">).</w:t>
-      </w:r>
-    </w:p>
-    <w:p>
-      <w:pPr>
-        <w:pStyle w:val="BodyText"/>
-      </w:pPr>
-      <w:r>
-        <w:rPr>
-          <w:bCs/>
-          <w:b/>
-        </w:rPr>
-        <w:t xml:space="preserve">Clone size and expansion.</w:t>
-      </w:r>
-      <w:r>
-        <w:t xml:space="preserve"> </w:t>
-      </w:r>
-      <w:r>
-        <w:t xml:space="preserve">The clone_size endpoint returned the distribution of clone sizes across disease categories (</w:t>
-      </w:r>
-      <w:r>
-        <w:rPr>
-          <w:bCs/>
-          <w:b/>
-        </w:rPr>
-        <w:t xml:space="preserve">Figure 9</w:t>
-      </w:r>
-      <w:r>
-        <w:t xml:space="preserve">), the count of expanded clones per individual (</w:t>
-      </w:r>
-      <w:r>
-        <w:rPr>
-          <w:bCs/>
-          <w:b/>
-        </w:rPr>
-        <w:t xml:space="preserve">Figure 10</w:t>
-      </w:r>
-      <w:r>
-        <w:t xml:space="preserve">), and the size of expanded clones (</w:t>
-      </w:r>
-      <w:r>
-        <w:rPr>
-          <w:bCs/>
-          <w:b/>
-        </w:rPr>
-        <w:t xml:space="preserve">Figure 11</w:t>
       </w:r>
       <w:r>
         <w:t xml:space="preserve">).</w:t>

</xml_diff>